<commit_message>
Deney 1 raporu: bölücü ölçümleri düzeltildi, iç direnç analizi, isim düzeltmesi
Co-Authored-By: Claude Sonnet 5.5 <noreply@anthropic.com>
Claude-Session: https://claude.ai/code/session_01Q71gHQtKJ86ZE2CtYTYSwP
</commit_message>
<xml_diff>
--- a/ele201l_deney1_lab/out/ELE201L_Deney1_Laboratuvar_Raporu.docx
+++ b/ele201l_deney1_lab/out/ELE201L_Deney1_Laboratuvar_Raporu.docx
@@ -323,7 +323,7 @@
                 <w:b w:val="0"/>
                 <w:sz w:val="26"/>
               </w:rPr>
-              <w:t>Işıl Fidancan, Buhe Işıklar</w:t>
+              <w:t>Işıl Fidancan, Bahar Işıklar</w:t>
             </w:r>
           </w:p>
         </w:tc>
@@ -4358,7 +4358,7 @@
           <w:i w:val="0"/>
           <w:sz w:val="20"/>
         </w:rPr>
-        <w:t>Şekil 2.2.2  Multimetre okumaları: 7,4 V (</w:t>
+        <w:t xml:space="preserve">Şekil 2.2.2  Multimetre okumaları (soldan sağa): </w:t>
       </w:r>
       <m:oMath>
         <m:r>
@@ -4378,7 +4378,7 @@
           <w:i w:val="0"/>
           <w:sz w:val="20"/>
         </w:rPr>
-        <w:t xml:space="preserve"> ve </w:t>
+        <w:t xml:space="preserve"> için 7,4 V; </w:t>
       </w:r>
       <m:oMath>
         <m:r>
@@ -4407,7 +4407,36 @@
           <w:i w:val="0"/>
           <w:sz w:val="20"/>
         </w:rPr>
-        <w:t xml:space="preserve"> satırları için 7,4 V yazılmıştır), 6,5 V ve 0,9 V (üçüncü okumanın hangi duruma ait olduğu Sorular kısmında tartışılmıştır).</w:t>
+        <w:t xml:space="preserve"> için 6,5 V; </w:t>
+      </w:r>
+      <m:oMath>
+        <m:r>
+          <m:t>10</m:t>
+        </m:r>
+        <m:r>
+          <m:t> </m:t>
+        </m:r>
+        <m:r>
+          <m:rPr>
+            <m:sty m:val="p"/>
+          </m:rPr>
+          <m:t>M</m:t>
+        </m:r>
+        <m:r>
+          <m:rPr>
+            <m:sty m:val="p"/>
+          </m:rPr>
+          <m:t>Ω</m:t>
+        </m:r>
+      </m:oMath>
+      <w:r>
+        <w:rPr>
+          <w:rFonts w:ascii="Times New Roman" w:hAnsi="Times New Roman" w:cs="Times New Roman" w:eastAsia="Times New Roman"/>
+          <w:b w:val="0"/>
+          <w:i w:val="0"/>
+          <w:sz w:val="20"/>
+        </w:rPr>
+        <w:t xml:space="preserve"> için 0,9 V.</w:t>
       </w:r>
     </w:p>
     <w:p>
@@ -4463,7 +4492,85 @@
           <w:i w:val="0"/>
           <w:sz w:val="20"/>
         </w:rPr>
-        <w:t>Şekil 2.2.3  Osiloskop (Tektronix TBS 1022) ölçümleri: soldaki ve ortadaki ekranlar DA gerilim (7,40 V ve 7,30 V RMS), sağdaki 50 Hz’lik sinüs görünümüdür (en küçük −12,0 V, en büyük 9,40 V, tepeden tepeye 21,4 V).</w:t>
+        <w:t xml:space="preserve">Şekil 2.2.3  Osiloskop (Tektronix TBS 1022) ekranları: </w:t>
+      </w:r>
+      <m:oMath>
+        <m:r>
+          <m:t>470</m:t>
+        </m:r>
+        <m:r>
+          <m:t> </m:t>
+        </m:r>
+        <m:r>
+          <m:t>Ω</m:t>
+        </m:r>
+      </m:oMath>
+      <w:r>
+        <w:rPr>
+          <w:rFonts w:ascii="Times New Roman" w:hAnsi="Times New Roman" w:cs="Times New Roman" w:eastAsia="Times New Roman"/>
+          <w:b w:val="0"/>
+          <w:i w:val="0"/>
+          <w:sz w:val="20"/>
+        </w:rPr>
+        <w:t xml:space="preserve"> için 7,40 V; </w:t>
+      </w:r>
+      <m:oMath>
+        <m:r>
+          <m:t>100</m:t>
+        </m:r>
+        <m:r>
+          <m:t> </m:t>
+        </m:r>
+        <m:r>
+          <m:rPr>
+            <m:sty m:val="p"/>
+          </m:rPr>
+          <m:t>k</m:t>
+        </m:r>
+        <m:r>
+          <m:rPr>
+            <m:sty m:val="p"/>
+          </m:rPr>
+          <m:t>Ω</m:t>
+        </m:r>
+      </m:oMath>
+      <w:r>
+        <w:rPr>
+          <w:rFonts w:ascii="Times New Roman" w:hAnsi="Times New Roman" w:cs="Times New Roman" w:eastAsia="Times New Roman"/>
+          <w:b w:val="0"/>
+          <w:i w:val="0"/>
+          <w:sz w:val="20"/>
+        </w:rPr>
+        <w:t xml:space="preserve"> için 7,4 V; </w:t>
+      </w:r>
+      <m:oMath>
+        <m:r>
+          <m:t>10</m:t>
+        </m:r>
+        <m:r>
+          <m:t> </m:t>
+        </m:r>
+        <m:r>
+          <m:rPr>
+            <m:sty m:val="p"/>
+          </m:rPr>
+          <m:t>M</m:t>
+        </m:r>
+        <m:r>
+          <m:rPr>
+            <m:sty m:val="p"/>
+          </m:rPr>
+          <m:t>Ω</m:t>
+        </m:r>
+      </m:oMath>
+      <w:r>
+        <w:rPr>
+          <w:rFonts w:ascii="Times New Roman" w:hAnsi="Times New Roman" w:cs="Times New Roman" w:eastAsia="Times New Roman"/>
+          <w:b w:val="0"/>
+          <w:i w:val="0"/>
+          <w:sz w:val="20"/>
+        </w:rPr>
+        <w:t xml:space="preserve"> için 49,998 Hz’lik sinüs (en küçük −12,0 V, en büyük 9,40 V, tepeden tepeye 21,4 V).</w:t>
       </w:r>
     </w:p>
     <w:p>
@@ -4479,7 +4586,7 @@
           <w:i w:val="0"/>
           <w:sz w:val="20"/>
         </w:rPr>
-        <w:t>Tablo 2.2.2  Gerilim bölücü ölçümleri (föy Tablo 3). Satır eşleştirmesi osiloskop ekranlarının saatlerinden ve föydeki el yazısından çıkarılmıştır (EK-1).</w:t>
+        <w:t>Tablo 2.2.2  Gerilim bölücü ölçümleri (föy Tablo 3)</w:t>
       </w:r>
     </w:p>
     <w:tbl>
@@ -4744,7 +4851,7 @@
                 <w:i w:val="0"/>
                 <w:sz w:val="20"/>
               </w:rPr>
-              <w:t>7,40 (RMS 7,40; tepeden tepeye 0,2 V)</w:t>
+              <w:t>7,40</w:t>
             </w:r>
           </w:p>
         </w:tc>
@@ -4830,7 +4937,7 @@
                 <w:i w:val="0"/>
                 <w:sz w:val="20"/>
               </w:rPr>
-              <w:t>7,4</w:t>
+              <w:t>6,5</w:t>
             </w:r>
           </w:p>
         </w:tc>
@@ -4857,7 +4964,7 @@
                 <w:i w:val="0"/>
                 <w:sz w:val="20"/>
               </w:rPr>
-              <w:t>7,30 (RMS 7,30; tepeden tepeye 0,2 V)</w:t>
+              <w:t>7,4</w:t>
             </w:r>
           </w:p>
         </w:tc>
@@ -4943,7 +5050,7 @@
                 <w:i w:val="0"/>
                 <w:sz w:val="20"/>
               </w:rPr>
-              <w:t>6,5</w:t>
+              <w:t>0,9</w:t>
             </w:r>
           </w:p>
         </w:tc>
@@ -4970,7 +5077,7 @@
                 <w:i w:val="0"/>
                 <w:sz w:val="20"/>
               </w:rPr>
-              <w:t>DA değer okunamadı: 50 Hz, 21,4 V tepeden tepeye parazit</w:t>
+              <w:t>9,40 (en büyük değer; sinyal 50 Hz, 21,4 V tepeden tepeye)</w:t>
             </w:r>
           </w:p>
         </w:tc>
@@ -5042,7 +5149,7 @@
           <w:b w:val="0"/>
           <w:i w:val="0"/>
         </w:rPr>
-        <w:t xml:space="preserve">Fark vardır ve direnç büyüdükçe artmıştır. </w:t>
+        <w:t xml:space="preserve">Fark vardır ve direnç büyüdükçe çok büyümüştür. </w:t>
       </w:r>
       <m:oMath>
         <m:r>
@@ -5061,35 +5168,7 @@
           <w:b w:val="0"/>
           <w:i w:val="0"/>
         </w:rPr>
-        <w:t xml:space="preserve"> ve </w:t>
-      </w:r>
-      <m:oMath>
-        <m:r>
-          <m:t>100</m:t>
-        </m:r>
-        <m:r>
-          <m:t> </m:t>
-        </m:r>
-        <m:r>
-          <m:rPr>
-            <m:sty m:val="p"/>
-          </m:rPr>
-          <m:t>k</m:t>
-        </m:r>
-        <m:r>
-          <m:rPr>
-            <m:sty m:val="p"/>
-          </m:rPr>
-          <m:t>Ω</m:t>
-        </m:r>
-      </m:oMath>
-      <w:r>
-        <w:rPr>
-          <w:rFonts w:ascii="Times New Roman" w:hAnsi="Times New Roman" w:cs="Times New Roman" w:eastAsia="Times New Roman"/>
-          <w:b w:val="0"/>
-          <w:i w:val="0"/>
-        </w:rPr>
-        <w:t xml:space="preserve"> için 7,5 V’a karşı 7,4 V okunmuştur (%1,3 aşağıda). Bu fark iki nedenle açıklanır: (a) iki direncin birbirine tam eşit olmaması: ölçülen </w:t>
+        <w:t xml:space="preserve"> satırında multimetre 7,4 V, osiloskop 7,40 V göstermiştir (beklenen 7,5 V; %1,3 fark). Bu fark ölçü aletlerinden değil, iki direncin birbirine tam eşit olmamasından gelir (ölçülen </w:t>
       </w:r>
       <m:oMath>
         <m:sSub>
@@ -5118,6 +5197,739 @@
         </m:r>
         <m:r>
           <m:t>Ω</m:t>
+        </m:r>
+      </m:oMath>
+      <w:r>
+        <w:rPr>
+          <w:rFonts w:ascii="Times New Roman" w:hAnsi="Times New Roman" w:cs="Times New Roman" w:eastAsia="Times New Roman"/>
+          <w:b w:val="0"/>
+          <w:i w:val="0"/>
+        </w:rPr>
+        <w:t>; nominalden %1,3 küçük) ve bu satırda iç direnç etkisi yoktur (</w:t>
+      </w:r>
+      <m:oMath>
+        <m:r>
+          <m:t>R</m:t>
+        </m:r>
+        <m:r>
+          <m:rPr>
+            <m:sty m:val="p"/>
+          </m:rPr>
+          <m:t>/</m:t>
+        </m:r>
+        <m:sSub>
+          <m:e>
+            <m:r>
+              <m:t>R</m:t>
+            </m:r>
+          </m:e>
+          <m:sub>
+            <m:r>
+              <m:t>i</m:t>
+            </m:r>
+            <m:r>
+              <m:t>c</m:t>
+            </m:r>
+          </m:sub>
+        </m:sSub>
+        <m:r>
+          <m:rPr>
+            <m:sty m:val="p"/>
+          </m:rPr>
+          <m:t>≈</m:t>
+        </m:r>
+        <m:sSup>
+          <m:e>
+            <m:r>
+              <m:t>10</m:t>
+            </m:r>
+          </m:e>
+          <m:sup>
+            <m:r>
+              <m:rPr>
+                <m:sty m:val="p"/>
+              </m:rPr>
+              <m:t>−</m:t>
+            </m:r>
+            <m:r>
+              <m:t>3</m:t>
+            </m:r>
+          </m:sup>
+        </m:sSup>
+      </m:oMath>
+      <w:r>
+        <w:rPr>
+          <w:rFonts w:ascii="Times New Roman" w:hAnsi="Times New Roman" w:cs="Times New Roman" w:eastAsia="Times New Roman"/>
+          <w:b w:val="0"/>
+          <w:i w:val="0"/>
+        </w:rPr>
+        <w:t xml:space="preserve">’ten küçüktür). </w:t>
+      </w:r>
+      <m:oMath>
+        <m:r>
+          <m:t>100</m:t>
+        </m:r>
+        <m:r>
+          <m:t> </m:t>
+        </m:r>
+        <m:r>
+          <m:rPr>
+            <m:sty m:val="p"/>
+          </m:rPr>
+          <m:t>k</m:t>
+        </m:r>
+        <m:r>
+          <m:rPr>
+            <m:sty m:val="p"/>
+          </m:rPr>
+          <m:t>Ω</m:t>
+        </m:r>
+      </m:oMath>
+      <w:r>
+        <w:rPr>
+          <w:rFonts w:ascii="Times New Roman" w:hAnsi="Times New Roman" w:cs="Times New Roman" w:eastAsia="Times New Roman"/>
+          <w:b w:val="0"/>
+          <w:i w:val="0"/>
+        </w:rPr>
+        <w:t xml:space="preserve"> satırında multimetre 6,5 V (%13 düşük), osiloskop ise 7,4 V (%1,3 düşük) göstermiştir; yani iki alet aynı noktada 0,9 V farklı değer vermiştir. </w:t>
+      </w:r>
+      <m:oMath>
+        <m:r>
+          <m:t>10</m:t>
+        </m:r>
+        <m:r>
+          <m:t> </m:t>
+        </m:r>
+        <m:r>
+          <m:rPr>
+            <m:sty m:val="p"/>
+          </m:rPr>
+          <m:t>M</m:t>
+        </m:r>
+        <m:r>
+          <m:rPr>
+            <m:sty m:val="p"/>
+          </m:rPr>
+          <m:t>Ω</m:t>
+        </m:r>
+      </m:oMath>
+      <w:r>
+        <w:rPr>
+          <w:rFonts w:ascii="Times New Roman" w:hAnsi="Times New Roman" w:cs="Times New Roman" w:eastAsia="Times New Roman"/>
+          <w:b w:val="0"/>
+          <w:i w:val="0"/>
+        </w:rPr>
+        <w:t xml:space="preserve"> satırında multimetre 0,9 V (beklenen değerin yalnızca %12’si) göstermiştir; osiloskopta ise DA değer yerine 50 Hz’lik büyük bir sinüs görülmüştür. Bu üç satırdaki farkların tek nedeni, ölçü aletlerinin iç direncinin alt dirence paralel girerek bölücü oranını değiştirmesidir (</w:t>
+      </w:r>
+      <w:r>
+        <w:rPr>
+          <w:rFonts w:ascii="Times New Roman" w:hAnsi="Times New Roman" w:cs="Times New Roman" w:eastAsia="Times New Roman"/>
+          <w:b w:val="0"/>
+          <w:i w:val="0"/>
+        </w:rPr>
+        <w:t>(2.5)</w:t>
+      </w:r>
+      <w:r>
+        <w:rPr>
+          <w:rFonts w:ascii="Times New Roman" w:hAnsi="Times New Roman" w:cs="Times New Roman" w:eastAsia="Times New Roman"/>
+          <w:b w:val="0"/>
+          <w:i w:val="0"/>
+        </w:rPr>
+        <w:t>). Aşağıdaki hesap, ölçülen değerlerden aletlerin “görünen” iç direncini bulmaktadır.</w:t>
+      </w:r>
+    </w:p>
+    <w:p>
+      <w:pPr>
+        <w:keepNext/>
+        <w:jc w:val="both"/>
+      </w:pPr>
+      <w:r>
+        <w:rPr>
+          <w:rFonts w:ascii="Times New Roman" w:hAnsi="Times New Roman" w:cs="Times New Roman" w:eastAsia="Times New Roman"/>
+          <w:b/>
+          <w:i w:val="0"/>
+        </w:rPr>
+        <w:t>Ölçülen değerlerden iç direncin bulunması.</w:t>
+      </w:r>
+      <w:r>
+        <w:rPr>
+          <w:rFonts w:ascii="Times New Roman" w:hAnsi="Times New Roman" w:cs="Times New Roman" w:eastAsia="Times New Roman"/>
+          <w:b w:val="0"/>
+          <w:i w:val="0"/>
+        </w:rPr>
+        <w:t xml:space="preserve"> </w:t>
+      </w:r>
+      <w:r>
+        <w:rPr>
+          <w:rFonts w:ascii="Times New Roman" w:hAnsi="Times New Roman" w:cs="Times New Roman" w:eastAsia="Times New Roman"/>
+          <w:b w:val="0"/>
+          <w:i w:val="0"/>
+        </w:rPr>
+        <w:t>(2.5)</w:t>
+      </w:r>
+      <w:r>
+        <w:rPr>
+          <w:rFonts w:ascii="Times New Roman" w:hAnsi="Times New Roman" w:cs="Times New Roman" w:eastAsia="Times New Roman"/>
+          <w:b w:val="0"/>
+          <w:i w:val="0"/>
+        </w:rPr>
+        <w:t xml:space="preserve"> </w:t>
+      </w:r>
+      <m:oMath>
+        <m:sSub>
+          <m:e>
+            <m:r>
+              <m:t>R</m:t>
+            </m:r>
+          </m:e>
+          <m:sub>
+            <m:r>
+              <m:t>i</m:t>
+            </m:r>
+            <m:r>
+              <m:t>c</m:t>
+            </m:r>
+          </m:sub>
+        </m:sSub>
+      </m:oMath>
+      <w:r>
+        <w:rPr>
+          <w:rFonts w:ascii="Times New Roman" w:hAnsi="Times New Roman" w:cs="Times New Roman" w:eastAsia="Times New Roman"/>
+          <w:b w:val="0"/>
+          <w:i w:val="0"/>
+        </w:rPr>
+        <w:t>’e göre çözülürse (</w:t>
+      </w:r>
+      <m:oMath>
+        <m:r>
+          <m:t>k</m:t>
+        </m:r>
+        <m:r>
+          <m:rPr>
+            <m:sty m:val="p"/>
+          </m:rPr>
+          <m:t>=</m:t>
+        </m:r>
+        <m:sSub>
+          <m:e>
+            <m:r>
+              <m:t>V</m:t>
+            </m:r>
+          </m:e>
+          <m:sub>
+            <m:r>
+              <m:t>O</m:t>
+            </m:r>
+          </m:sub>
+        </m:sSub>
+        <m:r>
+          <m:rPr>
+            <m:sty m:val="p"/>
+          </m:rPr>
+          <m:t>/</m:t>
+        </m:r>
+        <m:d>
+          <m:dPr>
+            <m:begChr m:val="("/>
+            <m:endChr m:val=")"/>
+            <m:sepChr m:val=""/>
+            <m:grow/>
+          </m:dPr>
+          <m:e>
+            <m:sSub>
+              <m:e>
+                <m:r>
+                  <m:t>V</m:t>
+                </m:r>
+              </m:e>
+              <m:sub>
+                <m:r>
+                  <m:t>S</m:t>
+                </m:r>
+              </m:sub>
+            </m:sSub>
+            <m:r>
+              <m:rPr>
+                <m:sty m:val="p"/>
+              </m:rPr>
+              <m:t>−</m:t>
+            </m:r>
+            <m:sSub>
+              <m:e>
+                <m:r>
+                  <m:t>V</m:t>
+                </m:r>
+              </m:e>
+              <m:sub>
+                <m:r>
+                  <m:t>O</m:t>
+                </m:r>
+              </m:sub>
+            </m:sSub>
+          </m:e>
+        </m:d>
+      </m:oMath>
+      <w:r>
+        <w:rPr>
+          <w:rFonts w:ascii="Times New Roman" w:hAnsi="Times New Roman" w:cs="Times New Roman" w:eastAsia="Times New Roman"/>
+          <w:b w:val="0"/>
+          <w:i w:val="0"/>
+        </w:rPr>
+        <w:t xml:space="preserve"> olmak üzere, iki direnç eşit varsayılırsa </w:t>
+      </w:r>
+      <m:oMath>
+        <m:sSub>
+          <m:e>
+            <m:r>
+              <m:t>R</m:t>
+            </m:r>
+          </m:e>
+          <m:sub>
+            <m:r>
+              <m:t>p</m:t>
+            </m:r>
+          </m:sub>
+        </m:sSub>
+        <m:r>
+          <m:rPr>
+            <m:sty m:val="p"/>
+          </m:rPr>
+          <m:t>=</m:t>
+        </m:r>
+        <m:r>
+          <m:t>k</m:t>
+        </m:r>
+        <m:r>
+          <m:t>R</m:t>
+        </m:r>
+      </m:oMath>
+      <w:r>
+        <w:rPr>
+          <w:rFonts w:ascii="Times New Roman" w:hAnsi="Times New Roman" w:cs="Times New Roman" w:eastAsia="Times New Roman"/>
+          <w:b w:val="0"/>
+          <w:i w:val="0"/>
+        </w:rPr>
+        <w:t>) şu elde edilir:</w:t>
+      </w:r>
+    </w:p>
+    <w:tbl>
+      <w:tblPr>
+        <w:tblW w:type="auto" w:w="0"/>
+        <w:jc w:val="center"/>
+        <w:tblLayout w:type="fixed"/>
+        <w:tblLook w:firstColumn="1" w:firstRow="1" w:lastColumn="0" w:lastRow="0" w:noHBand="0" w:noVBand="1" w:val="04A0"/>
+      </w:tblPr>
+      <w:tblGrid>
+        <w:gridCol w:w="709"/>
+        <w:gridCol w:w="7087"/>
+        <w:gridCol w:w="1276"/>
+      </w:tblGrid>
+      <w:tr>
+        <w:tc>
+          <w:tcPr>
+            <w:tcW w:type="dxa" w:w="709"/>
+          </w:tcPr>
+          <w:p/>
+        </w:tc>
+        <w:tc>
+          <w:tcPr>
+            <w:tcW w:type="dxa" w:w="7087"/>
+          </w:tcPr>
+          <w:p>
+            <w:pPr>
+              <w:spacing w:line="240" w:lineRule="auto"/>
+            </w:pPr>
+            <m:oMathPara>
+              <m:oMathParaPr>
+                <m:jc m:val="center"/>
+              </m:oMathParaPr>
+              <m:oMath>
+                <m:sSub>
+                  <m:e>
+                    <m:r>
+                      <m:t>R</m:t>
+                    </m:r>
+                  </m:e>
+                  <m:sub>
+                    <m:r>
+                      <m:t>i</m:t>
+                    </m:r>
+                    <m:r>
+                      <m:t>c</m:t>
+                    </m:r>
+                  </m:sub>
+                </m:sSub>
+                <m:r>
+                  <m:rPr>
+                    <m:sty m:val="p"/>
+                  </m:rPr>
+                  <m:t>=</m:t>
+                </m:r>
+                <m:f>
+                  <m:fPr>
+                    <m:type m:val="bar"/>
+                  </m:fPr>
+                  <m:num>
+                    <m:r>
+                      <m:t>R</m:t>
+                    </m:r>
+                    <m:r>
+                      <m:t> </m:t>
+                    </m:r>
+                    <m:sSub>
+                      <m:e>
+                        <m:r>
+                          <m:t>R</m:t>
+                        </m:r>
+                      </m:e>
+                      <m:sub>
+                        <m:r>
+                          <m:t>p</m:t>
+                        </m:r>
+                      </m:sub>
+                    </m:sSub>
+                  </m:num>
+                  <m:den>
+                    <m:r>
+                      <m:t>R</m:t>
+                    </m:r>
+                    <m:r>
+                      <m:rPr>
+                        <m:sty m:val="p"/>
+                      </m:rPr>
+                      <m:t>−</m:t>
+                    </m:r>
+                    <m:sSub>
+                      <m:e>
+                        <m:r>
+                          <m:t>R</m:t>
+                        </m:r>
+                      </m:e>
+                      <m:sub>
+                        <m:r>
+                          <m:t>p</m:t>
+                        </m:r>
+                      </m:sub>
+                    </m:sSub>
+                  </m:den>
+                </m:f>
+                <m:r>
+                  <m:rPr>
+                    <m:sty m:val="p"/>
+                  </m:rPr>
+                  <m:t>=</m:t>
+                </m:r>
+                <m:f>
+                  <m:fPr>
+                    <m:type m:val="bar"/>
+                  </m:fPr>
+                  <m:num>
+                    <m:r>
+                      <m:t>k</m:t>
+                    </m:r>
+                    <m:r>
+                      <m:t> </m:t>
+                    </m:r>
+                    <m:r>
+                      <m:t>R</m:t>
+                    </m:r>
+                  </m:num>
+                  <m:den>
+                    <m:r>
+                      <m:t>1</m:t>
+                    </m:r>
+                    <m:r>
+                      <m:rPr>
+                        <m:sty m:val="p"/>
+                      </m:rPr>
+                      <m:t>−</m:t>
+                    </m:r>
+                    <m:r>
+                      <m:t>k</m:t>
+                    </m:r>
+                  </m:den>
+                </m:f>
+                <m:r>
+                  <m:rPr>
+                    <m:sty m:val="p"/>
+                  </m:rPr>
+                  <m:t>,</m:t>
+                </m:r>
+                <m:r>
+                  <m:t>  </m:t>
+                </m:r>
+                <m:r>
+                  <m:t>k</m:t>
+                </m:r>
+                <m:r>
+                  <m:rPr>
+                    <m:sty m:val="p"/>
+                  </m:rPr>
+                  <m:t>=</m:t>
+                </m:r>
+                <m:f>
+                  <m:fPr>
+                    <m:type m:val="bar"/>
+                  </m:fPr>
+                  <m:num>
+                    <m:sSub>
+                      <m:e>
+                        <m:r>
+                          <m:t>V</m:t>
+                        </m:r>
+                      </m:e>
+                      <m:sub>
+                        <m:r>
+                          <m:t>O</m:t>
+                        </m:r>
+                      </m:sub>
+                    </m:sSub>
+                  </m:num>
+                  <m:den>
+                    <m:sSub>
+                      <m:e>
+                        <m:r>
+                          <m:t>V</m:t>
+                        </m:r>
+                      </m:e>
+                      <m:sub>
+                        <m:r>
+                          <m:t>S</m:t>
+                        </m:r>
+                      </m:sub>
+                    </m:sSub>
+                    <m:r>
+                      <m:rPr>
+                        <m:sty m:val="p"/>
+                      </m:rPr>
+                      <m:t>−</m:t>
+                    </m:r>
+                    <m:sSub>
+                      <m:e>
+                        <m:r>
+                          <m:t>V</m:t>
+                        </m:r>
+                      </m:e>
+                      <m:sub>
+                        <m:r>
+                          <m:t>O</m:t>
+                        </m:r>
+                      </m:sub>
+                    </m:sSub>
+                  </m:den>
+                </m:f>
+              </m:oMath>
+            </m:oMathPara>
+          </w:p>
+        </w:tc>
+        <w:tc>
+          <w:tcPr>
+            <w:tcW w:type="dxa" w:w="1276"/>
+          </w:tcPr>
+          <w:p>
+            <w:pPr>
+              <w:spacing w:line="240" w:lineRule="auto"/>
+              <w:jc w:val="right"/>
+            </w:pPr>
+            <w:r>
+              <w:rPr>
+                <w:rFonts w:ascii="Times New Roman" w:hAnsi="Times New Roman" w:cs="Times New Roman" w:eastAsia="Times New Roman"/>
+                <w:sz w:val="24"/>
+              </w:rPr>
+              <w:t>(2.6)</w:t>
+            </w:r>
+          </w:p>
+        </w:tc>
+      </w:tr>
+    </w:tbl>
+    <w:p>
+      <w:pPr>
+        <w:spacing w:after="0" w:line="144" w:lineRule="auto"/>
+      </w:pPr>
+    </w:p>
+    <w:p>
+      <w:pPr>
+        <w:jc w:val="both"/>
+      </w:pPr>
+      <w:r>
+        <w:rPr>
+          <w:rFonts w:ascii="Times New Roman" w:hAnsi="Times New Roman" w:cs="Times New Roman" w:eastAsia="Times New Roman"/>
+          <w:b w:val="0"/>
+          <w:i w:val="0"/>
+        </w:rPr>
+        <w:t xml:space="preserve">Multimetre için </w:t>
+      </w:r>
+      <m:oMath>
+        <m:r>
+          <m:t>100</m:t>
+        </m:r>
+        <m:r>
+          <m:t> </m:t>
+        </m:r>
+        <m:r>
+          <m:rPr>
+            <m:sty m:val="p"/>
+          </m:rPr>
+          <m:t>k</m:t>
+        </m:r>
+        <m:r>
+          <m:rPr>
+            <m:sty m:val="p"/>
+          </m:rPr>
+          <m:t>Ω</m:t>
+        </m:r>
+      </m:oMath>
+      <w:r>
+        <w:rPr>
+          <w:rFonts w:ascii="Times New Roman" w:hAnsi="Times New Roman" w:cs="Times New Roman" w:eastAsia="Times New Roman"/>
+          <w:b w:val="0"/>
+          <w:i w:val="0"/>
+        </w:rPr>
+        <w:t xml:space="preserve"> satırında (</w:t>
+      </w:r>
+      <m:oMath>
+        <m:r>
+          <m:t>R</m:t>
+        </m:r>
+        <m:r>
+          <m:rPr>
+            <m:sty m:val="p"/>
+          </m:rPr>
+          <m:t>=</m:t>
+        </m:r>
+        <m:r>
+          <m:t>99</m:t>
+        </m:r>
+        <m:r>
+          <m:rPr>
+            <m:sty m:val="p"/>
+          </m:rPr>
+          <m:t>,</m:t>
+        </m:r>
+        <m:r>
+          <m:t>1</m:t>
+        </m:r>
+        <m:r>
+          <m:t> </m:t>
+        </m:r>
+        <m:r>
+          <m:rPr>
+            <m:sty m:val="p"/>
+          </m:rPr>
+          <m:t>k</m:t>
+        </m:r>
+        <m:r>
+          <m:rPr>
+            <m:sty m:val="p"/>
+          </m:rPr>
+          <m:t>Ω</m:t>
+        </m:r>
+      </m:oMath>
+      <w:r>
+        <w:rPr>
+          <w:rFonts w:ascii="Times New Roman" w:hAnsi="Times New Roman" w:cs="Times New Roman" w:eastAsia="Times New Roman"/>
+          <w:b w:val="0"/>
+          <w:i w:val="0"/>
+        </w:rPr>
+        <w:t xml:space="preserve">, </w:t>
+      </w:r>
+      <m:oMath>
+        <m:sSub>
+          <m:e>
+            <m:r>
+              <m:t>V</m:t>
+            </m:r>
+          </m:e>
+          <m:sub>
+            <m:r>
+              <m:t>O</m:t>
+            </m:r>
+          </m:sub>
+        </m:sSub>
+        <m:r>
+          <m:rPr>
+            <m:sty m:val="p"/>
+          </m:rPr>
+          <m:t>=</m:t>
+        </m:r>
+        <m:r>
+          <m:t>6</m:t>
+        </m:r>
+        <m:r>
+          <m:rPr>
+            <m:sty m:val="p"/>
+          </m:rPr>
+          <m:t>,</m:t>
+        </m:r>
+        <m:r>
+          <m:t>5</m:t>
+        </m:r>
+      </m:oMath>
+      <w:r>
+        <w:rPr>
+          <w:rFonts w:ascii="Times New Roman" w:hAnsi="Times New Roman" w:cs="Times New Roman" w:eastAsia="Times New Roman"/>
+          <w:b w:val="0"/>
+          <w:i w:val="0"/>
+        </w:rPr>
+        <w:t xml:space="preserve"> V): </w:t>
+      </w:r>
+      <m:oMath>
+        <m:r>
+          <m:t>k</m:t>
+        </m:r>
+        <m:r>
+          <m:rPr>
+            <m:sty m:val="p"/>
+          </m:rPr>
+          <m:t>=</m:t>
+        </m:r>
+        <m:r>
+          <m:t>6</m:t>
+        </m:r>
+        <m:r>
+          <m:rPr>
+            <m:sty m:val="p"/>
+          </m:rPr>
+          <m:t>,</m:t>
+        </m:r>
+        <m:r>
+          <m:t>5</m:t>
+        </m:r>
+        <m:r>
+          <m:rPr>
+            <m:sty m:val="p"/>
+          </m:rPr>
+          <m:t>/</m:t>
+        </m:r>
+        <m:r>
+          <m:t>8</m:t>
+        </m:r>
+        <m:r>
+          <m:rPr>
+            <m:sty m:val="p"/>
+          </m:rPr>
+          <m:t>,</m:t>
+        </m:r>
+        <m:r>
+          <m:t>5</m:t>
+        </m:r>
+        <m:r>
+          <m:rPr>
+            <m:sty m:val="p"/>
+          </m:rPr>
+          <m:t>=</m:t>
+        </m:r>
+        <m:r>
+          <m:t>0</m:t>
+        </m:r>
+        <m:r>
+          <m:rPr>
+            <m:sty m:val="p"/>
+          </m:rPr>
+          <m:t>,</m:t>
+        </m:r>
+        <m:r>
+          <m:t>765</m:t>
         </m:r>
       </m:oMath>
       <w:r>
@@ -5137,7 +5949,10 @@
           </m:e>
           <m:sub>
             <m:r>
-              <m:t>2</m:t>
+              <m:t>i</m:t>
+            </m:r>
+            <m:r>
+              <m:t>c</m:t>
             </m:r>
           </m:sub>
         </m:sSub>
@@ -5145,10 +5960,10 @@
           <m:rPr>
             <m:sty m:val="p"/>
           </m:rPr>
-          <m:t>=</m:t>
-        </m:r>
-        <m:r>
-          <m:t>99</m:t>
+          <m:t>≈</m:t>
+        </m:r>
+        <m:r>
+          <m:t>0</m:t>
         </m:r>
         <m:r>
           <m:rPr>
@@ -5157,7 +5972,7 @@
           <m:t>,</m:t>
         </m:r>
         <m:r>
-          <m:t>1</m:t>
+          <m:t>32</m:t>
         </m:r>
         <m:r>
           <m:t> </m:t>
@@ -5166,7 +5981,7 @@
           <m:rPr>
             <m:sty m:val="p"/>
           </m:rPr>
-          <m:t>k</m:t>
+          <m:t>M</m:t>
         </m:r>
         <m:r>
           <m:rPr>
@@ -5181,7 +5996,364 @@
           <w:b w:val="0"/>
           <w:i w:val="0"/>
         </w:rPr>
-        <w:t xml:space="preserve"> değerleri nominalden %1 mertebesinde sapmıştır ve bölücü oranı bunlara duyarlıdır; (b) multimetrenin iç direncinin alt dirence paralel girmesi: </w:t>
+        <w:t xml:space="preserve"> bulunur (ekranın son basamağı olan ±0,05 V’a karşılık </w:t>
+      </w:r>
+      <m:oMath>
+        <m:r>
+          <m:t>0</m:t>
+        </m:r>
+        <m:r>
+          <m:rPr>
+            <m:sty m:val="p"/>
+          </m:rPr>
+          <m:t>,</m:t>
+        </m:r>
+        <m:r>
+          <m:t>30</m:t>
+        </m:r>
+      </m:oMath>
+      <w:r>
+        <w:rPr>
+          <w:rFonts w:ascii="Times New Roman" w:hAnsi="Times New Roman" w:cs="Times New Roman" w:eastAsia="Times New Roman"/>
+          <w:b w:val="0"/>
+          <w:i w:val="0"/>
+        </w:rPr>
+        <w:t>–</w:t>
+      </w:r>
+      <m:oMath>
+        <m:r>
+          <m:t>0</m:t>
+        </m:r>
+        <m:r>
+          <m:rPr>
+            <m:sty m:val="p"/>
+          </m:rPr>
+          <m:t>,</m:t>
+        </m:r>
+        <m:r>
+          <m:t>34</m:t>
+        </m:r>
+        <m:r>
+          <m:t> </m:t>
+        </m:r>
+        <m:r>
+          <m:rPr>
+            <m:sty m:val="p"/>
+          </m:rPr>
+          <m:t>M</m:t>
+        </m:r>
+        <m:r>
+          <m:rPr>
+            <m:sty m:val="p"/>
+          </m:rPr>
+          <m:t>Ω</m:t>
+        </m:r>
+      </m:oMath>
+      <w:r>
+        <w:rPr>
+          <w:rFonts w:ascii="Times New Roman" w:hAnsi="Times New Roman" w:cs="Times New Roman" w:eastAsia="Times New Roman"/>
+          <w:b w:val="0"/>
+          <w:i w:val="0"/>
+        </w:rPr>
+        <w:t xml:space="preserve">). </w:t>
+      </w:r>
+      <m:oMath>
+        <m:r>
+          <m:t>10</m:t>
+        </m:r>
+        <m:r>
+          <m:t> </m:t>
+        </m:r>
+        <m:r>
+          <m:rPr>
+            <m:sty m:val="p"/>
+          </m:rPr>
+          <m:t>M</m:t>
+        </m:r>
+        <m:r>
+          <m:rPr>
+            <m:sty m:val="p"/>
+          </m:rPr>
+          <m:t>Ω</m:t>
+        </m:r>
+      </m:oMath>
+      <w:r>
+        <w:rPr>
+          <w:rFonts w:ascii="Times New Roman" w:hAnsi="Times New Roman" w:cs="Times New Roman" w:eastAsia="Times New Roman"/>
+          <w:b w:val="0"/>
+          <w:i w:val="0"/>
+        </w:rPr>
+        <w:t xml:space="preserve"> satırında (</w:t>
+      </w:r>
+      <m:oMath>
+        <m:r>
+          <m:t>R</m:t>
+        </m:r>
+        <m:r>
+          <m:rPr>
+            <m:sty m:val="p"/>
+          </m:rPr>
+          <m:t>=</m:t>
+        </m:r>
+        <m:r>
+          <m:t>10</m:t>
+        </m:r>
+        <m:r>
+          <m:rPr>
+            <m:sty m:val="p"/>
+          </m:rPr>
+          <m:t>,</m:t>
+        </m:r>
+        <m:r>
+          <m:t>30</m:t>
+        </m:r>
+        <m:r>
+          <m:t> </m:t>
+        </m:r>
+        <m:r>
+          <m:rPr>
+            <m:sty m:val="p"/>
+          </m:rPr>
+          <m:t>M</m:t>
+        </m:r>
+        <m:r>
+          <m:rPr>
+            <m:sty m:val="p"/>
+          </m:rPr>
+          <m:t>Ω</m:t>
+        </m:r>
+      </m:oMath>
+      <w:r>
+        <w:rPr>
+          <w:rFonts w:ascii="Times New Roman" w:hAnsi="Times New Roman" w:cs="Times New Roman" w:eastAsia="Times New Roman"/>
+          <w:b w:val="0"/>
+          <w:i w:val="0"/>
+        </w:rPr>
+        <w:t xml:space="preserve">, </w:t>
+      </w:r>
+      <m:oMath>
+        <m:sSub>
+          <m:e>
+            <m:r>
+              <m:t>V</m:t>
+            </m:r>
+          </m:e>
+          <m:sub>
+            <m:r>
+              <m:t>O</m:t>
+            </m:r>
+          </m:sub>
+        </m:sSub>
+        <m:r>
+          <m:rPr>
+            <m:sty m:val="p"/>
+          </m:rPr>
+          <m:t>=</m:t>
+        </m:r>
+        <m:r>
+          <m:t>0</m:t>
+        </m:r>
+        <m:r>
+          <m:rPr>
+            <m:sty m:val="p"/>
+          </m:rPr>
+          <m:t>,</m:t>
+        </m:r>
+        <m:r>
+          <m:t>9</m:t>
+        </m:r>
+      </m:oMath>
+      <w:r>
+        <w:rPr>
+          <w:rFonts w:ascii="Times New Roman" w:hAnsi="Times New Roman" w:cs="Times New Roman" w:eastAsia="Times New Roman"/>
+          <w:b w:val="0"/>
+          <w:i w:val="0"/>
+        </w:rPr>
+        <w:t xml:space="preserve"> V): </w:t>
+      </w:r>
+      <m:oMath>
+        <m:r>
+          <m:t>k</m:t>
+        </m:r>
+        <m:r>
+          <m:rPr>
+            <m:sty m:val="p"/>
+          </m:rPr>
+          <m:t>=</m:t>
+        </m:r>
+        <m:r>
+          <m:t>0</m:t>
+        </m:r>
+        <m:r>
+          <m:rPr>
+            <m:sty m:val="p"/>
+          </m:rPr>
+          <m:t>,</m:t>
+        </m:r>
+        <m:r>
+          <m:t>9</m:t>
+        </m:r>
+        <m:r>
+          <m:rPr>
+            <m:sty m:val="p"/>
+          </m:rPr>
+          <m:t>/</m:t>
+        </m:r>
+        <m:r>
+          <m:t>14</m:t>
+        </m:r>
+        <m:r>
+          <m:rPr>
+            <m:sty m:val="p"/>
+          </m:rPr>
+          <m:t>,</m:t>
+        </m:r>
+        <m:r>
+          <m:t>1</m:t>
+        </m:r>
+        <m:r>
+          <m:rPr>
+            <m:sty m:val="p"/>
+          </m:rPr>
+          <m:t>=</m:t>
+        </m:r>
+        <m:r>
+          <m:t>0</m:t>
+        </m:r>
+        <m:r>
+          <m:rPr>
+            <m:sty m:val="p"/>
+          </m:rPr>
+          <m:t>,</m:t>
+        </m:r>
+        <m:r>
+          <m:t>0638</m:t>
+        </m:r>
+      </m:oMath>
+      <w:r>
+        <w:rPr>
+          <w:rFonts w:ascii="Times New Roman" w:hAnsi="Times New Roman" w:cs="Times New Roman" w:eastAsia="Times New Roman"/>
+          <w:b w:val="0"/>
+          <w:i w:val="0"/>
+        </w:rPr>
+        <w:t xml:space="preserve"> ve </w:t>
+      </w:r>
+      <m:oMath>
+        <m:sSub>
+          <m:e>
+            <m:r>
+              <m:t>R</m:t>
+            </m:r>
+          </m:e>
+          <m:sub>
+            <m:r>
+              <m:t>i</m:t>
+            </m:r>
+            <m:r>
+              <m:t>c</m:t>
+            </m:r>
+          </m:sub>
+        </m:sSub>
+        <m:r>
+          <m:rPr>
+            <m:sty m:val="p"/>
+          </m:rPr>
+          <m:t>≈</m:t>
+        </m:r>
+        <m:r>
+          <m:t>0</m:t>
+        </m:r>
+        <m:r>
+          <m:rPr>
+            <m:sty m:val="p"/>
+          </m:rPr>
+          <m:t>,</m:t>
+        </m:r>
+        <m:r>
+          <m:t>70</m:t>
+        </m:r>
+        <m:r>
+          <m:t> </m:t>
+        </m:r>
+        <m:r>
+          <m:rPr>
+            <m:sty m:val="p"/>
+          </m:rPr>
+          <m:t>M</m:t>
+        </m:r>
+        <m:r>
+          <m:rPr>
+            <m:sty m:val="p"/>
+          </m:rPr>
+          <m:t>Ω</m:t>
+        </m:r>
+      </m:oMath>
+      <w:r>
+        <w:rPr>
+          <w:rFonts w:ascii="Times New Roman" w:hAnsi="Times New Roman" w:cs="Times New Roman" w:eastAsia="Times New Roman"/>
+          <w:b w:val="0"/>
+          <w:i w:val="0"/>
+        </w:rPr>
+        <w:t xml:space="preserve"> bulunur (</w:t>
+      </w:r>
+      <m:oMath>
+        <m:r>
+          <m:t>0</m:t>
+        </m:r>
+        <m:r>
+          <m:rPr>
+            <m:sty m:val="p"/>
+          </m:rPr>
+          <m:t>,</m:t>
+        </m:r>
+        <m:r>
+          <m:t>66</m:t>
+        </m:r>
+      </m:oMath>
+      <w:r>
+        <w:rPr>
+          <w:rFonts w:ascii="Times New Roman" w:hAnsi="Times New Roman" w:cs="Times New Roman" w:eastAsia="Times New Roman"/>
+          <w:b w:val="0"/>
+          <w:i w:val="0"/>
+        </w:rPr>
+        <w:t>–</w:t>
+      </w:r>
+      <m:oMath>
+        <m:r>
+          <m:t>0</m:t>
+        </m:r>
+        <m:r>
+          <m:rPr>
+            <m:sty m:val="p"/>
+          </m:rPr>
+          <m:t>,</m:t>
+        </m:r>
+        <m:r>
+          <m:t>75</m:t>
+        </m:r>
+        <m:r>
+          <m:t> </m:t>
+        </m:r>
+        <m:r>
+          <m:rPr>
+            <m:sty m:val="p"/>
+          </m:rPr>
+          <m:t>M</m:t>
+        </m:r>
+        <m:r>
+          <m:rPr>
+            <m:sty m:val="p"/>
+          </m:rPr>
+          <m:t>Ω</m:t>
+        </m:r>
+      </m:oMath>
+      <w:r>
+        <w:rPr>
+          <w:rFonts w:ascii="Times New Roman" w:hAnsi="Times New Roman" w:cs="Times New Roman" w:eastAsia="Times New Roman"/>
+          <w:b w:val="0"/>
+          <w:i w:val="0"/>
+        </w:rPr>
+        <w:t xml:space="preserve">). Osiloskop için </w:t>
       </w:r>
       <m:oMath>
         <m:r>
@@ -5195,6 +6367,452 @@
             <m:sty m:val="p"/>
           </m:rPr>
           <m:t>k</m:t>
+        </m:r>
+        <m:r>
+          <m:rPr>
+            <m:sty m:val="p"/>
+          </m:rPr>
+          <m:t>Ω</m:t>
+        </m:r>
+      </m:oMath>
+      <w:r>
+        <w:rPr>
+          <w:rFonts w:ascii="Times New Roman" w:hAnsi="Times New Roman" w:cs="Times New Roman" w:eastAsia="Times New Roman"/>
+          <w:b w:val="0"/>
+          <w:i w:val="0"/>
+        </w:rPr>
+        <w:t xml:space="preserve"> satırında (</w:t>
+      </w:r>
+      <m:oMath>
+        <m:sSub>
+          <m:e>
+            <m:r>
+              <m:t>V</m:t>
+            </m:r>
+          </m:e>
+          <m:sub>
+            <m:r>
+              <m:t>O</m:t>
+            </m:r>
+          </m:sub>
+        </m:sSub>
+        <m:r>
+          <m:rPr>
+            <m:sty m:val="p"/>
+          </m:rPr>
+          <m:t>=</m:t>
+        </m:r>
+        <m:r>
+          <m:t>7</m:t>
+        </m:r>
+        <m:r>
+          <m:rPr>
+            <m:sty m:val="p"/>
+          </m:rPr>
+          <m:t>,</m:t>
+        </m:r>
+        <m:r>
+          <m:t>4</m:t>
+        </m:r>
+      </m:oMath>
+      <w:r>
+        <w:rPr>
+          <w:rFonts w:ascii="Times New Roman" w:hAnsi="Times New Roman" w:cs="Times New Roman" w:eastAsia="Times New Roman"/>
+          <w:b w:val="0"/>
+          <w:i w:val="0"/>
+        </w:rPr>
+        <w:t xml:space="preserve"> V): </w:t>
+      </w:r>
+      <m:oMath>
+        <m:sSub>
+          <m:e>
+            <m:r>
+              <m:t>R</m:t>
+            </m:r>
+          </m:e>
+          <m:sub>
+            <m:r>
+              <m:t>i</m:t>
+            </m:r>
+            <m:r>
+              <m:t>c</m:t>
+            </m:r>
+          </m:sub>
+        </m:sSub>
+        <m:r>
+          <m:rPr>
+            <m:sty m:val="p"/>
+          </m:rPr>
+          <m:t>≈</m:t>
+        </m:r>
+        <m:r>
+          <m:t>3</m:t>
+        </m:r>
+        <m:r>
+          <m:rPr>
+            <m:sty m:val="p"/>
+          </m:rPr>
+          <m:t>,</m:t>
+        </m:r>
+        <m:r>
+          <m:t>7</m:t>
+        </m:r>
+        <m:r>
+          <m:t> </m:t>
+        </m:r>
+        <m:r>
+          <m:rPr>
+            <m:sty m:val="p"/>
+          </m:rPr>
+          <m:t>M</m:t>
+        </m:r>
+        <m:r>
+          <m:rPr>
+            <m:sty m:val="p"/>
+          </m:rPr>
+          <m:t>Ω</m:t>
+        </m:r>
+      </m:oMath>
+      <w:r>
+        <w:rPr>
+          <w:rFonts w:ascii="Times New Roman" w:hAnsi="Times New Roman" w:cs="Times New Roman" w:eastAsia="Times New Roman"/>
+          <w:b w:val="0"/>
+          <w:i w:val="0"/>
+        </w:rPr>
+        <w:t xml:space="preserve"> bulunur; ekran basamağı nedeniyle aralık geniştir (</w:t>
+      </w:r>
+      <m:oMath>
+        <m:r>
+          <m:t>2</m:t>
+        </m:r>
+        <m:r>
+          <m:rPr>
+            <m:sty m:val="p"/>
+          </m:rPr>
+          <m:t>,</m:t>
+        </m:r>
+        <m:r>
+          <m:t>4</m:t>
+        </m:r>
+      </m:oMath>
+      <w:r>
+        <w:rPr>
+          <w:rFonts w:ascii="Times New Roman" w:hAnsi="Times New Roman" w:cs="Times New Roman" w:eastAsia="Times New Roman"/>
+          <w:b w:val="0"/>
+          <w:i w:val="0"/>
+        </w:rPr>
+        <w:t>–</w:t>
+      </w:r>
+      <m:oMath>
+        <m:r>
+          <m:t>7</m:t>
+        </m:r>
+        <m:r>
+          <m:rPr>
+            <m:sty m:val="p"/>
+          </m:rPr>
+          <m:t>,</m:t>
+        </m:r>
+        <m:r>
+          <m:t>4</m:t>
+        </m:r>
+        <m:r>
+          <m:t> </m:t>
+        </m:r>
+        <m:r>
+          <m:rPr>
+            <m:sty m:val="p"/>
+          </m:rPr>
+          <m:t>M</m:t>
+        </m:r>
+        <m:r>
+          <m:rPr>
+            <m:sty m:val="p"/>
+          </m:rPr>
+          <m:t>Ω</m:t>
+        </m:r>
+      </m:oMath>
+      <w:r>
+        <w:rPr>
+          <w:rFonts w:ascii="Times New Roman" w:hAnsi="Times New Roman" w:cs="Times New Roman" w:eastAsia="Times New Roman"/>
+          <w:b w:val="0"/>
+          <w:i w:val="0"/>
+        </w:rPr>
+        <w:t>).</w:t>
+      </w:r>
+    </w:p>
+    <w:p>
+      <w:pPr>
+        <w:jc w:val="both"/>
+      </w:pPr>
+      <w:r>
+        <w:rPr>
+          <w:rFonts w:ascii="Times New Roman" w:hAnsi="Times New Roman" w:cs="Times New Roman" w:eastAsia="Times New Roman"/>
+          <w:b/>
+          <w:i w:val="0"/>
+        </w:rPr>
+        <w:t>Yorum.</w:t>
+      </w:r>
+      <w:r>
+        <w:rPr>
+          <w:rFonts w:ascii="Times New Roman" w:hAnsi="Times New Roman" w:cs="Times New Roman" w:eastAsia="Times New Roman"/>
+          <w:b w:val="0"/>
+          <w:i w:val="0"/>
+        </w:rPr>
+        <w:t xml:space="preserve"> Bu sayılar şunu söylemektedir: ölçümde multimetrenin devreye gösterdiği direnç yaklaşık </w:t>
+      </w:r>
+      <m:oMath>
+        <m:r>
+          <m:t>0</m:t>
+        </m:r>
+        <m:r>
+          <m:rPr>
+            <m:sty m:val="p"/>
+          </m:rPr>
+          <m:t>,</m:t>
+        </m:r>
+        <m:r>
+          <m:t>3</m:t>
+        </m:r>
+      </m:oMath>
+      <w:r>
+        <w:rPr>
+          <w:rFonts w:ascii="Times New Roman" w:hAnsi="Times New Roman" w:cs="Times New Roman" w:eastAsia="Times New Roman"/>
+          <w:b w:val="0"/>
+          <w:i w:val="0"/>
+        </w:rPr>
+        <w:t>–</w:t>
+      </w:r>
+      <m:oMath>
+        <m:r>
+          <m:t>0</m:t>
+        </m:r>
+        <m:r>
+          <m:rPr>
+            <m:sty m:val="p"/>
+          </m:rPr>
+          <m:t>,</m:t>
+        </m:r>
+        <m:r>
+          <m:t>7</m:t>
+        </m:r>
+        <m:r>
+          <m:t> </m:t>
+        </m:r>
+        <m:r>
+          <m:rPr>
+            <m:sty m:val="p"/>
+          </m:rPr>
+          <m:t>M</m:t>
+        </m:r>
+        <m:r>
+          <m:rPr>
+            <m:sty m:val="p"/>
+          </m:rPr>
+          <m:t>Ω</m:t>
+        </m:r>
+      </m:oMath>
+      <w:r>
+        <w:rPr>
+          <w:rFonts w:ascii="Times New Roman" w:hAnsi="Times New Roman" w:cs="Times New Roman" w:eastAsia="Times New Roman"/>
+          <w:b w:val="0"/>
+          <w:i w:val="0"/>
+        </w:rPr>
+        <w:t xml:space="preserve"> mertebesindedir; katalog değeri olan </w:t>
+      </w:r>
+      <m:oMath>
+        <m:r>
+          <m:t>10</m:t>
+        </m:r>
+        <m:r>
+          <m:t> </m:t>
+        </m:r>
+        <m:r>
+          <m:rPr>
+            <m:sty m:val="p"/>
+          </m:rPr>
+          <m:t>M</m:t>
+        </m:r>
+        <m:r>
+          <m:rPr>
+            <m:sty m:val="p"/>
+          </m:rPr>
+          <m:t>Ω</m:t>
+        </m:r>
+      </m:oMath>
+      <w:r>
+        <w:rPr>
+          <w:rFonts w:ascii="Times New Roman" w:hAnsi="Times New Roman" w:cs="Times New Roman" w:eastAsia="Times New Roman"/>
+          <w:b w:val="0"/>
+          <w:i w:val="0"/>
+        </w:rPr>
+        <w:t xml:space="preserve">’dan yaklaşık 15–30 kat küçüktür. Bu iki sonucun birbirinden farklı çıkması (0,32 ve 0,70), </w:t>
+      </w:r>
+      <m:oMath>
+        <m:r>
+          <m:t>10</m:t>
+        </m:r>
+        <m:r>
+          <m:t> </m:t>
+        </m:r>
+        <m:r>
+          <m:rPr>
+            <m:sty m:val="p"/>
+          </m:rPr>
+          <m:t>M</m:t>
+        </m:r>
+        <m:r>
+          <m:rPr>
+            <m:sty m:val="p"/>
+          </m:rPr>
+          <m:t>Ω</m:t>
+        </m:r>
+      </m:oMath>
+      <w:r>
+        <w:rPr>
+          <w:rFonts w:ascii="Times New Roman" w:hAnsi="Times New Roman" w:cs="Times New Roman" w:eastAsia="Times New Roman"/>
+          <w:b w:val="0"/>
+          <w:i w:val="0"/>
+        </w:rPr>
+        <w:t xml:space="preserve"> satırında </w:t>
+      </w:r>
+      <m:oMath>
+        <m:sSub>
+          <m:e>
+            <m:r>
+              <m:t>R</m:t>
+            </m:r>
+          </m:e>
+          <m:sub>
+            <m:r>
+              <m:t>i</m:t>
+            </m:r>
+            <m:r>
+              <m:t>c</m:t>
+            </m:r>
+          </m:sub>
+        </m:sSub>
+      </m:oMath>
+      <w:r>
+        <w:rPr>
+          <w:rFonts w:ascii="Times New Roman" w:hAnsi="Times New Roman" w:cs="Times New Roman" w:eastAsia="Times New Roman"/>
+          <w:b w:val="0"/>
+          <w:i w:val="0"/>
+        </w:rPr>
+        <w:t xml:space="preserve">’nin direnç değerlerine (ölçülmeyen ikinci direnç dâhil) çok duyarlı olmasındandır; iki sayı birlikte tek bir gerçeği gösterir: bu ölçümlerde multimetre, iç direnci katalogdaki </w:t>
+      </w:r>
+      <m:oMath>
+        <m:r>
+          <m:t>10</m:t>
+        </m:r>
+        <m:r>
+          <m:t> </m:t>
+        </m:r>
+        <m:r>
+          <m:rPr>
+            <m:sty m:val="p"/>
+          </m:rPr>
+          <m:t>M</m:t>
+        </m:r>
+        <m:r>
+          <m:rPr>
+            <m:sty m:val="p"/>
+          </m:rPr>
+          <m:t>Ω</m:t>
+        </m:r>
+      </m:oMath>
+      <w:r>
+        <w:rPr>
+          <w:rFonts w:ascii="Times New Roman" w:hAnsi="Times New Roman" w:cs="Times New Roman" w:eastAsia="Times New Roman"/>
+          <w:b w:val="0"/>
+          <w:i w:val="0"/>
+        </w:rPr>
+        <w:t xml:space="preserve">’dan çok daha küçük bir yük gibi davranmıştır. Bunun nedenini (aletin giriş devresi, kademe, aynı düğüme aynı anda bağlı başka bir ölçü kablosu vb.) fotoğraflardan ve kayıtlardan kesinleştiremedim; kesinleştirmenin yolu, aleti bilinen bir dirençle (örneğin </w:t>
+      </w:r>
+      <m:oMath>
+        <m:r>
+          <m:t>1</m:t>
+        </m:r>
+        <m:r>
+          <m:t> </m:t>
+        </m:r>
+        <m:r>
+          <m:rPr>
+            <m:sty m:val="p"/>
+          </m:rPr>
+          <m:t>M</m:t>
+        </m:r>
+        <m:r>
+          <m:rPr>
+            <m:sty m:val="p"/>
+          </m:rPr>
+          <m:t>Ω</m:t>
+        </m:r>
+      </m:oMath>
+      <w:r>
+        <w:rPr>
+          <w:rFonts w:ascii="Times New Roman" w:hAnsi="Times New Roman" w:cs="Times New Roman" w:eastAsia="Times New Roman"/>
+          <w:b w:val="0"/>
+          <w:i w:val="0"/>
+        </w:rPr>
+        <w:t xml:space="preserve">) bir gerilim kaynağına seri bağlayıp </w:t>
+      </w:r>
+      <w:r>
+        <w:rPr>
+          <w:rFonts w:ascii="Times New Roman" w:hAnsi="Times New Roman" w:cs="Times New Roman" w:eastAsia="Times New Roman"/>
+          <w:b w:val="0"/>
+          <w:i w:val="0"/>
+        </w:rPr>
+        <w:t>(2.5)</w:t>
+      </w:r>
+      <w:r>
+        <w:rPr>
+          <w:rFonts w:ascii="Times New Roman" w:hAnsi="Times New Roman" w:cs="Times New Roman" w:eastAsia="Times New Roman"/>
+          <w:b w:val="0"/>
+          <w:i w:val="0"/>
+        </w:rPr>
+        <w:t xml:space="preserve">’i ters çözmektir. Osiloskop ise </w:t>
+      </w:r>
+      <m:oMath>
+        <m:r>
+          <m:t>100</m:t>
+        </m:r>
+        <m:r>
+          <m:t> </m:t>
+        </m:r>
+        <m:r>
+          <m:rPr>
+            <m:sty m:val="p"/>
+          </m:rPr>
+          <m:t>k</m:t>
+        </m:r>
+        <m:r>
+          <m:rPr>
+            <m:sty m:val="p"/>
+          </m:rPr>
+          <m:t>Ω</m:t>
+        </m:r>
+      </m:oMath>
+      <w:r>
+        <w:rPr>
+          <w:rFonts w:ascii="Times New Roman" w:hAnsi="Times New Roman" w:cs="Times New Roman" w:eastAsia="Times New Roman"/>
+          <w:b w:val="0"/>
+          <w:i w:val="0"/>
+        </w:rPr>
+        <w:t xml:space="preserve"> satırında yalnızca %1,3 düşük okumuştur; bu, giriş direncinin multimetreninkinden çok daha büyük göründüğünü gösterir (10× uçla </w:t>
+      </w:r>
+      <m:oMath>
+        <m:r>
+          <m:t>10</m:t>
+        </m:r>
+        <m:r>
+          <m:t> </m:t>
+        </m:r>
+        <m:r>
+          <m:rPr>
+            <m:sty m:val="p"/>
+          </m:rPr>
+          <m:t>M</m:t>
         </m:r>
         <m:r>
           <m:rPr>
@@ -5225,11 +6843,11 @@
           <w:b w:val="0"/>
           <w:i w:val="0"/>
         </w:rPr>
-        <w:t xml:space="preserve"> 7,463 V verir (bu 0,05 V’luk yük etkisi %0,5’e denk gelir). </w:t>
+        <w:t xml:space="preserve"> 7,46 V verir, 1× uçla </w:t>
       </w:r>
       <m:oMath>
         <m:r>
-          <m:t>10</m:t>
+          <m:t>1</m:t>
         </m:r>
         <m:r>
           <m:t> </m:t>
@@ -5253,319 +6871,7 @@
           <w:b w:val="0"/>
           <w:i w:val="0"/>
         </w:rPr>
-        <w:t xml:space="preserve"> satırında fark çok büyüktür: 7,5 V yerine 6,5 V okunmuştur. Yüklenme hesabı bu satırda </w:t>
-      </w:r>
-      <w:r>
-        <w:rPr>
-          <w:rFonts w:ascii="Times New Roman" w:hAnsi="Times New Roman" w:cs="Times New Roman" w:eastAsia="Times New Roman"/>
-          <w:b w:val="0"/>
-          <w:i w:val="0"/>
-        </w:rPr>
-        <w:t xml:space="preserve">≈ </w:t>
-      </w:r>
-      <m:oMath>
-        <m:r>
-          <m:t>5</m:t>
-        </m:r>
-        <m:r>
-          <m:rPr>
-            <m:sty m:val="p"/>
-          </m:rPr>
-          <m:t>,</m:t>
-        </m:r>
-        <m:r>
-          <m:t>0</m:t>
-        </m:r>
-      </m:oMath>
-      <w:r>
-        <w:rPr>
-          <w:rFonts w:ascii="Times New Roman" w:hAnsi="Times New Roman" w:cs="Times New Roman" w:eastAsia="Times New Roman"/>
-          <w:b w:val="0"/>
-          <w:i w:val="0"/>
-        </w:rPr>
-        <w:t xml:space="preserve"> V bekletir (</w:t>
-      </w:r>
-      <m:oMath>
-        <m:sSub>
-          <m:e>
-            <m:r>
-              <m:t>R</m:t>
-            </m:r>
-          </m:e>
-          <m:sub>
-            <m:r>
-              <m:t>p</m:t>
-            </m:r>
-          </m:sub>
-        </m:sSub>
-        <m:r>
-          <m:rPr>
-            <m:sty m:val="p"/>
-          </m:rPr>
-          <m:t>≈</m:t>
-        </m:r>
-        <m:r>
-          <m:t>5</m:t>
-        </m:r>
-        <m:r>
-          <m:rPr>
-            <m:sty m:val="p"/>
-          </m:rPr>
-          <m:t>,</m:t>
-        </m:r>
-        <m:r>
-          <m:t>08</m:t>
-        </m:r>
-        <m:r>
-          <m:t> </m:t>
-        </m:r>
-        <m:r>
-          <m:rPr>
-            <m:sty m:val="p"/>
-          </m:rPr>
-          <m:t>M</m:t>
-        </m:r>
-        <m:r>
-          <m:rPr>
-            <m:sty m:val="p"/>
-          </m:rPr>
-          <m:t>Ω</m:t>
-        </m:r>
-      </m:oMath>
-      <w:r>
-        <w:rPr>
-          <w:rFonts w:ascii="Times New Roman" w:hAnsi="Times New Roman" w:cs="Times New Roman" w:eastAsia="Times New Roman"/>
-          <w:b w:val="0"/>
-          <w:i w:val="0"/>
-        </w:rPr>
-        <w:t xml:space="preserve">), çünkü iç direnç devre direncine eşit mertebededir; ancak okunan 6,5 V bu değerin de üzerindedir. Bu okumayı kuramsal hesapla bağdaştıramadım: </w:t>
-      </w:r>
-      <m:oMath>
-        <m:sSub>
-          <m:e>
-            <m:r>
-              <m:t>R</m:t>
-            </m:r>
-          </m:e>
-          <m:sub>
-            <m:r>
-              <m:t>ü</m:t>
-            </m:r>
-            <m:r>
-              <m:t>s</m:t>
-            </m:r>
-            <m:r>
-              <m:t>t</m:t>
-            </m:r>
-          </m:sub>
-        </m:sSub>
-        <m:r>
-          <m:rPr>
-            <m:sty m:val="p"/>
-          </m:rPr>
-          <m:t>=</m:t>
-        </m:r>
-        <m:sSub>
-          <m:e>
-            <m:r>
-              <m:t>R</m:t>
-            </m:r>
-          </m:e>
-          <m:sub>
-            <m:r>
-              <m:t>a</m:t>
-            </m:r>
-            <m:r>
-              <m:t>l</m:t>
-            </m:r>
-            <m:r>
-              <m:t>t</m:t>
-            </m:r>
-          </m:sub>
-        </m:sSub>
-        <m:r>
-          <m:rPr>
-            <m:sty m:val="p"/>
-          </m:rPr>
-          <m:t>=</m:t>
-        </m:r>
-        <m:r>
-          <m:t>10</m:t>
-        </m:r>
-        <m:r>
-          <m:rPr>
-            <m:sty m:val="p"/>
-          </m:rPr>
-          <m:t>,</m:t>
-        </m:r>
-        <m:r>
-          <m:t>30</m:t>
-        </m:r>
-        <m:r>
-          <m:t> </m:t>
-        </m:r>
-        <m:r>
-          <m:rPr>
-            <m:sty m:val="p"/>
-          </m:rPr>
-          <m:t>M</m:t>
-        </m:r>
-        <m:r>
-          <m:rPr>
-            <m:sty m:val="p"/>
-          </m:rPr>
-          <m:t>Ω</m:t>
-        </m:r>
-      </m:oMath>
-      <w:r>
-        <w:rPr>
-          <w:rFonts w:ascii="Times New Roman" w:hAnsi="Times New Roman" w:cs="Times New Roman" w:eastAsia="Times New Roman"/>
-          <w:b w:val="0"/>
-          <w:i w:val="0"/>
-        </w:rPr>
-        <w:t xml:space="preserve"> ve </w:t>
-      </w:r>
-      <m:oMath>
-        <m:sSub>
-          <m:e>
-            <m:r>
-              <m:t>V</m:t>
-            </m:r>
-          </m:e>
-          <m:sub>
-            <m:r>
-              <m:t>S</m:t>
-            </m:r>
-          </m:sub>
-        </m:sSub>
-        <m:r>
-          <m:rPr>
-            <m:sty m:val="p"/>
-          </m:rPr>
-          <m:t>=</m:t>
-        </m:r>
-        <m:r>
-          <m:t>15</m:t>
-        </m:r>
-      </m:oMath>
-      <w:r>
-        <w:rPr>
-          <w:rFonts w:ascii="Times New Roman" w:hAnsi="Times New Roman" w:cs="Times New Roman" w:eastAsia="Times New Roman"/>
-          <w:b w:val="0"/>
-          <w:i w:val="0"/>
-        </w:rPr>
-        <w:t xml:space="preserve"> V alınırsa 6,5 V okumak için aletin iç direncinin yaklaşık </w:t>
-      </w:r>
-      <m:oMath>
-        <m:r>
-          <m:t>33</m:t>
-        </m:r>
-        <m:r>
-          <m:t> </m:t>
-        </m:r>
-        <m:r>
-          <m:rPr>
-            <m:sty m:val="p"/>
-          </m:rPr>
-          <m:t>M</m:t>
-        </m:r>
-        <m:r>
-          <m:rPr>
-            <m:sty m:val="p"/>
-          </m:rPr>
-          <m:t>Ω</m:t>
-        </m:r>
-      </m:oMath>
-      <w:r>
-        <w:rPr>
-          <w:rFonts w:ascii="Times New Roman" w:hAnsi="Times New Roman" w:cs="Times New Roman" w:eastAsia="Times New Roman"/>
-          <w:b w:val="0"/>
-          <w:i w:val="0"/>
-        </w:rPr>
-        <w:t xml:space="preserve"> olması gerekir; bu katalog değerinin (</w:t>
-      </w:r>
-      <m:oMath>
-        <m:r>
-          <m:t>10</m:t>
-        </m:r>
-        <m:r>
-          <m:t> </m:t>
-        </m:r>
-        <m:r>
-          <m:rPr>
-            <m:sty m:val="p"/>
-          </m:rPr>
-          <m:t>M</m:t>
-        </m:r>
-        <m:r>
-          <m:rPr>
-            <m:sty m:val="p"/>
-          </m:rPr>
-          <m:t>Ω</m:t>
-        </m:r>
-      </m:oMath>
-      <w:r>
-        <w:rPr>
-          <w:rFonts w:ascii="Times New Roman" w:hAnsi="Times New Roman" w:cs="Times New Roman" w:eastAsia="Times New Roman"/>
-          <w:b w:val="0"/>
-          <w:i w:val="0"/>
-        </w:rPr>
-        <w:t xml:space="preserve">) çok üzerindedir. Olası nedenler: alt ve üst dirençlerin eşit olmaması (yalnızca </w:t>
-      </w:r>
-      <m:oMath>
-        <m:sSub>
-          <m:e>
-            <m:r>
-              <m:t>R</m:t>
-            </m:r>
-          </m:e>
-          <m:sub>
-            <m:r>
-              <m:t>3</m:t>
-            </m:r>
-          </m:sub>
-        </m:sSub>
-        <m:r>
-          <m:rPr>
-            <m:sty m:val="p"/>
-          </m:rPr>
-          <m:t>=</m:t>
-        </m:r>
-        <m:r>
-          <m:t>10</m:t>
-        </m:r>
-        <m:r>
-          <m:rPr>
-            <m:sty m:val="p"/>
-          </m:rPr>
-          <m:t>,</m:t>
-        </m:r>
-        <m:r>
-          <m:t>30</m:t>
-        </m:r>
-        <m:r>
-          <m:t> </m:t>
-        </m:r>
-        <m:r>
-          <m:rPr>
-            <m:sty m:val="p"/>
-          </m:rPr>
-          <m:t>M</m:t>
-        </m:r>
-        <m:r>
-          <m:rPr>
-            <m:sty m:val="p"/>
-          </m:rPr>
-          <m:t>Ω</m:t>
-        </m:r>
-      </m:oMath>
-      <w:r>
-        <w:rPr>
-          <w:rFonts w:ascii="Times New Roman" w:hAnsi="Times New Roman" w:cs="Times New Roman" w:eastAsia="Times New Roman"/>
-          <w:b w:val="0"/>
-          <w:i w:val="0"/>
-        </w:rPr>
-        <w:t xml:space="preserve"> ölçülmüş, iki 10 MΩ direncin ikisi ayrı ayrı ölçülmemiştir), kaynak geriliminin 15 V olmaması veya bu çok yüksek empedanslı düğümde aletin okumasının dalgalanması (aşağıdaki Soru 2’ye bakınız). Bu nedenle 10 MΩ satırı kesin bir sayısal sonuç değil, “yük etkisi büyüktür ve ölçüm kararsızdır” sonucu olarak yorumlanmalıdır. Üçüncü multimetre fotoğrafındaki 0,9 V okumasının hangi bağlantıya ait olduğu belgelerden anlaşılamamıştır (fotoğraf, föyde 7,4 V ve 6,5 V yazıldıktan sonra çekilmiştir); bu yüzden tabloya alınmamış, EK-1’de ayrı satır olarak bırakılmıştır.</w:t>
+        <w:t xml:space="preserve"> için 7,14 V verirdi; okunan 7,4 V birinciye yakındır, uç tipi kayıtlı değildir).</w:t>
       </w:r>
     </w:p>
     <w:p>
@@ -5608,14 +6914,31 @@
       <w:pPr>
         <w:jc w:val="both"/>
       </w:pPr>
+      <w:r>
+        <w:rPr>
+          <w:rFonts w:ascii="Times New Roman" w:hAnsi="Times New Roman" w:cs="Times New Roman" w:eastAsia="Times New Roman"/>
+          <w:b w:val="0"/>
+          <w:i w:val="0"/>
+        </w:rPr>
+        <w:t xml:space="preserve">Evet, </w:t>
+      </w:r>
       <m:oMath>
         <m:r>
-          <m:t>470</m:t>
+          <m:t>100</m:t>
         </m:r>
         <m:r>
           <m:t> </m:t>
         </m:r>
         <m:r>
+          <m:rPr>
+            <m:sty m:val="p"/>
+          </m:rPr>
+          <m:t>k</m:t>
+        </m:r>
+        <m:r>
+          <m:rPr>
+            <m:sty m:val="p"/>
+          </m:rPr>
           <m:t>Ω</m:t>
         </m:r>
       </m:oMath>
@@ -5625,11 +6948,11 @@
           <w:b w:val="0"/>
           <w:i w:val="0"/>
         </w:rPr>
-        <w:t xml:space="preserve"> satırında iki alet de 7,40 V göstermiştir; </w:t>
+        <w:t xml:space="preserve"> ve </w:t>
       </w:r>
       <m:oMath>
         <m:r>
-          <m:t>100</m:t>
+          <m:t>10</m:t>
         </m:r>
         <m:r>
           <m:t> </m:t>
@@ -5638,7 +6961,7 @@
           <m:rPr>
             <m:sty m:val="p"/>
           </m:rPr>
-          <m:t>k</m:t>
+          <m:t>M</m:t>
         </m:r>
         <m:r>
           <m:rPr>
@@ -5653,35 +6976,7 @@
           <w:b w:val="0"/>
           <w:i w:val="0"/>
         </w:rPr>
-        <w:t xml:space="preserve"> satırında multimetre 7,4 V, osiloskop 7,30 V göstermiştir. Osiloskopun düşük okuması iç direncinin daha küçük olmasıyla uyumludur: </w:t>
-      </w:r>
-      <m:oMath>
-        <m:r>
-          <m:t>1</m:t>
-        </m:r>
-        <m:r>
-          <m:t> </m:t>
-        </m:r>
-        <m:r>
-          <m:rPr>
-            <m:sty m:val="p"/>
-          </m:rPr>
-          <m:t>M</m:t>
-        </m:r>
-        <m:r>
-          <m:rPr>
-            <m:sty m:val="p"/>
-          </m:rPr>
-          <m:t>Ω</m:t>
-        </m:r>
-      </m:oMath>
-      <w:r>
-        <w:rPr>
-          <w:rFonts w:ascii="Times New Roman" w:hAnsi="Times New Roman" w:cs="Times New Roman" w:eastAsia="Times New Roman"/>
-          <w:b w:val="0"/>
-          <w:i w:val="0"/>
-        </w:rPr>
-        <w:t xml:space="preserve"> iç dirençle </w:t>
+        <w:t xml:space="preserve"> satırlarında. Nedeni iki aletin devreye farklı iç direnç göstermesidir: </w:t>
       </w:r>
       <w:r>
         <w:rPr>
@@ -5697,11 +6992,11 @@
           <w:b w:val="0"/>
           <w:i w:val="0"/>
         </w:rPr>
-        <w:t xml:space="preserve"> 7,15 V; </w:t>
+        <w:t xml:space="preserve">’e göre alt dirence paralel giren direnç ne kadar küçükse düğüm gerilimi o kadar düşer. </w:t>
       </w:r>
       <m:oMath>
         <m:r>
-          <m:t>10</m:t>
+          <m:t>100</m:t>
         </m:r>
         <m:r>
           <m:t> </m:t>
@@ -5710,7 +7005,7 @@
           <m:rPr>
             <m:sty m:val="p"/>
           </m:rPr>
-          <m:t>M</m:t>
+          <m:t>k</m:t>
         </m:r>
         <m:r>
           <m:rPr>
@@ -5725,7 +7020,7 @@
           <w:b w:val="0"/>
           <w:i w:val="0"/>
         </w:rPr>
-        <w:t xml:space="preserve"> ile 7,46 V verir; okunan 7,30 V ikisinin arasındadır (okuma ekranda 0,1 V basamaklıdır ve DA sinyal üzerinde 0,2 V tepeden tepeye gürültü bulunmaktadır, bu yüzden bu uyum nicel bir ispat sayılmamalıdır). </w:t>
+        <w:t xml:space="preserve">’da yüksek iç dirençli alet (osiloskop, 7,4 V) beklenen değere yakın, daha düşük iç dirençli alet (multimetre, 6,5 V) ise belirgin biçimde düşük göstermiştir. </w:t>
       </w:r>
       <m:oMath>
         <m:r>
@@ -5753,7 +7048,35 @@
           <w:b w:val="0"/>
           <w:i w:val="0"/>
         </w:rPr>
-        <w:t xml:space="preserve"> satırında osiloskop ekranında DA değer yerine 49,998 Hz’lik, 21,4 V tepeden tepeye bir sinüs görülmüştür. Bu, şebekenin (50 Hz) yüksek empedanslı düğüme kapasitif olarak indüklediği parazit gerilimdir: kaynak direnci ne kadar büyükse aynı kaçak akım o kadar büyük gerilim doğurur. Aletin kendi ölçüm duyarlığı ise sorun değildir; sorun kaynak direncinin büyüklüğüdür. Multimetre ise bu gürültüyü ortalayarak (DA kademesinde yavaş örnekleme) tek bir sayı gösterir ve bu yüzden iki aletin bu satırdaki “farkı” gerçekte iki ayrı olgunun farkıdır: biri ortalama, diğeri anlık değer gösterir.</w:t>
+        <w:t xml:space="preserve"> satırında fark daha da büyüktür (multimetre 0,9 V; osiloskopta 7,5 V civarında beklenen DA değer yerine, en büyük değeri 9,40 V olan 50 Hz’lik bir sinüs). Osiloskoptaki sinüs, şebekenin (50 Hz) yüksek empedanslı düğüme kapasitif olarak indüklediği parazit gerilimdir: düğümün kaynak direnci (bu satırda yaklaşık </w:t>
+      </w:r>
+      <m:oMath>
+        <m:r>
+          <m:t>5</m:t>
+        </m:r>
+        <m:r>
+          <m:t> </m:t>
+        </m:r>
+        <m:r>
+          <m:rPr>
+            <m:sty m:val="p"/>
+          </m:rPr>
+          <m:t>M</m:t>
+        </m:r>
+        <m:r>
+          <m:rPr>
+            <m:sty m:val="p"/>
+          </m:rPr>
+          <m:t>Ω</m:t>
+        </m:r>
+      </m:oMath>
+      <w:r>
+        <w:rPr>
+          <w:rFonts w:ascii="Times New Roman" w:hAnsi="Times New Roman" w:cs="Times New Roman" w:eastAsia="Times New Roman"/>
+          <w:b w:val="0"/>
+          <w:i w:val="0"/>
+        </w:rPr>
+        <w:t>) büyük olduğunda aynı küçük kaçak akım büyük bir gerilim doğurur. Burada 9,40 V bir DA değeri değil, dalganın en büyük anlık değeridir (tepeden tepeye 21,4 V, en küçük −12,0 V), bu yüzden 7,5 V’la karşılaştırılamaz; osiloskop ekranında DA değeri ancak bu parazit süzülürse (örneğin bir kapasitörle veya AC kuplaj yerine DA kuplajda ortalama alınarak) okunabilir. Multimetre ise bu salınımı ortalar ve tek bir sayı gösterir; bu yüzden iki aletin bu satırdaki “farkı” gerçekte iki ayrı olgunun farkıdır.</w:t>
       </w:r>
     </w:p>
     <w:p>
@@ -5816,7 +7139,7 @@
               <m:t>i</m:t>
             </m:r>
             <m:r>
-              <m:t>ç</m:t>
+              <m:t>c</m:t>
             </m:r>
           </m:sub>
         </m:sSub>
@@ -5850,7 +7173,7 @@
               <m:t>i</m:t>
             </m:r>
             <m:r>
-              <m:t>ç</m:t>
+              <m:t>c</m:t>
             </m:r>
           </m:sub>
         </m:sSub>
@@ -5861,7 +7184,7 @@
           <w:b w:val="0"/>
           <w:i w:val="0"/>
         </w:rPr>
-        <w:t xml:space="preserve"> ile orantılıdır: </w:t>
+        <w:t xml:space="preserve"> oranına bağlıdır: </w:t>
       </w:r>
       <m:oMath>
         <m:sSub>
@@ -5875,7 +7198,7 @@
               <m:t>i</m:t>
             </m:r>
             <m:r>
-              <m:t>ç</m:t>
+              <m:t>c</m:t>
             </m:r>
           </m:sub>
         </m:sSub>
@@ -5895,74 +7218,9 @@
           <w:b w:val="0"/>
           <w:i w:val="0"/>
         </w:rPr>
-        <w:t xml:space="preserve"> ise hata ihmal edilebilir. Dört satırlık bir özet yeterlidir: multimetre (</w:t>
+        <w:t xml:space="preserve"> ise hata ihmal edilebilir; </w:t>
       </w:r>
       <m:oMath>
-        <m:r>
-          <m:t>10</m:t>
-        </m:r>
-        <m:r>
-          <m:t> </m:t>
-        </m:r>
-        <m:r>
-          <m:rPr>
-            <m:sty m:val="p"/>
-          </m:rPr>
-          <m:t>M</m:t>
-        </m:r>
-        <m:r>
-          <m:rPr>
-            <m:sty m:val="p"/>
-          </m:rPr>
-          <m:t>Ω</m:t>
-        </m:r>
-      </m:oMath>
-      <w:r>
-        <w:rPr>
-          <w:rFonts w:ascii="Times New Roman" w:hAnsi="Times New Roman" w:cs="Times New Roman" w:eastAsia="Times New Roman"/>
-          <w:b w:val="0"/>
-          <w:i w:val="0"/>
-        </w:rPr>
-        <w:t xml:space="preserve">) için </w:t>
-      </w:r>
-      <m:oMath>
-        <m:r>
-          <m:t>R</m:t>
-        </m:r>
-        <m:r>
-          <m:rPr>
-            <m:sty m:val="p"/>
-          </m:rPr>
-          <m:t>=</m:t>
-        </m:r>
-        <m:r>
-          <m:t>470</m:t>
-        </m:r>
-        <m:r>
-          <m:t> </m:t>
-        </m:r>
-        <m:r>
-          <m:t>Ω</m:t>
-        </m:r>
-      </m:oMath>
-      <w:r>
-        <w:rPr>
-          <w:rFonts w:ascii="Times New Roman" w:hAnsi="Times New Roman" w:cs="Times New Roman" w:eastAsia="Times New Roman"/>
-          <w:b w:val="0"/>
-          <w:i w:val="0"/>
-        </w:rPr>
-        <w:t xml:space="preserve">’da </w:t>
-      </w:r>
-      <m:oMath>
-        <m:r>
-          <m:t>R</m:t>
-        </m:r>
-        <m:r>
-          <m:rPr>
-            <m:sty m:val="p"/>
-          </m:rPr>
-          <m:t>/</m:t>
-        </m:r>
         <m:sSub>
           <m:e>
             <m:r>
@@ -5974,7 +7232,7 @@
               <m:t>i</m:t>
             </m:r>
             <m:r>
-              <m:t>ç</m:t>
+              <m:t>c</m:t>
             </m:r>
           </m:sub>
         </m:sSub>
@@ -5982,10 +7240,57 @@
           <m:rPr>
             <m:sty m:val="p"/>
           </m:rPr>
-          <m:t>=</m:t>
-        </m:r>
-        <m:r>
-          <m:t>4</m:t>
+          <m:t>≈</m:t>
+        </m:r>
+        <m:r>
+          <m:t>R</m:t>
+        </m:r>
+      </m:oMath>
+      <w:r>
+        <w:rPr>
+          <w:rFonts w:ascii="Times New Roman" w:hAnsi="Times New Roman" w:cs="Times New Roman" w:eastAsia="Times New Roman"/>
+          <w:b w:val="0"/>
+          <w:i w:val="0"/>
+        </w:rPr>
+        <w:t xml:space="preserve"> ise gerilim yaklaşık yarıya iner; </w:t>
+      </w:r>
+      <m:oMath>
+        <m:sSub>
+          <m:e>
+            <m:r>
+              <m:t>R</m:t>
+            </m:r>
+          </m:e>
+          <m:sub>
+            <m:r>
+              <m:t>i</m:t>
+            </m:r>
+            <m:r>
+              <m:t>c</m:t>
+            </m:r>
+          </m:sub>
+        </m:sSub>
+        <m:r>
+          <m:rPr>
+            <m:sty m:val="p"/>
+          </m:rPr>
+          <m:t>≪</m:t>
+        </m:r>
+        <m:r>
+          <m:t>R</m:t>
+        </m:r>
+      </m:oMath>
+      <w:r>
+        <w:rPr>
+          <w:rFonts w:ascii="Times New Roman" w:hAnsi="Times New Roman" w:cs="Times New Roman" w:eastAsia="Times New Roman"/>
+          <w:b w:val="0"/>
+          <w:i w:val="0"/>
+        </w:rPr>
+        <w:t xml:space="preserve"> ise okuma sıfıra yaklaşır. Ölçümlerimiz bunu açıkça göstermektedir: multimetrenin görünen iç direnci yaklaşık </w:t>
+      </w:r>
+      <m:oMath>
+        <m:r>
+          <m:t>0</m:t>
         </m:r>
         <m:r>
           <m:rPr>
@@ -5994,13 +7299,103 @@
           <m:t>,</m:t>
         </m:r>
         <m:r>
-          <m:t>7</m:t>
+          <m:t>3</m:t>
+        </m:r>
+      </m:oMath>
+      <w:r>
+        <w:rPr>
+          <w:rFonts w:ascii="Times New Roman" w:hAnsi="Times New Roman" w:cs="Times New Roman" w:eastAsia="Times New Roman"/>
+          <w:b w:val="0"/>
+          <w:i w:val="0"/>
+        </w:rPr>
+        <w:t>–</w:t>
+      </w:r>
+      <m:oMath>
+        <m:r>
+          <m:t>0</m:t>
         </m:r>
         <m:r>
           <m:rPr>
             <m:sty m:val="p"/>
           </m:rPr>
-          <m:t>×</m:t>
+          <m:t>,</m:t>
+        </m:r>
+        <m:r>
+          <m:t>7</m:t>
+        </m:r>
+        <m:r>
+          <m:t> </m:t>
+        </m:r>
+        <m:r>
+          <m:rPr>
+            <m:sty m:val="p"/>
+          </m:rPr>
+          <m:t>M</m:t>
+        </m:r>
+        <m:r>
+          <m:rPr>
+            <m:sty m:val="p"/>
+          </m:rPr>
+          <m:t>Ω</m:t>
+        </m:r>
+      </m:oMath>
+      <w:r>
+        <w:rPr>
+          <w:rFonts w:ascii="Times New Roman" w:hAnsi="Times New Roman" w:cs="Times New Roman" w:eastAsia="Times New Roman"/>
+          <w:b w:val="0"/>
+          <w:i w:val="0"/>
+        </w:rPr>
+        <w:t xml:space="preserve"> olduğundan </w:t>
+      </w:r>
+      <m:oMath>
+        <m:r>
+          <m:t>470</m:t>
+        </m:r>
+        <m:r>
+          <m:t> </m:t>
+        </m:r>
+        <m:r>
+          <m:t>Ω</m:t>
+        </m:r>
+      </m:oMath>
+      <w:r>
+        <w:rPr>
+          <w:rFonts w:ascii="Times New Roman" w:hAnsi="Times New Roman" w:cs="Times New Roman" w:eastAsia="Times New Roman"/>
+          <w:b w:val="0"/>
+          <w:i w:val="0"/>
+        </w:rPr>
+        <w:t>’da (</w:t>
+      </w:r>
+      <m:oMath>
+        <m:r>
+          <m:t>R</m:t>
+        </m:r>
+        <m:r>
+          <m:rPr>
+            <m:sty m:val="p"/>
+          </m:rPr>
+          <m:t>/</m:t>
+        </m:r>
+        <m:sSub>
+          <m:e>
+            <m:r>
+              <m:t>R</m:t>
+            </m:r>
+          </m:e>
+          <m:sub>
+            <m:r>
+              <m:t>i</m:t>
+            </m:r>
+            <m:r>
+              <m:t>c</m:t>
+            </m:r>
+          </m:sub>
+        </m:sSub>
+        <m:r>
+          <m:rPr>
+            <m:sty m:val="p"/>
+          </m:rPr>
+          <m:t>∼</m:t>
         </m:r>
         <m:sSup>
           <m:e>
@@ -6016,7 +7411,7 @@
               <m:t>−</m:t>
             </m:r>
             <m:r>
-              <m:t>5</m:t>
+              <m:t>3</m:t>
             </m:r>
           </m:sup>
         </m:sSup>
@@ -6027,18 +7422,9 @@
           <w:b w:val="0"/>
           <w:i w:val="0"/>
         </w:rPr>
-        <w:t xml:space="preserve"> (hata yok), </w:t>
+        <w:t xml:space="preserve">) etki yoktur, </w:t>
       </w:r>
       <m:oMath>
-        <m:r>
-          <m:t>R</m:t>
-        </m:r>
-        <m:r>
-          <m:rPr>
-            <m:sty m:val="p"/>
-          </m:rPr>
-          <m:t>=</m:t>
-        </m:r>
         <m:r>
           <m:t>100</m:t>
         </m:r>
@@ -6064,27 +7450,51 @@
           <w:b w:val="0"/>
           <w:i w:val="0"/>
         </w:rPr>
-        <w:t xml:space="preserve">’da </w:t>
+        <w:t>’da (</w:t>
       </w:r>
       <m:oMath>
-        <m:sSup>
+        <m:r>
+          <m:t>R</m:t>
+        </m:r>
+        <m:r>
+          <m:rPr>
+            <m:sty m:val="p"/>
+          </m:rPr>
+          <m:t>/</m:t>
+        </m:r>
+        <m:sSub>
           <m:e>
             <m:r>
-              <m:t>10</m:t>
+              <m:t>R</m:t>
             </m:r>
           </m:e>
-          <m:sup>
+          <m:sub>
             <m:r>
-              <m:rPr>
-                <m:sty m:val="p"/>
-              </m:rPr>
-              <m:t>−</m:t>
+              <m:t>i</m:t>
             </m:r>
             <m:r>
-              <m:t>2</m:t>
+              <m:t>c</m:t>
             </m:r>
-          </m:sup>
-        </m:sSup>
+          </m:sub>
+        </m:sSub>
+        <m:r>
+          <m:rPr>
+            <m:sty m:val="p"/>
+          </m:rPr>
+          <m:t>≈</m:t>
+        </m:r>
+        <m:r>
+          <m:t>0</m:t>
+        </m:r>
+        <m:r>
+          <m:rPr>
+            <m:sty m:val="p"/>
+          </m:rPr>
+          <m:t>,</m:t>
+        </m:r>
+        <m:r>
+          <m:t>3</m:t>
+        </m:r>
       </m:oMath>
       <w:r>
         <w:rPr>
@@ -6092,18 +7502,9 @@
           <w:b w:val="0"/>
           <w:i w:val="0"/>
         </w:rPr>
-        <w:t xml:space="preserve"> (yaklaşık %0,5 çıkış hatası), </w:t>
+        <w:t xml:space="preserve">) okuma 7,5 V yerine 6,5 V’a, </w:t>
       </w:r>
       <m:oMath>
-        <m:r>
-          <m:t>R</m:t>
-        </m:r>
-        <m:r>
-          <m:rPr>
-            <m:sty m:val="p"/>
-          </m:rPr>
-          <m:t>=</m:t>
-        </m:r>
         <m:r>
           <m:t>10</m:t>
         </m:r>
@@ -6129,11 +7530,41 @@
           <w:b w:val="0"/>
           <w:i w:val="0"/>
         </w:rPr>
-        <w:t xml:space="preserve">’da </w:t>
+        <w:t>’da (</w:t>
       </w:r>
       <m:oMath>
         <m:r>
-          <m:t>1</m:t>
+          <m:t>R</m:t>
+        </m:r>
+        <m:r>
+          <m:rPr>
+            <m:sty m:val="p"/>
+          </m:rPr>
+          <m:t>/</m:t>
+        </m:r>
+        <m:sSub>
+          <m:e>
+            <m:r>
+              <m:t>R</m:t>
+            </m:r>
+          </m:e>
+          <m:sub>
+            <m:r>
+              <m:t>i</m:t>
+            </m:r>
+            <m:r>
+              <m:t>c</m:t>
+            </m:r>
+          </m:sub>
+        </m:sSub>
+        <m:r>
+          <m:rPr>
+            <m:sty m:val="p"/>
+          </m:rPr>
+          <m:t>≈</m:t>
+        </m:r>
+        <m:r>
+          <m:t>15</m:t>
         </m:r>
       </m:oMath>
       <w:r>
@@ -6142,116 +7573,7 @@
           <w:b w:val="0"/>
           <w:i w:val="0"/>
         </w:rPr>
-        <w:t xml:space="preserve"> (çıkış yaklaşık %33 düşer). Osiloskop (</w:t>
-      </w:r>
-      <m:oMath>
-        <m:r>
-          <m:t>1</m:t>
-        </m:r>
-        <m:r>
-          <m:t> </m:t>
-        </m:r>
-        <m:r>
-          <m:rPr>
-            <m:sty m:val="p"/>
-          </m:rPr>
-          <m:t>M</m:t>
-        </m:r>
-        <m:r>
-          <m:rPr>
-            <m:sty m:val="p"/>
-          </m:rPr>
-          <m:t>Ω</m:t>
-        </m:r>
-      </m:oMath>
-      <w:r>
-        <w:rPr>
-          <w:rFonts w:ascii="Times New Roman" w:hAnsi="Times New Roman" w:cs="Times New Roman" w:eastAsia="Times New Roman"/>
-          <w:b w:val="0"/>
-          <w:i w:val="0"/>
-        </w:rPr>
-        <w:t xml:space="preserve">) için bu oranlar sırasıyla </w:t>
-      </w:r>
-      <m:oMath>
-        <m:r>
-          <m:t>4</m:t>
-        </m:r>
-        <m:r>
-          <m:rPr>
-            <m:sty m:val="p"/>
-          </m:rPr>
-          <m:t>,</m:t>
-        </m:r>
-        <m:r>
-          <m:t>7</m:t>
-        </m:r>
-        <m:r>
-          <m:rPr>
-            <m:sty m:val="p"/>
-          </m:rPr>
-          <m:t>×</m:t>
-        </m:r>
-        <m:sSup>
-          <m:e>
-            <m:r>
-              <m:t>10</m:t>
-            </m:r>
-          </m:e>
-          <m:sup>
-            <m:r>
-              <m:rPr>
-                <m:sty m:val="p"/>
-              </m:rPr>
-              <m:t>−</m:t>
-            </m:r>
-            <m:r>
-              <m:t>4</m:t>
-            </m:r>
-          </m:sup>
-        </m:sSup>
-      </m:oMath>
-      <w:r>
-        <w:rPr>
-          <w:rFonts w:ascii="Times New Roman" w:hAnsi="Times New Roman" w:cs="Times New Roman" w:eastAsia="Times New Roman"/>
-          <w:b w:val="0"/>
-          <w:i w:val="0"/>
-        </w:rPr>
-        <w:t xml:space="preserve">, </w:t>
-      </w:r>
-      <m:oMath>
-        <m:r>
-          <m:t>0</m:t>
-        </m:r>
-        <m:r>
-          <m:rPr>
-            <m:sty m:val="p"/>
-          </m:rPr>
-          <m:t>,</m:t>
-        </m:r>
-        <m:r>
-          <m:t>1</m:t>
-        </m:r>
-      </m:oMath>
-      <w:r>
-        <w:rPr>
-          <w:rFonts w:ascii="Times New Roman" w:hAnsi="Times New Roman" w:cs="Times New Roman" w:eastAsia="Times New Roman"/>
-          <w:b w:val="0"/>
-          <w:i w:val="0"/>
-        </w:rPr>
-        <w:t xml:space="preserve"> ve </w:t>
-      </w:r>
-      <m:oMath>
-        <m:r>
-          <m:t>10</m:t>
-        </m:r>
-      </m:oMath>
-      <w:r>
-        <w:rPr>
-          <w:rFonts w:ascii="Times New Roman" w:hAnsi="Times New Roman" w:cs="Times New Roman" w:eastAsia="Times New Roman"/>
-          <w:b w:val="0"/>
-          <w:i w:val="0"/>
-        </w:rPr>
-        <w:t>’dur. Kural şudur: ölçü aleti, ölçülen düğümün Thevenin direncinin en az 100 katı kadar iç dirence sahip olmalıdır. Bunun sağlanamadığı durumda ya kuramsal yüklü değer (</w:t>
+        <w:t>) 0,9 V’a inmiştir. Kural şudur: ölçü aleti, ölçülen düğümün Thevenin direncinin en az 100 katı kadar iç dirence sahip olmalıdır. Bu sağlanamadığında ya kuramsal yüklü değer (</w:t>
       </w:r>
       <w:r>
         <w:rPr>
@@ -6267,7 +7589,7 @@
           <w:b w:val="0"/>
           <w:i w:val="0"/>
         </w:rPr>
-        <w:t>) hesaplanmalı ya da yüksek empedanslı (10 MΩ ve üzeri) bir giriş kullanılmalıdır.</w:t>
+        <w:t>) hesaplanmalı, ya daha yüksek iç dirençli bir alet (veya 10× osiloskop ucu) kullanılmalı, ya da ölçülen düğümün direnci küçültülmelidir.</w:t>
       </w:r>
     </w:p>
     <w:p>
@@ -7346,7 +8668,7 @@
                 <w:rFonts w:ascii="Times New Roman" w:hAnsi="Times New Roman" w:cs="Times New Roman" w:eastAsia="Times New Roman"/>
                 <w:sz w:val="24"/>
               </w:rPr>
-              <w:t>(2.6)</w:t>
+              <w:t>(2.7)</w:t>
             </w:r>
           </w:p>
         </w:tc>
@@ -7656,7 +8978,7 @@
                 <w:rFonts w:ascii="Times New Roman" w:hAnsi="Times New Roman" w:cs="Times New Roman" w:eastAsia="Times New Roman"/>
                 <w:sz w:val="24"/>
               </w:rPr>
-              <w:t>(2.7)</w:t>
+              <w:t>(2.8)</w:t>
             </w:r>
           </w:p>
         </w:tc>
@@ -8030,7 +9352,7 @@
           <w:b w:val="0"/>
           <w:i w:val="0"/>
         </w:rPr>
-        <w:t xml:space="preserve">, </w:t>
+        <w:t xml:space="preserve"> ve </w:t>
       </w:r>
       <m:oMath>
         <m:sSub>
@@ -8067,7 +9389,334 @@
           <w:b w:val="0"/>
           <w:i w:val="0"/>
         </w:rPr>
-        <w:t xml:space="preserve"> yazılıdır; hesap bu atamayla yapılmıştır. İki ölçüm fotoğrafı bu iki sayıyı ters sırayla (456, sonra 464) gösterdiğinden, hangi direncin hangisi olduğu fotoğraflardan ayrıca doğrulanamamıştır; ters atamanın etkisi aşağıda verilmiştir.</w:t>
+        <w:t xml:space="preserve"> yazılıdır; hesap bu değerlerle yapılmıştır. </w:t>
+      </w:r>
+      <m:oMath>
+        <m:sSub>
+          <m:e>
+            <m:r>
+              <m:t>R</m:t>
+            </m:r>
+          </m:e>
+          <m:sub>
+            <m:r>
+              <m:t>3</m:t>
+            </m:r>
+          </m:sub>
+        </m:sSub>
+      </m:oMath>
+      <w:r>
+        <w:rPr>
+          <w:rFonts w:ascii="Times New Roman" w:hAnsi="Times New Roman" w:cs="Times New Roman" w:eastAsia="Times New Roman"/>
+          <w:b w:val="0"/>
+          <w:i w:val="0"/>
+        </w:rPr>
+        <w:t xml:space="preserve"> potansiyometredir; </w:t>
+      </w:r>
+      <m:oMath>
+        <m:sSub>
+          <m:e>
+            <m:r>
+              <m:t>V</m:t>
+            </m:r>
+          </m:e>
+          <m:sub>
+            <m:r>
+              <m:t>B</m:t>
+            </m:r>
+          </m:sub>
+        </m:sSub>
+        <m:r>
+          <m:rPr>
+            <m:sty m:val="p"/>
+          </m:rPr>
+          <m:t>=</m:t>
+        </m:r>
+        <m:r>
+          <m:t>0</m:t>
+        </m:r>
+      </m:oMath>
+      <w:r>
+        <w:rPr>
+          <w:rFonts w:ascii="Times New Roman" w:hAnsi="Times New Roman" w:cs="Times New Roman" w:eastAsia="Times New Roman"/>
+          <w:b w:val="0"/>
+          <w:i w:val="0"/>
+        </w:rPr>
+        <w:t xml:space="preserve"> olunca devreden çıkarılıp multimetreyle ölçülmüş ve </w:t>
+      </w:r>
+      <m:oMath>
+        <m:r>
+          <m:t>3</m:t>
+        </m:r>
+        <m:r>
+          <m:rPr>
+            <m:sty m:val="p"/>
+          </m:rPr>
+          <m:t>,</m:t>
+        </m:r>
+        <m:r>
+          <m:t>22</m:t>
+        </m:r>
+        <m:r>
+          <m:t> </m:t>
+        </m:r>
+        <m:r>
+          <m:rPr>
+            <m:sty m:val="p"/>
+          </m:rPr>
+          <m:t>k</m:t>
+        </m:r>
+        <m:r>
+          <m:rPr>
+            <m:sty m:val="p"/>
+          </m:rPr>
+          <m:t>Ω</m:t>
+        </m:r>
+      </m:oMath>
+      <w:r>
+        <w:rPr>
+          <w:rFonts w:ascii="Times New Roman" w:hAnsi="Times New Roman" w:cs="Times New Roman" w:eastAsia="Times New Roman"/>
+          <w:b w:val="0"/>
+          <w:i w:val="0"/>
+        </w:rPr>
+        <w:t xml:space="preserve"> bulunmuştur. </w:t>
+      </w:r>
+      <m:oMath>
+        <m:sSub>
+          <m:e>
+            <m:r>
+              <m:t>R</m:t>
+            </m:r>
+          </m:e>
+          <m:sub>
+            <m:r>
+              <m:t>x</m:t>
+            </m:r>
+          </m:sub>
+        </m:sSub>
+      </m:oMath>
+      <w:r>
+        <w:rPr>
+          <w:rFonts w:ascii="Times New Roman" w:hAnsi="Times New Roman" w:cs="Times New Roman" w:eastAsia="Times New Roman"/>
+          <w:b w:val="0"/>
+          <w:i w:val="0"/>
+        </w:rPr>
+        <w:t xml:space="preserve"> ise tek başına multimetreyle ölçülmüş ve </w:t>
+      </w:r>
+      <m:oMath>
+        <m:r>
+          <m:t>3</m:t>
+        </m:r>
+        <m:r>
+          <m:rPr>
+            <m:sty m:val="p"/>
+          </m:rPr>
+          <m:t>,</m:t>
+        </m:r>
+        <m:r>
+          <m:t>26</m:t>
+        </m:r>
+        <m:r>
+          <m:t> </m:t>
+        </m:r>
+        <m:r>
+          <m:rPr>
+            <m:sty m:val="p"/>
+          </m:rPr>
+          <m:t>k</m:t>
+        </m:r>
+        <m:r>
+          <m:rPr>
+            <m:sty m:val="p"/>
+          </m:rPr>
+          <m:t>Ω</m:t>
+        </m:r>
+      </m:oMath>
+      <w:r>
+        <w:rPr>
+          <w:rFonts w:ascii="Times New Roman" w:hAnsi="Times New Roman" w:cs="Times New Roman" w:eastAsia="Times New Roman"/>
+          <w:b w:val="0"/>
+          <w:i w:val="0"/>
+        </w:rPr>
+        <w:t xml:space="preserve"> bulunmuştur. Üzerindeki renk kodu </w:t>
+      </w:r>
+      <m:oMath>
+        <m:r>
+          <m:t>3</m:t>
+        </m:r>
+        <m:r>
+          <m:rPr>
+            <m:sty m:val="p"/>
+          </m:rPr>
+          <m:t>,</m:t>
+        </m:r>
+        <m:r>
+          <m:t>3</m:t>
+        </m:r>
+        <m:r>
+          <m:t> </m:t>
+        </m:r>
+        <m:r>
+          <m:rPr>
+            <m:sty m:val="p"/>
+          </m:rPr>
+          <m:t>k</m:t>
+        </m:r>
+        <m:r>
+          <m:rPr>
+            <m:sty m:val="p"/>
+          </m:rPr>
+          <m:t>Ω</m:t>
+        </m:r>
+      </m:oMath>
+      <w:r>
+        <w:rPr>
+          <w:rFonts w:ascii="Times New Roman" w:hAnsi="Times New Roman" w:cs="Times New Roman" w:eastAsia="Times New Roman"/>
+          <w:b w:val="0"/>
+          <w:i w:val="0"/>
+        </w:rPr>
+        <w:t xml:space="preserve">’dur. Föyde </w:t>
+      </w:r>
+      <m:oMath>
+        <m:sSub>
+          <m:e>
+            <m:r>
+              <m:t>R</m:t>
+            </m:r>
+          </m:e>
+          <m:sub>
+            <m:r>
+              <m:t>x</m:t>
+            </m:r>
+          </m:sub>
+        </m:sSub>
+      </m:oMath>
+      <w:r>
+        <w:rPr>
+          <w:rFonts w:ascii="Times New Roman" w:hAnsi="Times New Roman" w:cs="Times New Roman" w:eastAsia="Times New Roman"/>
+          <w:b w:val="0"/>
+          <w:i w:val="0"/>
+        </w:rPr>
+        <w:t xml:space="preserve"> ve </w:t>
+      </w:r>
+      <m:oMath>
+        <m:sSub>
+          <m:e>
+            <m:r>
+              <m:t>R</m:t>
+            </m:r>
+          </m:e>
+          <m:sub>
+            <m:r>
+              <m:t>3</m:t>
+            </m:r>
+          </m:sub>
+        </m:sSub>
+      </m:oMath>
+      <w:r>
+        <w:rPr>
+          <w:rFonts w:ascii="Times New Roman" w:hAnsi="Times New Roman" w:cs="Times New Roman" w:eastAsia="Times New Roman"/>
+          <w:b w:val="0"/>
+          <w:i w:val="0"/>
+        </w:rPr>
+        <w:t xml:space="preserve">’ün tanımı arasında bir tutarsızlık vardır (föydeki Tablo 4’ün Wheatstone satırına el ile </w:t>
+      </w:r>
+      <m:oMath>
+        <m:sSub>
+          <m:e>
+            <m:r>
+              <m:t>R</m:t>
+            </m:r>
+          </m:e>
+          <m:sub>
+            <m:r>
+              <m:t>3</m:t>
+            </m:r>
+          </m:sub>
+        </m:sSub>
+      </m:oMath>
+      <w:r>
+        <w:rPr>
+          <w:rFonts w:ascii="Times New Roman" w:hAnsi="Times New Roman" w:cs="Times New Roman" w:eastAsia="Times New Roman"/>
+          <w:b w:val="0"/>
+          <w:i w:val="0"/>
+        </w:rPr>
+        <w:t xml:space="preserve">’ün kendisi, </w:t>
+      </w:r>
+      <m:oMath>
+        <m:r>
+          <m:t>3</m:t>
+        </m:r>
+        <m:r>
+          <m:rPr>
+            <m:sty m:val="p"/>
+          </m:rPr>
+          <m:t>,</m:t>
+        </m:r>
+        <m:r>
+          <m:t>22</m:t>
+        </m:r>
+        <m:r>
+          <m:t> </m:t>
+        </m:r>
+        <m:r>
+          <m:rPr>
+            <m:sty m:val="p"/>
+          </m:rPr>
+          <m:t>k</m:t>
+        </m:r>
+        <m:r>
+          <m:rPr>
+            <m:sty m:val="p"/>
+          </m:rPr>
+          <m:t>Ω</m:t>
+        </m:r>
+      </m:oMath>
+      <w:r>
+        <w:rPr>
+          <w:rFonts w:ascii="Times New Roman" w:hAnsi="Times New Roman" w:cs="Times New Roman" w:eastAsia="Times New Roman"/>
+          <w:b w:val="0"/>
+          <w:i w:val="0"/>
+        </w:rPr>
+        <w:t xml:space="preserve"> yazılmıştır); bu raporda Wheatstone ölçümü olarak </w:t>
+      </w:r>
+      <w:r>
+        <w:rPr>
+          <w:rFonts w:ascii="Times New Roman" w:hAnsi="Times New Roman" w:cs="Times New Roman" w:eastAsia="Times New Roman"/>
+          <w:b w:val="0"/>
+          <w:i w:val="0"/>
+        </w:rPr>
+        <w:t>(2.7)</w:t>
+      </w:r>
+      <w:r>
+        <w:rPr>
+          <w:rFonts w:ascii="Times New Roman" w:hAnsi="Times New Roman" w:cs="Times New Roman" w:eastAsia="Times New Roman"/>
+          <w:b w:val="0"/>
+          <w:i w:val="0"/>
+        </w:rPr>
+        <w:t xml:space="preserve"> ile hesaplanan </w:t>
+      </w:r>
+      <m:oMath>
+        <m:sSub>
+          <m:e>
+            <m:r>
+              <m:t>R</m:t>
+            </m:r>
+          </m:e>
+          <m:sub>
+            <m:r>
+              <m:t>x</m:t>
+            </m:r>
+          </m:sub>
+        </m:sSub>
+      </m:oMath>
+      <w:r>
+        <w:rPr>
+          <w:rFonts w:ascii="Times New Roman" w:hAnsi="Times New Roman" w:cs="Times New Roman" w:eastAsia="Times New Roman"/>
+          <w:b w:val="0"/>
+          <w:i w:val="0"/>
+        </w:rPr>
+        <w:t xml:space="preserve"> kullanılmıştır.</w:t>
       </w:r>
     </w:p>
     <w:p>
@@ -8624,7 +10273,7 @@
           <w:b w:val="0"/>
           <w:i w:val="0"/>
         </w:rPr>
-        <w:t xml:space="preserve"> Hayır: köprü yöntemiyle 3.164 Ω, multimetreyle 3260 Ω bulunmuştur; fark -2,93 %’dir. Bu fark, köprü ölçümünün belirsizliğinden büyüktür: </w:t>
+        <w:t xml:space="preserve"> Köprü yöntemiyle 3.164 Ω, multimetreyle 3260 Ω bulunmuştur; fark -2,93 %’dir. Fark küçüktür ama köprünün belirsizliğinden büyüktür: </w:t>
       </w:r>
       <m:oMath>
         <m:sSub>
@@ -8734,7 +10383,7 @@
           <w:b w:val="0"/>
           <w:i w:val="0"/>
         </w:rPr>
-        <w:t xml:space="preserve"> okumalarının son basamakları toplam %0,5 mertebesinde bir belirsizlik ekler. Kalan farkın olası nedenleri şunlardır: (a) devre tahtasındaki kontak ve jumper dirençleri (</w:t>
+        <w:t xml:space="preserve"> okumalarının son basamakları toplam %0,5 mertebesinde belirsizlik ekler. Kalan farkın olası nedenleri: (a) devre tahtasındaki kontak ve jumper dirençleri (</w:t>
       </w:r>
       <m:oMath>
         <m:sSub>
@@ -8800,321 +10449,7 @@
           <w:b w:val="0"/>
           <w:i w:val="0"/>
         </w:rPr>
-        <w:t xml:space="preserve">’nin hangisinin hangisi olduğunun doğrulanamaması. (c) maddesi önemlidir: </w:t>
-      </w:r>
-      <m:oMath>
-        <m:sSub>
-          <m:e>
-            <m:r>
-              <m:t>R</m:t>
-            </m:r>
-          </m:e>
-          <m:sub>
-            <m:r>
-              <m:t>1</m:t>
-            </m:r>
-          </m:sub>
-        </m:sSub>
-        <m:r>
-          <m:rPr>
-            <m:sty m:val="p"/>
-          </m:rPr>
-          <m:t>=</m:t>
-        </m:r>
-        <m:r>
-          <m:t>456</m:t>
-        </m:r>
-        <m:r>
-          <m:t> </m:t>
-        </m:r>
-        <m:r>
-          <m:t>Ω</m:t>
-        </m:r>
-      </m:oMath>
-      <w:r>
-        <w:rPr>
-          <w:rFonts w:ascii="Times New Roman" w:hAnsi="Times New Roman" w:cs="Times New Roman" w:eastAsia="Times New Roman"/>
-          <w:b w:val="0"/>
-          <w:i w:val="0"/>
-        </w:rPr>
-        <w:t xml:space="preserve"> ve </w:t>
-      </w:r>
-      <m:oMath>
-        <m:sSub>
-          <m:e>
-            <m:r>
-              <m:t>R</m:t>
-            </m:r>
-          </m:e>
-          <m:sub>
-            <m:r>
-              <m:t>2</m:t>
-            </m:r>
-          </m:sub>
-        </m:sSub>
-        <m:r>
-          <m:rPr>
-            <m:sty m:val="p"/>
-          </m:rPr>
-          <m:t>=</m:t>
-        </m:r>
-        <m:r>
-          <m:t>464</m:t>
-        </m:r>
-        <m:r>
-          <m:t> </m:t>
-        </m:r>
-        <m:r>
-          <m:t>Ω</m:t>
-        </m:r>
-      </m:oMath>
-      <w:r>
-        <w:rPr>
-          <w:rFonts w:ascii="Times New Roman" w:hAnsi="Times New Roman" w:cs="Times New Roman" w:eastAsia="Times New Roman"/>
-          <w:b w:val="0"/>
-          <w:i w:val="0"/>
-        </w:rPr>
-        <w:t xml:space="preserve"> alınırsa </w:t>
-      </w:r>
-      <m:oMath>
-        <m:sSub>
-          <m:e>
-            <m:r>
-              <m:t>R</m:t>
-            </m:r>
-          </m:e>
-          <m:sub>
-            <m:r>
-              <m:t>x</m:t>
-            </m:r>
-          </m:sub>
-        </m:sSub>
-        <m:r>
-          <m:rPr>
-            <m:sty m:val="p"/>
-          </m:rPr>
-          <m:t>=</m:t>
-        </m:r>
-        <m:r>
-          <m:t>464</m:t>
-        </m:r>
-        <m:r>
-          <m:rPr>
-            <m:sty m:val="p"/>
-          </m:rPr>
-          <m:t>⋅</m:t>
-        </m:r>
-        <m:r>
-          <m:t>3220</m:t>
-        </m:r>
-        <m:r>
-          <m:rPr>
-            <m:sty m:val="p"/>
-          </m:rPr>
-          <m:t>/</m:t>
-        </m:r>
-        <m:r>
-          <m:t>456</m:t>
-        </m:r>
-        <m:r>
-          <m:rPr>
-            <m:sty m:val="p"/>
-          </m:rPr>
-          <m:t>=</m:t>
-        </m:r>
-        <m:r>
-          <m:t>3.276</m:t>
-        </m:r>
-        <m:r>
-          <m:t> </m:t>
-        </m:r>
-        <m:r>
-          <m:t>Ω</m:t>
-        </m:r>
-      </m:oMath>
-      <w:r>
-        <w:rPr>
-          <w:rFonts w:ascii="Times New Roman" w:hAnsi="Times New Roman" w:cs="Times New Roman" w:eastAsia="Times New Roman"/>
-          <w:b w:val="0"/>
-          <w:i w:val="0"/>
-        </w:rPr>
-        <w:t xml:space="preserve"> bulunur ve bu değer multimetreden yalnızca 0,51 % uzaktadır. Hangi atamanın doğru olduğu devre tahtasına bakılarak kesinleştirilmelidir. Föyün Tablo 4’ünde Wheatstone satırına el ile 3,22 kΩ yazılmıştır; bu sayı </w:t>
-      </w:r>
-      <m:oMath>
-        <m:sSub>
-          <m:e>
-            <m:r>
-              <m:t>R</m:t>
-            </m:r>
-          </m:e>
-          <m:sub>
-            <m:r>
-              <m:t>3</m:t>
-            </m:r>
-          </m:sub>
-        </m:sSub>
-      </m:oMath>
-      <w:r>
-        <w:rPr>
-          <w:rFonts w:ascii="Times New Roman" w:hAnsi="Times New Roman" w:cs="Times New Roman" w:eastAsia="Times New Roman"/>
-          <w:b w:val="0"/>
-          <w:i w:val="0"/>
-        </w:rPr>
-        <w:t xml:space="preserve">’ün kendisidir, </w:t>
-      </w:r>
-      <m:oMath>
-        <m:sSub>
-          <m:e>
-            <m:r>
-              <m:t>R</m:t>
-            </m:r>
-          </m:e>
-          <m:sub>
-            <m:r>
-              <m:t>x</m:t>
-            </m:r>
-          </m:sub>
-        </m:sSub>
-      </m:oMath>
-      <w:r>
-        <w:rPr>
-          <w:rFonts w:ascii="Times New Roman" w:hAnsi="Times New Roman" w:cs="Times New Roman" w:eastAsia="Times New Roman"/>
-          <w:b w:val="0"/>
-          <w:i w:val="0"/>
-        </w:rPr>
-        <w:t xml:space="preserve"> değildir (</w:t>
-      </w:r>
-      <m:oMath>
-        <m:sSub>
-          <m:e>
-            <m:r>
-              <m:t>R</m:t>
-            </m:r>
-          </m:e>
-          <m:sub>
-            <m:r>
-              <m:t>x</m:t>
-            </m:r>
-          </m:sub>
-        </m:sSub>
-        <m:r>
-          <m:rPr>
-            <m:sty m:val="p"/>
-          </m:rPr>
-          <m:t>=</m:t>
-        </m:r>
-        <m:sSub>
-          <m:e>
-            <m:r>
-              <m:t>R</m:t>
-            </m:r>
-          </m:e>
-          <m:sub>
-            <m:r>
-              <m:t>2</m:t>
-            </m:r>
-          </m:sub>
-        </m:sSub>
-        <m:sSub>
-          <m:e>
-            <m:r>
-              <m:t>R</m:t>
-            </m:r>
-          </m:e>
-          <m:sub>
-            <m:r>
-              <m:t>3</m:t>
-            </m:r>
-          </m:sub>
-        </m:sSub>
-        <m:r>
-          <m:rPr>
-            <m:sty m:val="p"/>
-          </m:rPr>
-          <m:t>/</m:t>
-        </m:r>
-        <m:sSub>
-          <m:e>
-            <m:r>
-              <m:t>R</m:t>
-            </m:r>
-          </m:e>
-          <m:sub>
-            <m:r>
-              <m:t>1</m:t>
-            </m:r>
-          </m:sub>
-        </m:sSub>
-      </m:oMath>
-      <w:r>
-        <w:rPr>
-          <w:rFonts w:ascii="Times New Roman" w:hAnsi="Times New Roman" w:cs="Times New Roman" w:eastAsia="Times New Roman"/>
-          <w:b w:val="0"/>
-          <w:i w:val="0"/>
-        </w:rPr>
-        <w:t xml:space="preserve"> olduğundan </w:t>
-      </w:r>
-      <m:oMath>
-        <m:sSub>
-          <m:e>
-            <m:r>
-              <m:t>R</m:t>
-            </m:r>
-          </m:e>
-          <m:sub>
-            <m:r>
-              <m:t>1</m:t>
-            </m:r>
-          </m:sub>
-        </m:sSub>
-        <m:r>
-          <m:rPr>
-            <m:sty m:val="p"/>
-          </m:rPr>
-          <m:t>≈</m:t>
-        </m:r>
-        <m:sSub>
-          <m:e>
-            <m:r>
-              <m:t>R</m:t>
-            </m:r>
-          </m:e>
-          <m:sub>
-            <m:r>
-              <m:t>2</m:t>
-            </m:r>
-          </m:sub>
-        </m:sSub>
-      </m:oMath>
-      <w:r>
-        <w:rPr>
-          <w:rFonts w:ascii="Times New Roman" w:hAnsi="Times New Roman" w:cs="Times New Roman" w:eastAsia="Times New Roman"/>
-          <w:b w:val="0"/>
-          <w:i w:val="0"/>
-        </w:rPr>
-        <w:t xml:space="preserve"> ise yaklaşık </w:t>
-      </w:r>
-      <m:oMath>
-        <m:sSub>
-          <m:e>
-            <m:r>
-              <m:t>R</m:t>
-            </m:r>
-          </m:e>
-          <m:sub>
-            <m:r>
-              <m:t>3</m:t>
-            </m:r>
-          </m:sub>
-        </m:sSub>
-      </m:oMath>
-      <w:r>
-        <w:rPr>
-          <w:rFonts w:ascii="Times New Roman" w:hAnsi="Times New Roman" w:cs="Times New Roman" w:eastAsia="Times New Roman"/>
-          <w:b w:val="0"/>
-          <w:i w:val="0"/>
-        </w:rPr>
-        <w:t xml:space="preserve"> çıkar, ama eşit değildir); bu raporda formülden hesaplanan değer kullanılmıştır.</w:t>
+        <w:t xml:space="preserve"> değerlerinin, devre içinde ve devre dışında ölçüldüğünde farklı okunabilmesi. Köprünün kendi gücü ise sonucun kaynak geriliminden bağımsız olmasıdır.</w:t>
       </w:r>
     </w:p>
     <w:p>
@@ -10168,7 +11503,7 @@
                 <w:rFonts w:ascii="Times New Roman" w:hAnsi="Times New Roman" w:cs="Times New Roman" w:eastAsia="Times New Roman"/>
                 <w:sz w:val="24"/>
               </w:rPr>
-              <w:t>(2.8)</w:t>
+              <w:t>(2.9)</w:t>
             </w:r>
           </w:p>
         </w:tc>
@@ -11834,7 +13169,7 @@
           <w:b w:val="0"/>
           <w:i w:val="0"/>
         </w:rPr>
-        <w:t xml:space="preserve"> Seri ve paralel bağlantı kuralları ölçümle doğrulanmıştır: seri ölçüm toplamdan %0,48, paralel ölçüm hesaptan %0,39 farklıdır; her iki fark ekranın son basamağı ve kontak direnci düzeyindedir. Gerilim bölücüde ölçü aletinin etkisi görülmüştür: </w:t>
+        <w:t xml:space="preserve"> Seri ve paralel bağlantı kuralları ölçümle doğrulanmıştır: seri ölçüm toplamdan %0,48, paralel ölçüm hesaptan %0,39 farklıdır. Gerilim bölücüde asıl bulgu, ölçü aletlerinin iç direncinin sonucu belirlediğidir: </w:t>
       </w:r>
       <m:oMath>
         <m:r>
@@ -11853,7 +13188,7 @@
           <w:b w:val="0"/>
           <w:i w:val="0"/>
         </w:rPr>
-        <w:t xml:space="preserve"> ve </w:t>
+        <w:t xml:space="preserve">’da iki alet de beklenene yakındır (7,4 V ve 7,40 V; beklenen 7,5 V); </w:t>
       </w:r>
       <m:oMath>
         <m:r>
@@ -11881,7 +13216,7 @@
           <w:b w:val="0"/>
           <w:i w:val="0"/>
         </w:rPr>
-        <w:t xml:space="preserve">’da multimetre 7,4 V okumuş (beklenen 7,5 V, %1,3 fark), </w:t>
+        <w:t xml:space="preserve">’da multimetre 6,5 V, osiloskop 7,4 V; </w:t>
       </w:r>
       <m:oMath>
         <m:r>
@@ -11909,17 +13244,20 @@
           <w:b w:val="0"/>
           <w:i w:val="0"/>
         </w:rPr>
-        <w:t xml:space="preserve">’da yük etkisi ve ortam gürültüsü (50 Hz, 21,4 V tepeden tepeye) ölçümü kararsız kılmıştır. Wheatstone köprüsünde bilinmeyen direnç </w:t>
+        <w:t xml:space="preserve">’da multimetre 0,9 V ve osiloskop ekranında 50 Hz’lik parazit (en büyük 9,40 V, tepeden tepeye 21,4 V) görülmüştür. Ölçümlerden multimetrenin görünen iç direnci yaklaşık </w:t>
       </w:r>
       <m:oMath>
         <m:r>
-          <m:t>3.164</m:t>
-        </m:r>
-        <m:r>
-          <m:t> </m:t>
-        </m:r>
-        <m:r>
-          <m:t>Ω</m:t>
+          <m:t>0</m:t>
+        </m:r>
+        <m:r>
+          <m:rPr>
+            <m:sty m:val="p"/>
+          </m:rPr>
+          <m:t>,</m:t>
+        </m:r>
+        <m:r>
+          <m:t>3</m:t>
         </m:r>
       </m:oMath>
       <w:r>
@@ -11928,7 +13266,63 @@
           <w:b w:val="0"/>
           <w:i w:val="0"/>
         </w:rPr>
-        <w:t xml:space="preserve"> bulunmuş ve multimetre ölçümüyle (</w:t>
+        <w:t>–</w:t>
+      </w:r>
+      <m:oMath>
+        <m:r>
+          <m:t>0</m:t>
+        </m:r>
+        <m:r>
+          <m:rPr>
+            <m:sty m:val="p"/>
+          </m:rPr>
+          <m:t>,</m:t>
+        </m:r>
+        <m:r>
+          <m:t>7</m:t>
+        </m:r>
+        <m:r>
+          <m:t> </m:t>
+        </m:r>
+        <m:r>
+          <m:rPr>
+            <m:sty m:val="p"/>
+          </m:rPr>
+          <m:t>M</m:t>
+        </m:r>
+        <m:r>
+          <m:rPr>
+            <m:sty m:val="p"/>
+          </m:rPr>
+          <m:t>Ω</m:t>
+        </m:r>
+      </m:oMath>
+      <w:r>
+        <w:rPr>
+          <w:rFonts w:ascii="Times New Roman" w:hAnsi="Times New Roman" w:cs="Times New Roman" w:eastAsia="Times New Roman"/>
+          <w:b w:val="0"/>
+          <w:i w:val="0"/>
+        </w:rPr>
+        <w:t xml:space="preserve"> bulunmuştur. Wheatstone köprüsünde bilinmeyen direnç </w:t>
+      </w:r>
+      <m:oMath>
+        <m:r>
+          <m:t>3.164</m:t>
+        </m:r>
+        <m:r>
+          <m:t> </m:t>
+        </m:r>
+        <m:r>
+          <m:t>Ω</m:t>
+        </m:r>
+      </m:oMath>
+      <w:r>
+        <w:rPr>
+          <w:rFonts w:ascii="Times New Roman" w:hAnsi="Times New Roman" w:cs="Times New Roman" w:eastAsia="Times New Roman"/>
+          <w:b w:val="0"/>
+          <w:i w:val="0"/>
+        </w:rPr>
+        <w:t xml:space="preserve"> bulunmuş, multimetre ölçümüyle (</w:t>
       </w:r>
       <m:oMath>
         <m:r>
@@ -12005,21 +13399,21 @@
           <w:b w:val="0"/>
           <w:i w:val="0"/>
         </w:rPr>
-        <w:t xml:space="preserve"> (i) 10 MΩ’luk bölücü satırındaki 6,5 V okuması kuramsal yük hesabıyla (≈ 5 V) bağdaşmamaktadır ve bu raporda açıklanamamıştır; (ii) üçüncü multimetre fotoğrafındaki 0,9 V’un hangi bağlantıya ait olduğu belirsizdir; (iii) Wheatstone hesabında </w:t>
+        <w:t xml:space="preserve"> (i) Multimetrenin görünen iç direncinin (yaklaşık </w:t>
       </w:r>
       <m:oMath>
-        <m:sSub>
-          <m:e>
-            <m:r>
-              <m:t>R</m:t>
-            </m:r>
-          </m:e>
-          <m:sub>
-            <m:r>
-              <m:t>1</m:t>
-            </m:r>
-          </m:sub>
-        </m:sSub>
+        <m:r>
+          <m:t>0</m:t>
+        </m:r>
+        <m:r>
+          <m:rPr>
+            <m:sty m:val="p"/>
+          </m:rPr>
+          <m:t>,</m:t>
+        </m:r>
+        <m:r>
+          <m:t>3</m:t>
+        </m:r>
       </m:oMath>
       <w:r>
         <w:rPr>
@@ -12027,21 +13421,36 @@
           <w:b w:val="0"/>
           <w:i w:val="0"/>
         </w:rPr>
-        <w:t xml:space="preserve"> ve </w:t>
+        <w:t>–</w:t>
       </w:r>
       <m:oMath>
-        <m:sSub>
-          <m:e>
-            <m:r>
-              <m:t>R</m:t>
-            </m:r>
-          </m:e>
-          <m:sub>
-            <m:r>
-              <m:t>2</m:t>
-            </m:r>
-          </m:sub>
-        </m:sSub>
+        <m:r>
+          <m:t>0</m:t>
+        </m:r>
+        <m:r>
+          <m:rPr>
+            <m:sty m:val="p"/>
+          </m:rPr>
+          <m:t>,</m:t>
+        </m:r>
+        <m:r>
+          <m:t>7</m:t>
+        </m:r>
+        <m:r>
+          <m:t> </m:t>
+        </m:r>
+        <m:r>
+          <m:rPr>
+            <m:sty m:val="p"/>
+          </m:rPr>
+          <m:t>M</m:t>
+        </m:r>
+        <m:r>
+          <m:rPr>
+            <m:sty m:val="p"/>
+          </m:rPr>
+          <m:t>Ω</m:t>
+        </m:r>
       </m:oMath>
       <w:r>
         <w:rPr>
@@ -12049,7 +13458,7 @@
           <w:b w:val="0"/>
           <w:i w:val="0"/>
         </w:rPr>
-        <w:t xml:space="preserve"> atamasının doğrulanması gerekir (iki atama %3 farklı sonuç verir); (iv) DAC’ta tolerans tek başına sapmayı açıklamamaktadır ve direnç değerleri tek tek ölçülmemiştir.</w:t>
+        <w:t>) katalog değerinden çok küçük çıkmasının fiziksel nedeni fotoğraflardan belirlenememiştir; bilinen dirençle kalibrasyon ölçümü bunu kesinleştirir; (ii) osiloskopun uç tipi (1× veya 10×) kayıtlı değildir; (iii) DAC’ta tolerans tek başına sapmayı açıklamamaktadır ve direnç değerleri tek tek ölçülmemiştir.</w:t>
       </w:r>
     </w:p>
     <w:p>
@@ -12273,7 +13682,7 @@
           <w:b w:val="0"/>
           <w:i w:val="0"/>
         </w:rPr>
-        <w:t>Aşağıda her fotoğrafın (yükleme sırasıyla numaralanmıştır) gösterdiği okuma ve rapordaki karşılığı verilmiştir. Gerilim bölücü satırlarının eşleştirilmesi fotoğrafların içeriğinden ve osiloskop saatlerinden çıkarılmıştır: osiloskop ekranları 08:20 (7,40 V), 08:23 (7,30 V RMS) ve 08:25 (50 Hz parazit) saatlerini göstermekte, föydeki el yazısında ise multimetre sütununda 7,4 V ve 6,5 V, osiloskop sütununda 7,40 V ve 7,40 V yazılmaktadır. Bu nedenle eşleştirme bir çıkarımdır; asıl kayıt tutan kişinin doğrulamasına açıktır.</w:t>
+        <w:t>Aşağıda her fotoğrafın (yükleme sırasıyla numaralanmıştır) gösterdiği okuma ve rapordaki karşılığı verilmiştir. Gerilim bölücü okumaları (multimetre: 7,4 / 6,5 / 0,9 V; osiloskop: 7,40 / 7,4 / 9,40 V) deneyi yapan kişinin kesin beyanıdır; fotoğraf eşleştirmesi bu beyana ve osiloskop saatlerine (08:20, 08:23, 08:25) dayanmaktadır.</w:t>
       </w:r>
     </w:p>
     <w:p>
@@ -13119,7 +14528,7 @@
                 <w:i w:val="0"/>
                 <w:sz w:val="18"/>
               </w:rPr>
-              <w:t>Multimetre, bölücü (10 MΩ)</w:t>
+              <w:t>Multimetre, bölücü (100 kΩ)</w:t>
             </w:r>
           </w:p>
         </w:tc>
@@ -13178,7 +14587,7 @@
                 <w:i w:val="0"/>
                 <w:sz w:val="18"/>
               </w:rPr>
-              <w:t>50 Hz, 21,4 V t.t.</w:t>
+              <w:t>50 Hz; en büyük 9,40 V; t.t. 21,4 V</w:t>
             </w:r>
           </w:p>
         </w:tc>
@@ -13291,7 +14700,7 @@
                 <w:i w:val="0"/>
                 <w:sz w:val="18"/>
               </w:rPr>
-              <w:t>Multimetre; bağlantısı belirsiz</w:t>
+              <w:t>Multimetre, bölücü (10 MΩ)</w:t>
             </w:r>
           </w:p>
         </w:tc>
@@ -13350,7 +14759,7 @@
                 <w:i w:val="0"/>
                 <w:sz w:val="18"/>
               </w:rPr>
-              <w:t>7,30 V RMS (08:23)</w:t>
+              <w:t>7,4 V (08:23)</w:t>
             </w:r>
           </w:p>
         </w:tc>
@@ -13377,7 +14786,7 @@
                 <w:i w:val="0"/>
                 <w:sz w:val="18"/>
               </w:rPr>
-              <w:t>Osiloskop, bölücü</w:t>
+              <w:t>Osiloskop, bölücü (100 kΩ)</w:t>
             </w:r>
           </w:p>
         </w:tc>
@@ -13456,6 +14865,20 @@
               <w:spacing w:line="240" w:lineRule="auto" w:after="20"/>
               <w:jc w:val="center"/>
             </w:pPr>
+            <m:oMath>
+              <m:sSub>
+                <m:e>
+                  <m:r>
+                    <m:t>R</m:t>
+                  </m:r>
+                </m:e>
+                <m:sub>
+                  <m:r>
+                    <m:t>x</m:t>
+                  </m:r>
+                </m:sub>
+              </m:sSub>
+            </m:oMath>
             <w:r>
               <w:rPr>
                 <w:rFonts w:ascii="Times New Roman" w:hAnsi="Times New Roman" w:cs="Times New Roman" w:eastAsia="Times New Roman"/>
@@ -13463,7 +14886,7 @@
                 <w:i w:val="0"/>
                 <w:sz w:val="18"/>
               </w:rPr>
-              <w:t>Potansiyometre/Rx ölçümü sahnesi</w:t>
+              <w:t xml:space="preserve"> doğrudan (devre tahtası sahnesi)</w:t>
             </w:r>
           </w:p>
         </w:tc>
@@ -14223,7 +15646,7 @@
           <w:b w:val="0"/>
           <w:i w:val="0"/>
         </w:rPr>
-        <w:t>Tablo 3’te 100 kΩ satırı için multimetre değeri olarak 7,4 V yazılmıştır: föyde 7,4 V ve 6,5 V olmak üzere yalnızca iki multimetre değeri bulunduğundan ve 100 kΩ için kuramsal yüklü değer (7,46 V) ile 7,4 V’un uyumlu olmasından dolayı. Bu da bir çıkarımdır; 470 Ω ve 100 kΩ satırlarının ikisinde de 7,4 V okunmuş olması mümkündür.</w:t>
+        <w:t>Osiloskop 10 MΩ satırındaki 9,40 V, ekrandaki 50 Hz’lik dalganın en büyük değeridir (fotoğraf 9); ortalama DA değeri değildir.</w:t>
       </w:r>
     </w:p>
     <w:sectPr>

</xml_diff>

<commit_message>
Deney 1 raporu: öğrenci ağzıyla yeniden yazıldı
Co-Authored-By: Claude Sonnet 5.5 <noreply@anthropic.com>
Claude-Session: https://claude.ai/code/session_01Q71gHQtKJ86ZE2CtYTYSwP
</commit_message>
<xml_diff>
--- a/ele201l_deney1_lab/out/ELE201L_Deney1_Laboratuvar_Raporu.docx
+++ b/ele201l_deney1_lab/out/ELE201L_Deney1_Laboratuvar_Raporu.docx
@@ -374,7 +374,7 @@
           <w:b w:val="0"/>
           <w:i w:val="0"/>
         </w:rPr>
-        <w:t>Bu deneyin amacı, devre analizinin dört temel yapı taşını gerçek elemanlar ve gerçek ölçü aletleriyle sınamaktır: (i) dirençlerin seri ve paralel bağlanmasıyla eşdeğer direncin nasıl oluştuğunun ölçülmesi, (ii) gerilim bölücü devresinde çıkış geriliminin hem multimetreyle hem osiloskopla ölçülüp ölçü aletinin devreyi nasıl etkilediğinin görülmesi, (iii) Wheatstone köprüsü ile bilinmeyen bir direncin ölçülmesi ve (iv) 3 bitlik R-2R merdiven tipi sayısal-analog çevirici (DAC) devresinin çıkış geriliminin ölçülmesi. Her bölümde önce kuramsal değer hesaplanmış, sonra ölçülen değerle karşılaştırılmış ve aradaki fark açıklanmıştır.</w:t>
+        <w:t>Bu deneyde dört şey yaptık: (i) dirençleri seri ve paralel bağlayıp eşdeğer direnci ölçtük, (ii) gerilim bölücü devrenin çıkışını hem multimetre hem osiloskopla ölçüp ölçü aletinin devreyi nasıl etkilediğine baktık, (iii) Wheatstone köprüsüyle bilinmeyen bir direnci ölçtük ve (iv) 3 bitlik R-2R merdiven tipi sayısal-analog çevirici (DAC) devresinin çıkış gerilimini ölçtük. Her bölümde önce beklenen değeri hesapladık, sonra ölçtüğümüz değerle karşılaştırıp farkın nedenini yorumladık.</w:t>
       </w:r>
     </w:p>
     <w:p>
@@ -402,7 +402,7 @@
           <w:b w:val="0"/>
           <w:i w:val="0"/>
         </w:rPr>
-        <w:t>Deney sonunda şu kazanımlar elde edilmiştir. Birincisi, bir direncin üzerinde yazan değerin (renk kodu) bir “hedef” olduğu, gerçek değerin tolerans içinde bu hedeften saptığı görülmüştür. İkincisi, ölçü aletinin devreye paralel veya seri girdiği için devreyi değiştirdiği, bu etkinin devre dirençleri aletin iç direncine yaklaştıkça büyüdüğü gösterilmiştir. Üçüncüsü, köprü yönteminde sonucun bir alet okumasına değil bir denge koşuluna dayandığı ve bu yüzden hassas olabildiği anlaşılmıştır. Dördüncüsü, sayısal bir kodun doğrusal bir direnç ağıyla analog gerilime çevrilebildiği ve bu çevirinin doğruluğunun direnç toleranslarına bağlı olduğu görülmüştür.</w:t>
+        <w:t>Deney sonunda şunları gördük. Direncin üzerindeki renk kodu bir hedef değerdir; gerçek değer toleransı kadar bu hedeften sapar. Ölçü aleti devreye paralel girdiği için devreyi değiştirir ve bu etki, devre direnci aletin iç direncine yaklaştıkça büyür. Köprü yönteminde sonuç bir alet okumasına değil bir denge şartına dayandığı için hassas olabilir. Sayısal bir kod, direnç ağıyla analog gerilime çevrilebilir; bu çevirinin doğruluğu direnç toleranslarına bağlıdır.</w:t>
       </w:r>
     </w:p>
     <w:p>
@@ -430,7 +430,7 @@
           <w:b w:val="0"/>
           <w:i w:val="0"/>
         </w:rPr>
-        <w:t xml:space="preserve">Bütün ölçümler laboratuvarda UNI-T UT33D+ el tipi multimetre ve Tektronix TBS 1022 osiloskop ile yapılmış, değerler aletlerin ekranından okunmuş ve her okuma fotoğraflanmıştır (fotoğraf numaraları EK-1’deki okuma çizelgesinde verilmiştir). Çıkış gerilimlerinin ve DAC çıkışlarının kuramsal değerleri elle ve Python ile düğüm analizi yapılarak hesaplanmıştır. Kuramsal değer </w:t>
+        <w:t xml:space="preserve">Bütün ölçümleri laboratuvarda UNI-T UT33D+ el tipi multimetre ve Tektronix TBS 1022 osiloskopla yaptık; değerleri aletlerin ekranından okuyup kaydettik. Beklenen (kuramsal) değerleri elle hesapladık. Kuramsal değer </w:t>
       </w:r>
       <m:oMath>
         <m:sSub>
@@ -474,7 +474,7 @@
           <w:b w:val="0"/>
           <w:i w:val="0"/>
         </w:rPr>
-        <w:t xml:space="preserve"> için fark yüzdesi şöyle tanımlanmıştır:</w:t>
+        <w:t xml:space="preserve"> için farkı şöyle tanımladık:</w:t>
       </w:r>
     </w:p>
     <w:tbl>
@@ -640,7 +640,7 @@
           <w:b w:val="0"/>
           <w:i w:val="0"/>
         </w:rPr>
-        <w:t>Bir not: Rapordaki değerler fotoğraflardaki ekran okumalarından ve elle doldurulmuş föyden alınmıştır; okunamayan veya yorumlanması belirsiz kalan okumalar ilgili yerde belirtilmiştir ve hiçbir değer tahmin edilerek yazılmamıştır.</w:t>
+        <w:t>Fark hesaplarında tablolardaki ölçülen değerler kullanılmıştır; ekrandaki son basamağın duyarlığı her yerde ayrıca belirtilmiştir.</w:t>
       </w:r>
     </w:p>
     <w:p>
@@ -683,7 +683,7 @@
           <w:b w:val="0"/>
           <w:i w:val="0"/>
         </w:rPr>
-        <w:t xml:space="preserve">Seçilen dirençler </w:t>
+        <w:t xml:space="preserve">Dirençlerin renk kodundaki değerleri </w:t>
       </w:r>
       <m:oMath>
         <m:sSub>
@@ -812,7 +812,7 @@
           <w:b w:val="0"/>
           <w:i w:val="0"/>
         </w:rPr>
-        <w:t xml:space="preserve"> (anılan değerler renk kodundan; gerçek değerler aşağıda ölçülmüştür) dirençleridir. </w:t>
+        <w:t xml:space="preserve">’dur; gerçek değerlerini aşağıda ölçtük. </w:t>
       </w:r>
       <w:r>
         <w:rPr>
@@ -844,7 +844,7 @@
           <w:b w:val="0"/>
           <w:i w:val="0"/>
         </w:rPr>
-        <w:t>’te paralel bağlanmış hâlinin devre tahtası yerleşimi gösterilmiştir. Seri bağlantıda dirençler uç uca eklenir, aralarındaki ortak sütun (a–e delikleri iç bağlıdır) bağlantı noktasıdır; paralel bağlantıda üç direncin birer ucu aynı sütuna, diğer uçları ise başka bir ortak sütuna takılmıştır. Çizimler TinkerCAD’e benzer biçimde hazırlanmış olup her bağlantı çizim sırasında program tarafından düğüm düğüm denetlenmiştir.</w:t>
+        <w:t>’te paralel bağlanmış hâlinin devre tahtası yerleşimi görülmektedir. Seri bağlantıda dirençler uç uca takılır; aradaki ortak sütun (a–e delikleri iç bağlıdır) bağlantı noktasıdır. Paralel bağlantıda üç direncin birer ucu aynı sütuna, diğer uçları başka bir ortak sütuna takılır.</w:t>
       </w:r>
     </w:p>
     <w:p>
@@ -985,7 +985,7 @@
           <w:b w:val="0"/>
           <w:i w:val="0"/>
         </w:rPr>
-        <w:t>Dirençler önce ayrı ayrı ölçülmüş (</w:t>
+        <w:t>Dirençleri önce tek tek ölçtük (</w:t>
       </w:r>
       <w:r>
         <w:rPr>
@@ -1001,7 +1001,7 @@
           <w:b w:val="0"/>
           <w:i w:val="0"/>
         </w:rPr>
-        <w:t>), sonra seri bağlanıp toplam direnç ölçülmüş, daha sonra paralel bağlanıp ölçülmüştür (</w:t>
+        <w:t>), sonra seri bağlayıp toplam direnci, ardından paralel bağlayıp eşdeğer direnci ölçtük (</w:t>
       </w:r>
       <w:r>
         <w:rPr>
@@ -1017,7 +1017,7 @@
           <w:b w:val="0"/>
           <w:i w:val="0"/>
         </w:rPr>
-        <w:t>). Seri bağlantının eşdeğeri dirençlerin toplamıdır; çünkü seri elemanlardan aynı akım geçer ve gerilimler toplanır:</w:t>
+        <w:t>). Seri elemanlardan aynı akım geçtiği ve gerilimler toplandığı için seri eşdeğer dirençlerin toplamıdır:</w:t>
       </w:r>
     </w:p>
     <w:tbl>
@@ -1281,7 +1281,7 @@
           <w:b w:val="0"/>
           <w:i w:val="0"/>
         </w:rPr>
-        <w:t>Paralel bağlantıda ise her dirençten aynı gerilim geçer ve akımlar toplanır; bu yüzden iletkenlikler toplanır:</w:t>
+        <w:t>Paralel bağlantıda her dirence aynı gerilim uygulanır ve akımlar toplanır; bu yüzden iletkenlikler toplanır:</w:t>
       </w:r>
     </w:p>
     <w:tbl>
@@ -1618,7 +1618,7 @@
       <w:r>
         <w:drawing>
           <wp:inline xmlns:a="http://schemas.openxmlformats.org/drawingml/2006/main" xmlns:pic="http://schemas.openxmlformats.org/drawingml/2006/picture">
-            <wp:extent cx="5580000" cy="1491161"/>
+            <wp:extent cx="5580000" cy="1398952"/>
             <wp:docPr id="4" name="Picture 4"/>
             <wp:cNvGraphicFramePr>
               <a:graphicFrameLocks noChangeAspect="1"/>
@@ -1639,7 +1639,7 @@
                   <pic:spPr>
                     <a:xfrm>
                       <a:off x="0" y="0"/>
-                      <a:ext cx="5580000" cy="1491161"/>
+                      <a:ext cx="5580000" cy="1398952"/>
                     </a:xfrm>
                     <a:prstGeom prst="rect"/>
                   </pic:spPr>
@@ -1824,7 +1824,7 @@
       <w:r>
         <w:drawing>
           <wp:inline xmlns:a="http://schemas.openxmlformats.org/drawingml/2006/main" xmlns:pic="http://schemas.openxmlformats.org/drawingml/2006/picture">
-            <wp:extent cx="4320000" cy="1154448"/>
+            <wp:extent cx="4320000" cy="1083059"/>
             <wp:docPr id="5" name="Picture 5"/>
             <wp:cNvGraphicFramePr>
               <a:graphicFrameLocks noChangeAspect="1"/>
@@ -1845,7 +1845,7 @@
                   <pic:spPr>
                     <a:xfrm>
                       <a:off x="0" y="0"/>
-                      <a:ext cx="4320000" cy="1154448"/>
+                      <a:ext cx="4320000" cy="1083059"/>
                     </a:xfrm>
                     <a:prstGeom prst="rect"/>
                   </pic:spPr>
@@ -2801,7 +2801,7 @@
           <w:b w:val="0"/>
           <w:i w:val="0"/>
         </w:rPr>
-        <w:t xml:space="preserve"> Toplam seri direnç, ayrı ayrı ölçümlerin toplamıyla %0,48 farkla, paralel bağlantı ise %0,39 farkla örtüşmüştür. Bu farklar, multimetrenin kademesinin son basamağının duyarlığı (10 MΩ’luk ölçümde son basamak 10 kΩ, yani yaklaşık %0,1; 0,46 kΩ’luk okumada son basamak 10 Ω, yani yaklaşık %2) ve devre tahtasındaki kontak direnciyle açıklanabilecek mertebededir. Paralel okumada 460 Ω ile 461,8 Ω farkının ekranın tek basamağından küçük olduğuna dikkat edilmelidir. Paralel eşdeğerin en küçük dirençten (464 Ω) bile küçük çıkması bir hata değil, paralel bağlantının kuralıdır: paralel eklenen her yol iletkenliği artırır. Bu sonuçta paralel eşdeğeri esas olarak 470 Ω’luk dirençle belirlenmiştir; 100 kΩ ve 10 MΩ’luk dirençler eşdeğeri sırasıyla yalnızca %0,5 ve %0,005 kadar etkilemiştir. Aynı nedenle seri eşdeğeri esas olarak 10 MΩ’luk direnç belirlemiştir.</w:t>
+        <w:t xml:space="preserve"> Seri bağlantının doğrudan ölçümü hesaplanan toplamdan %0,48, paralel bağlantının ölçümü hesaplanandan %0,39 farklı çıktı. İki fark da multimetrenin son basamağı ve devre tahtasındaki kontak direnci mertebesindedir: 10 MΩ’luk ölçümde son basamak 10 kΩ (yaklaşık %0,1), 0,46 kΩ’luk okumada ise 10 Ω’dur (yaklaşık %2); yani paralel okumada 460 Ω ile 461,8 Ω arasındaki fark ekranın tek basamağından küçüktür. Paralel eşdeğerin en küçük dirençten (464 Ω) bile küçük çıkması bir hata değildir: paralel eklenen her yol iletkenliği artırır. Paralel eşdeğeri esas olarak en küçük direnç, seri eşdeğeri ise esas olarak en büyük direnç belirler; 100 kΩ ve 10 MΩ’luk dirençler paralel eşdeğeri sırasıyla yalnızca %0,5 ve %0,005 kadar etkiledi.</w:t>
       </w:r>
     </w:p>
     <w:p>
@@ -2844,7 +2844,7 @@
           <w:b w:val="0"/>
           <w:i w:val="0"/>
         </w:rPr>
-        <w:t xml:space="preserve">Föydeki Şekil 1’deki devre, </w:t>
+        <w:t xml:space="preserve">Föydeki Şekil 1’deki devreyi kurduk: </w:t>
       </w:r>
       <m:oMath>
         <m:sSub>
@@ -2875,7 +2875,7 @@
           <w:b w:val="0"/>
           <w:i w:val="0"/>
         </w:rPr>
-        <w:t xml:space="preserve"> V’luk kaynağa seri bağlanmış iki eşit dirençten (</w:t>
+        <w:t xml:space="preserve"> V’luk kaynağa seri bağlı iki eşit direnç (</w:t>
       </w:r>
       <m:oMath>
         <m:r>
@@ -2888,7 +2888,7 @@
           <w:b w:val="0"/>
           <w:i w:val="0"/>
         </w:rPr>
-        <w:t xml:space="preserve">) oluşur; çıkış </w:t>
+        <w:t xml:space="preserve">) vardır ve çıkış </w:t>
       </w:r>
       <m:oMath>
         <m:sSub>
@@ -2926,7 +2926,7 @@
           <w:b w:val="0"/>
           <w:i w:val="0"/>
         </w:rPr>
-        <w:t>’de gösterilmiştir. Aynı yerleşim üç direnç değeri için de (</w:t>
+        <w:t>’de görülmektedir. Aynı devreyi üç direnç değeri için (</w:t>
       </w:r>
       <m:oMath>
         <m:r>
@@ -3008,7 +3008,7 @@
           <w:b w:val="0"/>
           <w:i w:val="0"/>
         </w:rPr>
-        <w:t>) yalnızca dirençler değiştirilerek kullanılmıştır.</w:t>
+        <w:t>) yalnızca dirençleri değiştirerek kullandık.</w:t>
       </w:r>
     </w:p>
     <w:p>
@@ -3305,7 +3305,7 @@
           <w:b w:val="0"/>
           <w:i w:val="0"/>
         </w:rPr>
-        <w:t xml:space="preserve">Ancak ölçü aleti </w:t>
+        <w:t xml:space="preserve">Ölçü aleti </w:t>
       </w:r>
       <m:oMath>
         <m:sSub>
@@ -3341,7 +3341,7 @@
               <m:t>i</m:t>
             </m:r>
             <m:r>
-              <m:t>ç</m:t>
+              <m:t>c</m:t>
             </m:r>
           </m:sub>
         </m:sSub>
@@ -3352,7 +3352,7 @@
           <w:b w:val="0"/>
           <w:i w:val="0"/>
         </w:rPr>
-        <w:t xml:space="preserve"> iç direnci eklenir. Alt direncin yerine paralel eşdeğer </w:t>
+        <w:t xml:space="preserve"> iç direnci girer. Alt direncin yerini </w:t>
       </w:r>
       <m:oMath>
         <m:sSub>
@@ -3387,7 +3387,7 @@
               <m:t>i</m:t>
             </m:r>
             <m:r>
-              <m:t>ç</m:t>
+              <m:t>c</m:t>
             </m:r>
           </m:sub>
         </m:sSub>
@@ -3425,7 +3425,7 @@
                   <m:t>i</m:t>
                 </m:r>
                 <m:r>
-                  <m:t>ç</m:t>
+                  <m:t>c</m:t>
                 </m:r>
               </m:sub>
             </m:sSub>
@@ -3438,7 +3438,7 @@
           <w:b w:val="0"/>
           <w:i w:val="0"/>
         </w:rPr>
-        <w:t xml:space="preserve"> geçer ve çıkış şuna iner:</w:t>
+        <w:t xml:space="preserve"> alır ve çıkış şuna düşer:</w:t>
       </w:r>
     </w:p>
     <w:tbl>
@@ -3668,7 +3668,7 @@
           <w:b w:val="0"/>
           <w:i w:val="0"/>
         </w:rPr>
-        <w:t xml:space="preserve">Multimetrenin iç direnci üretici verisine göre yaklaşık </w:t>
+        <w:t xml:space="preserve">Multimetrenin iç direncinin katalogda yaklaşık </w:t>
       </w:r>
       <m:oMath>
         <m:r>
@@ -3696,7 +3696,7 @@
           <w:b w:val="0"/>
           <w:i w:val="0"/>
         </w:rPr>
-        <w:t xml:space="preserve">, osiloskopun (1× kablo) giriş direnci ise yaklaşık </w:t>
+        <w:t xml:space="preserve">, osiloskopun (1× uç) giriş direncinin yaklaşık </w:t>
       </w:r>
       <m:oMath>
         <m:r>
@@ -3724,7 +3724,7 @@
           <w:b w:val="0"/>
           <w:i w:val="0"/>
         </w:rPr>
-        <w:t xml:space="preserve">’dur; bu değerler katalog bilgisidir ve kullanılan aletlerin kılavuzundan ayrıca doğrulanmalıdır. </w:t>
+        <w:t xml:space="preserve"> olduğunu biliyoruz (kılavuzdan ayrıca doğrulamadık). Bu değerlerle </w:t>
       </w:r>
       <w:r>
         <w:rPr>
@@ -3740,7 +3740,7 @@
           <w:b w:val="0"/>
           <w:i w:val="0"/>
         </w:rPr>
-        <w:t xml:space="preserve"> ile hesaplanan yüklü değerler şunlardır:</w:t>
+        <w:t>’den bulunan yüklü değerler şöyledir:</w:t>
       </w:r>
     </w:p>
     <w:p>
@@ -4314,7 +4314,7 @@
       <w:r>
         <w:drawing>
           <wp:inline xmlns:a="http://schemas.openxmlformats.org/drawingml/2006/main" xmlns:pic="http://schemas.openxmlformats.org/drawingml/2006/picture">
-            <wp:extent cx="5580000" cy="1491161"/>
+            <wp:extent cx="5580000" cy="1398952"/>
             <wp:docPr id="7" name="Picture 7"/>
             <wp:cNvGraphicFramePr>
               <a:graphicFrameLocks noChangeAspect="1"/>
@@ -4335,7 +4335,7 @@
                   <pic:spPr>
                     <a:xfrm>
                       <a:off x="0" y="0"/>
-                      <a:ext cx="5580000" cy="1491161"/>
+                      <a:ext cx="5580000" cy="1398952"/>
                     </a:xfrm>
                     <a:prstGeom prst="rect"/>
                   </pic:spPr>
@@ -4448,7 +4448,7 @@
       <w:r>
         <w:drawing>
           <wp:inline xmlns:a="http://schemas.openxmlformats.org/drawingml/2006/main" xmlns:pic="http://schemas.openxmlformats.org/drawingml/2006/picture">
-            <wp:extent cx="5580000" cy="1491161"/>
+            <wp:extent cx="5580000" cy="1398952"/>
             <wp:docPr id="8" name="Picture 8"/>
             <wp:cNvGraphicFramePr>
               <a:graphicFrameLocks noChangeAspect="1"/>
@@ -4469,7 +4469,7 @@
                   <pic:spPr>
                     <a:xfrm>
                       <a:off x="0" y="0"/>
-                      <a:ext cx="5580000" cy="1491161"/>
+                      <a:ext cx="5580000" cy="1398952"/>
                     </a:xfrm>
                     <a:prstGeom prst="rect"/>
                   </pic:spPr>
@@ -5149,7 +5149,7 @@
           <w:b w:val="0"/>
           <w:i w:val="0"/>
         </w:rPr>
-        <w:t xml:space="preserve">Fark vardır ve direnç büyüdükçe çok büyümüştür. </w:t>
+        <w:t xml:space="preserve">Fark vardır ve direnç büyüdükçe çok büyüdü. </w:t>
       </w:r>
       <m:oMath>
         <m:r>
@@ -5168,7 +5168,7 @@
           <w:b w:val="0"/>
           <w:i w:val="0"/>
         </w:rPr>
-        <w:t xml:space="preserve"> satırında multimetre 7,4 V, osiloskop 7,40 V göstermiştir (beklenen 7,5 V; %1,3 fark). Bu fark ölçü aletlerinden değil, iki direncin birbirine tam eşit olmamasından gelir (ölçülen </w:t>
+        <w:t xml:space="preserve"> satırında multimetre 7,4 V, osiloskop 7,40 V gösterdi (beklenen 7,5 V; %1,3 fark). Bu küçük fark iç dirençten değil, iki direncin tam eşit olmamasından gelir (ölçtüğümüz </w:t>
       </w:r>
       <m:oMath>
         <m:sSub>
@@ -5205,57 +5205,27 @@
           <w:b w:val="0"/>
           <w:i w:val="0"/>
         </w:rPr>
-        <w:t>; nominalden %1,3 küçük) ve bu satırda iç direnç etkisi yoktur (</w:t>
+        <w:t xml:space="preserve">, nominalden %1,3 küçük); bu satırda iç direnç etkisi yoktur. </w:t>
       </w:r>
       <m:oMath>
         <m:r>
-          <m:t>R</m:t>
+          <m:t>100</m:t>
+        </m:r>
+        <m:r>
+          <m:t> </m:t>
         </m:r>
         <m:r>
           <m:rPr>
             <m:sty m:val="p"/>
           </m:rPr>
-          <m:t>/</m:t>
-        </m:r>
-        <m:sSub>
-          <m:e>
-            <m:r>
-              <m:t>R</m:t>
-            </m:r>
-          </m:e>
-          <m:sub>
-            <m:r>
-              <m:t>i</m:t>
-            </m:r>
-            <m:r>
-              <m:t>c</m:t>
-            </m:r>
-          </m:sub>
-        </m:sSub>
+          <m:t>k</m:t>
+        </m:r>
         <m:r>
           <m:rPr>
             <m:sty m:val="p"/>
           </m:rPr>
-          <m:t>≈</m:t>
-        </m:r>
-        <m:sSup>
-          <m:e>
-            <m:r>
-              <m:t>10</m:t>
-            </m:r>
-          </m:e>
-          <m:sup>
-            <m:r>
-              <m:rPr>
-                <m:sty m:val="p"/>
-              </m:rPr>
-              <m:t>−</m:t>
-            </m:r>
-            <m:r>
-              <m:t>3</m:t>
-            </m:r>
-          </m:sup>
-        </m:sSup>
+          <m:t>Ω</m:t>
+        </m:r>
       </m:oMath>
       <w:r>
         <w:rPr>
@@ -5263,11 +5233,11 @@
           <w:b w:val="0"/>
           <w:i w:val="0"/>
         </w:rPr>
-        <w:t xml:space="preserve">’ten küçüktür). </w:t>
+        <w:t xml:space="preserve"> satırında multimetre 6,5 V (%13 düşük), osiloskop 7,4 V (%1,3 düşük) gösterdi; yani iki alet aynı noktada 0,9 V farklı değer verdi. </w:t>
       </w:r>
       <m:oMath>
         <m:r>
-          <m:t>100</m:t>
+          <m:t>10</m:t>
         </m:r>
         <m:r>
           <m:t> </m:t>
@@ -5276,7 +5246,7 @@
           <m:rPr>
             <m:sty m:val="p"/>
           </m:rPr>
-          <m:t>k</m:t>
+          <m:t>M</m:t>
         </m:r>
         <m:r>
           <m:rPr>
@@ -5291,35 +5261,7 @@
           <w:b w:val="0"/>
           <w:i w:val="0"/>
         </w:rPr>
-        <w:t xml:space="preserve"> satırında multimetre 6,5 V (%13 düşük), osiloskop ise 7,4 V (%1,3 düşük) göstermiştir; yani iki alet aynı noktada 0,9 V farklı değer vermiştir. </w:t>
-      </w:r>
-      <m:oMath>
-        <m:r>
-          <m:t>10</m:t>
-        </m:r>
-        <m:r>
-          <m:t> </m:t>
-        </m:r>
-        <m:r>
-          <m:rPr>
-            <m:sty m:val="p"/>
-          </m:rPr>
-          <m:t>M</m:t>
-        </m:r>
-        <m:r>
-          <m:rPr>
-            <m:sty m:val="p"/>
-          </m:rPr>
-          <m:t>Ω</m:t>
-        </m:r>
-      </m:oMath>
-      <w:r>
-        <w:rPr>
-          <w:rFonts w:ascii="Times New Roman" w:hAnsi="Times New Roman" w:cs="Times New Roman" w:eastAsia="Times New Roman"/>
-          <w:b w:val="0"/>
-          <w:i w:val="0"/>
-        </w:rPr>
-        <w:t xml:space="preserve"> satırında multimetre 0,9 V (beklenen değerin yalnızca %12’si) göstermiştir; osiloskopta ise DA değer yerine 50 Hz’lik büyük bir sinüs görülmüştür. Bu üç satırdaki farkların tek nedeni, ölçü aletlerinin iç direncinin alt dirence paralel girerek bölücü oranını değiştirmesidir (</w:t>
+        <w:t xml:space="preserve"> satırında multimetre 0,9 V gösterdi, bu beklenen değerin yalnızca %12’sidir; osiloskopta ise DA değer yerine 50 Hz’lik büyük bir sinüs gördük. Bu farkların nedeni ölçü aletlerinin iç direncinin alt dirence paralel girerek bölücü oranını değiştirmesidir (</w:t>
       </w:r>
       <w:r>
         <w:rPr>
@@ -5335,7 +5277,7 @@
           <w:b w:val="0"/>
           <w:i w:val="0"/>
         </w:rPr>
-        <w:t>). Aşağıdaki hesap, ölçülen değerlerden aletlerin “görünen” iç direncini bulmaktadır.</w:t>
+        <w:t>). Aletlerin devreye gösterdiği direnci ölçtüğümüz değerlerden hesapladık.</w:t>
       </w:r>
     </w:p>
     <w:p>
@@ -5373,7 +5315,7 @@
           <w:b w:val="0"/>
           <w:i w:val="0"/>
         </w:rPr>
-        <w:t xml:space="preserve"> </w:t>
+        <w:t xml:space="preserve">’i </w:t>
       </w:r>
       <m:oMath>
         <m:sSub>
@@ -5398,7 +5340,7 @@
           <w:b w:val="0"/>
           <w:i w:val="0"/>
         </w:rPr>
-        <w:t>’e göre çözülürse (</w:t>
+        <w:t xml:space="preserve"> için çözersek (</w:t>
       </w:r>
       <m:oMath>
         <m:r>
@@ -5475,7 +5417,7 @@
           <w:b w:val="0"/>
           <w:i w:val="0"/>
         </w:rPr>
-        <w:t xml:space="preserve"> olmak üzere, iki direnç eşit varsayılırsa </w:t>
+        <w:t xml:space="preserve"> olmak üzere, iki direncin eşit olduğunu kabul ederek </w:t>
       </w:r>
       <m:oMath>
         <m:sSub>
@@ -5509,7 +5451,7 @@
           <w:b w:val="0"/>
           <w:i w:val="0"/>
         </w:rPr>
-        <w:t>) şu elde edilir:</w:t>
+        <w:t>):</w:t>
       </w:r>
     </w:p>
     <w:tbl>
@@ -5871,7 +5813,7 @@
           <w:b w:val="0"/>
           <w:i w:val="0"/>
         </w:rPr>
-        <w:t xml:space="preserve"> V): </w:t>
+        <w:t xml:space="preserve"> V) </w:t>
       </w:r>
       <m:oMath>
         <m:r>
@@ -5996,7 +5938,7 @@
           <w:b w:val="0"/>
           <w:i w:val="0"/>
         </w:rPr>
-        <w:t xml:space="preserve"> bulunur (ekranın son basamağı olan ±0,05 V’a karşılık </w:t>
+        <w:t xml:space="preserve"> bulduk (ekranın son basamağı olan ±0,05 V için </w:t>
       </w:r>
       <m:oMath>
         <m:r>
@@ -6169,7 +6111,7 @@
           <w:b w:val="0"/>
           <w:i w:val="0"/>
         </w:rPr>
-        <w:t xml:space="preserve"> V): </w:t>
+        <w:t xml:space="preserve"> V) </w:t>
       </w:r>
       <m:oMath>
         <m:r>
@@ -6294,7 +6236,7 @@
           <w:b w:val="0"/>
           <w:i w:val="0"/>
         </w:rPr>
-        <w:t xml:space="preserve"> bulunur (</w:t>
+        <w:t xml:space="preserve"> bulduk (</w:t>
       </w:r>
       <m:oMath>
         <m:r>
@@ -6421,7 +6363,7 @@
           <w:b w:val="0"/>
           <w:i w:val="0"/>
         </w:rPr>
-        <w:t xml:space="preserve"> V): </w:t>
+        <w:t xml:space="preserve"> V) </w:t>
       </w:r>
       <m:oMath>
         <m:sSub>
@@ -6479,7 +6421,7 @@
           <w:b w:val="0"/>
           <w:i w:val="0"/>
         </w:rPr>
-        <w:t xml:space="preserve"> bulunur; ekran basamağı nedeniyle aralık geniştir (</w:t>
+        <w:t xml:space="preserve"> bulduk; ekran basamağı yüzünden aralık geniştir (</w:t>
       </w:r>
       <m:oMath>
         <m:r>
@@ -6559,7 +6501,7 @@
           <w:b w:val="0"/>
           <w:i w:val="0"/>
         </w:rPr>
-        <w:t xml:space="preserve"> Bu sayılar şunu söylemektedir: ölçümde multimetrenin devreye gösterdiği direnç yaklaşık </w:t>
+        <w:t xml:space="preserve"> Bulduğumuz sayılara göre multimetre bu ölçümlerde devreye yaklaşık </w:t>
       </w:r>
       <m:oMath>
         <m:r>
@@ -6618,7 +6560,7 @@
           <w:b w:val="0"/>
           <w:i w:val="0"/>
         </w:rPr>
-        <w:t xml:space="preserve"> mertebesindedir; katalog değeri olan </w:t>
+        <w:t xml:space="preserve">’luk bir yük gibi davrandı; bu, katalogdaki </w:t>
       </w:r>
       <m:oMath>
         <m:r>
@@ -6646,7 +6588,29 @@
           <w:b w:val="0"/>
           <w:i w:val="0"/>
         </w:rPr>
-        <w:t xml:space="preserve">’dan yaklaşık 15–30 kat küçüktür. Bu iki sonucun birbirinden farklı çıkması (0,32 ve 0,70), </w:t>
+        <w:t xml:space="preserve">’dan yaklaşık 15–30 kat küçüktür. İki satırın farklı çıkması (0,32 ve 0,70 </w:t>
+      </w:r>
+      <m:oMath>
+        <m:r>
+          <m:rPr>
+            <m:sty m:val="p"/>
+          </m:rPr>
+          <m:t>M</m:t>
+        </m:r>
+        <m:r>
+          <m:rPr>
+            <m:sty m:val="p"/>
+          </m:rPr>
+          <m:t>Ω</m:t>
+        </m:r>
+      </m:oMath>
+      <w:r>
+        <w:rPr>
+          <w:rFonts w:ascii="Times New Roman" w:hAnsi="Times New Roman" w:cs="Times New Roman" w:eastAsia="Times New Roman"/>
+          <w:b w:val="0"/>
+          <w:i w:val="0"/>
+        </w:rPr>
+        <w:t xml:space="preserve">) </w:t>
       </w:r>
       <m:oMath>
         <m:r>
@@ -6699,11 +6663,11 @@
           <w:b w:val="0"/>
           <w:i w:val="0"/>
         </w:rPr>
-        <w:t xml:space="preserve">’nin direnç değerlerine (ölçülmeyen ikinci direnç dâhil) çok duyarlı olmasındandır; iki sayı birlikte tek bir gerçeği gösterir: bu ölçümlerde multimetre, iç direnci katalogdaki </w:t>
+        <w:t xml:space="preserve">’nin direnç değerlerine (özellikle ölçmediğimiz ikinci dirence) çok duyarlı olmasındandır. Bu küçük iç direncin fiziksel nedenini tam belirleyemedik; bunu kesinleştirmek için aleti bilinen bir dirençle (örneğin </w:t>
       </w:r>
       <m:oMath>
         <m:r>
-          <m:t>10</m:t>
+          <m:t>1</m:t>
         </m:r>
         <m:r>
           <m:t> </m:t>
@@ -6727,35 +6691,7 @@
           <w:b w:val="0"/>
           <w:i w:val="0"/>
         </w:rPr>
-        <w:t xml:space="preserve">’dan çok daha küçük bir yük gibi davranmıştır. Bunun nedenini (aletin giriş devresi, kademe, aynı düğüme aynı anda bağlı başka bir ölçü kablosu vb.) fotoğraflardan ve kayıtlardan kesinleştiremedim; kesinleştirmenin yolu, aleti bilinen bir dirençle (örneğin </w:t>
-      </w:r>
-      <m:oMath>
-        <m:r>
-          <m:t>1</m:t>
-        </m:r>
-        <m:r>
-          <m:t> </m:t>
-        </m:r>
-        <m:r>
-          <m:rPr>
-            <m:sty m:val="p"/>
-          </m:rPr>
-          <m:t>M</m:t>
-        </m:r>
-        <m:r>
-          <m:rPr>
-            <m:sty m:val="p"/>
-          </m:rPr>
-          <m:t>Ω</m:t>
-        </m:r>
-      </m:oMath>
-      <w:r>
-        <w:rPr>
-          <w:rFonts w:ascii="Times New Roman" w:hAnsi="Times New Roman" w:cs="Times New Roman" w:eastAsia="Times New Roman"/>
-          <w:b w:val="0"/>
-          <w:i w:val="0"/>
-        </w:rPr>
-        <w:t xml:space="preserve">) bir gerilim kaynağına seri bağlayıp </w:t>
+        <w:t xml:space="preserve">) bir kaynağa seri bağlayıp </w:t>
       </w:r>
       <w:r>
         <w:rPr>
@@ -6771,7 +6707,7 @@
           <w:b w:val="0"/>
           <w:i w:val="0"/>
         </w:rPr>
-        <w:t xml:space="preserve">’i ters çözmektir. Osiloskop ise </w:t>
+        <w:t xml:space="preserve">’i ters çözmek gerekir. Osiloskop </w:t>
       </w:r>
       <m:oMath>
         <m:r>
@@ -6799,7 +6735,7 @@
           <w:b w:val="0"/>
           <w:i w:val="0"/>
         </w:rPr>
-        <w:t xml:space="preserve"> satırında yalnızca %1,3 düşük okumuştur; bu, giriş direncinin multimetreninkinden çok daha büyük göründüğünü gösterir (10× uçla </w:t>
+        <w:t xml:space="preserve"> satırında yalnızca %1,3 düşük okudu; yani giriş direnci multimetreninkinden çok daha büyük göründü (10× uçla </w:t>
       </w:r>
       <m:oMath>
         <m:r>
@@ -6843,7 +6779,7 @@
           <w:b w:val="0"/>
           <w:i w:val="0"/>
         </w:rPr>
-        <w:t xml:space="preserve"> 7,46 V verir, 1× uçla </w:t>
+        <w:t xml:space="preserve"> 7,46 V, 1× uçla </w:t>
       </w:r>
       <m:oMath>
         <m:r>
@@ -6871,7 +6807,7 @@
           <w:b w:val="0"/>
           <w:i w:val="0"/>
         </w:rPr>
-        <w:t xml:space="preserve"> için 7,14 V verirdi; okunan 7,4 V birinciye yakındır, uç tipi kayıtlı değildir).</w:t>
+        <w:t xml:space="preserve"> için 7,14 V verir; okuduğumuz 7,4 V birinciye yakındır, ancak ucun türünü kaydetmedik).</w:t>
       </w:r>
     </w:p>
     <w:p>
@@ -6976,7 +6912,7 @@
           <w:b w:val="0"/>
           <w:i w:val="0"/>
         </w:rPr>
-        <w:t xml:space="preserve"> satırlarında. Nedeni iki aletin devreye farklı iç direnç göstermesidir: </w:t>
+        <w:t xml:space="preserve"> satırlarında. Neden, iki aletin devreye farklı iç direnç göstermesidir: alt dirence paralel giren direnç ne kadar küçükse düğüm gerilimi o kadar düşer (</w:t>
       </w:r>
       <w:r>
         <w:rPr>
@@ -6992,7 +6928,7 @@
           <w:b w:val="0"/>
           <w:i w:val="0"/>
         </w:rPr>
-        <w:t xml:space="preserve">’e göre alt dirence paralel giren direnç ne kadar küçükse düğüm gerilimi o kadar düşer. </w:t>
+        <w:t xml:space="preserve">). </w:t>
       </w:r>
       <m:oMath>
         <m:r>
@@ -7020,7 +6956,7 @@
           <w:b w:val="0"/>
           <w:i w:val="0"/>
         </w:rPr>
-        <w:t xml:space="preserve">’da yüksek iç dirençli alet (osiloskop, 7,4 V) beklenen değere yakın, daha düşük iç dirençli alet (multimetre, 6,5 V) ise belirgin biçimde düşük göstermiştir. </w:t>
+        <w:t xml:space="preserve">’da iç direnci yüksek alet (osiloskop, 7,4 V) beklenene yakın, iç direnci düşük görünen alet (multimetre, 6,5 V) belirgin biçimde düşük okudu. </w:t>
       </w:r>
       <m:oMath>
         <m:r>
@@ -7048,7 +6984,7 @@
           <w:b w:val="0"/>
           <w:i w:val="0"/>
         </w:rPr>
-        <w:t xml:space="preserve"> satırında fark daha da büyüktür (multimetre 0,9 V; osiloskopta 7,5 V civarında beklenen DA değer yerine, en büyük değeri 9,40 V olan 50 Hz’lik bir sinüs). Osiloskoptaki sinüs, şebekenin (50 Hz) yüksek empedanslı düğüme kapasitif olarak indüklediği parazit gerilimdir: düğümün kaynak direnci (bu satırda yaklaşık </w:t>
+        <w:t xml:space="preserve"> satırında fark daha da büyüktür: multimetre 0,9 V gösterdi; osiloskopta ise beklenen DA değer yerine, en büyük değeri 9,40 V olan 50 Hz’lik bir sinüs gördük. Bu sinüs, şebekenin yüksek empedanslı düğüme kapasitif olarak kattığı paraziti gösterir: düğümün direnci (bu satırda yaklaşık </w:t>
       </w:r>
       <m:oMath>
         <m:r>
@@ -7076,7 +7012,7 @@
           <w:b w:val="0"/>
           <w:i w:val="0"/>
         </w:rPr>
-        <w:t>) büyük olduğunda aynı küçük kaçak akım büyük bir gerilim doğurur. Burada 9,40 V bir DA değeri değil, dalganın en büyük anlık değeridir (tepeden tepeye 21,4 V, en küçük −12,0 V), bu yüzden 7,5 V’la karşılaştırılamaz; osiloskop ekranında DA değeri ancak bu parazit süzülürse (örneğin bir kapasitörle veya AC kuplaj yerine DA kuplajda ortalama alınarak) okunabilir. Multimetre ise bu salınımı ortalar ve tek bir sayı gösterir; bu yüzden iki aletin bu satırdaki “farkı” gerçekte iki ayrı olgunun farkıdır.</w:t>
+        <w:t>) büyük olunca aynı küçük kaçak akım büyük bir gerilim doğurur. Buradaki 9,40 V bir DA değeri değil dalganın en büyük anlık değeridir (en küçük −12,0 V, tepeden tepeye 21,4 V); bu yüzden 7,5 V ile doğrudan karşılaştırılamaz. Multimetre salınımı ortalayıp tek bir sayı gösterdiği için iki aletin bu satırdaki farkı aslında iki ayrı olgunun farkıdır.</w:t>
       </w:r>
     </w:p>
     <w:p>
@@ -7103,7 +7039,7 @@
           <w:b w:val="0"/>
           <w:i w:val="0"/>
         </w:rPr>
-        <w:t xml:space="preserve">Ölçü aleti devreye paralel girdiğinden, ölçülen düğümün direnci </w:t>
+        <w:t xml:space="preserve">Ölçü aleti devreye paralel girdiğinden ölçülen düğümün direnci </w:t>
       </w:r>
       <m:oMath>
         <m:r>
@@ -7150,7 +7086,7 @@
           <w:b w:val="0"/>
           <w:i w:val="0"/>
         </w:rPr>
-        <w:t xml:space="preserve">’ye iner. Bağıl yük hatası yaklaşık </w:t>
+        <w:t xml:space="preserve">’ye düşer. Hata </w:t>
       </w:r>
       <m:oMath>
         <m:r>
@@ -7218,7 +7154,7 @@
           <w:b w:val="0"/>
           <w:i w:val="0"/>
         </w:rPr>
-        <w:t xml:space="preserve"> ise hata ihmal edilebilir; </w:t>
+        <w:t xml:space="preserve"> ise hata ihmal edilebilir, </w:t>
       </w:r>
       <m:oMath>
         <m:sSub>
@@ -7252,7 +7188,7 @@
           <w:b w:val="0"/>
           <w:i w:val="0"/>
         </w:rPr>
-        <w:t xml:space="preserve"> ise gerilim yaklaşık yarıya iner; </w:t>
+        <w:t xml:space="preserve"> ise gerilim yaklaşık yarıya iner, </w:t>
       </w:r>
       <m:oMath>
         <m:sSub>
@@ -7286,7 +7222,7 @@
           <w:b w:val="0"/>
           <w:i w:val="0"/>
         </w:rPr>
-        <w:t xml:space="preserve"> ise okuma sıfıra yaklaşır. Ölçümlerimiz bunu açıkça göstermektedir: multimetrenin görünen iç direnci yaklaşık </w:t>
+        <w:t xml:space="preserve"> ise okuma sıfıra yaklaşır. Ölçümlerimiz bunu gösterdi: multimetrenin görünen iç direnci yaklaşık </w:t>
       </w:r>
       <m:oMath>
         <m:r>
@@ -7422,7 +7358,7 @@
           <w:b w:val="0"/>
           <w:i w:val="0"/>
         </w:rPr>
-        <w:t xml:space="preserve">) etki yoktur, </w:t>
+        <w:t xml:space="preserve">) etki görmedik; </w:t>
       </w:r>
       <m:oMath>
         <m:r>
@@ -7573,7 +7509,7 @@
           <w:b w:val="0"/>
           <w:i w:val="0"/>
         </w:rPr>
-        <w:t>) 0,9 V’a inmiştir. Kural şudur: ölçü aleti, ölçülen düğümün Thevenin direncinin en az 100 katı kadar iç dirence sahip olmalıdır. Bu sağlanamadığında ya kuramsal yüklü değer (</w:t>
+        <w:t>) 0,9 V’a düştü. Kural olarak ölçü aletinin iç direnci, ölçülen düğümün Thevenin direncinin en az 100 katı olmalıdır. Bu sağlanamıyorsa yüklü değer (</w:t>
       </w:r>
       <w:r>
         <w:rPr>
@@ -7589,7 +7525,7 @@
           <w:b w:val="0"/>
           <w:i w:val="0"/>
         </w:rPr>
-        <w:t>) hesaplanmalı, ya daha yüksek iç dirençli bir alet (veya 10× osiloskop ucu) kullanılmalı, ya da ölçülen düğümün direnci küçültülmelidir.</w:t>
+        <w:t>) hesaplanmalı, daha yüksek iç dirençli bir alet (veya 10× osiloskop ucu) kullanılmalı ya da düğümün direnci küçültülmelidir.</w:t>
       </w:r>
     </w:p>
     <w:p>
@@ -7632,7 +7568,7 @@
           <w:b w:val="0"/>
           <w:i w:val="0"/>
         </w:rPr>
-        <w:t xml:space="preserve">Föydeki Şekil 2’deki köprü </w:t>
+        <w:t xml:space="preserve">Föydeki Şekil 2’deki köprüyü </w:t>
       </w:r>
       <m:oMath>
         <m:sSub>
@@ -7669,7 +7605,7 @@
           <w:b w:val="0"/>
           <w:i w:val="0"/>
         </w:rPr>
-        <w:t xml:space="preserve"> V ile beslenmiş, </w:t>
+        <w:t xml:space="preserve"> V ile besledik; </w:t>
       </w:r>
       <m:oMath>
         <m:sSub>
@@ -7724,7 +7660,7 @@
           <w:b w:val="0"/>
           <w:i w:val="0"/>
         </w:rPr>
-        <w:t xml:space="preserve"> (renk kodu), </w:t>
+        <w:t xml:space="preserve"> (renk kodu) aldık, </w:t>
       </w:r>
       <m:oMath>
         <m:sSub>
@@ -7746,7 +7682,7 @@
           <w:b w:val="0"/>
           <w:i w:val="0"/>
         </w:rPr>
-        <w:t xml:space="preserve"> yerine potansiyometre ve </w:t>
+        <w:t xml:space="preserve"> yerine potansiyometre, </w:t>
       </w:r>
       <m:oMath>
         <m:sSub>
@@ -7768,7 +7704,7 @@
           <w:b w:val="0"/>
           <w:i w:val="0"/>
         </w:rPr>
-        <w:t xml:space="preserve"> yerine laboratuvar asistanının verdiği bilinmeyen direnç bağlanmıştır. </w:t>
+        <w:t xml:space="preserve"> yerine laboratuvar asistanının verdiği bilinmeyen direnci bağladık. Devre tahtası yerleşimi </w:t>
       </w:r>
       <w:r>
         <w:rPr>
@@ -7784,7 +7720,7 @@
           <w:b w:val="0"/>
           <w:i w:val="0"/>
         </w:rPr>
-        <w:t xml:space="preserve">’de devre tahtası yerleşimi gösterilmiştir. </w:t>
+        <w:t xml:space="preserve">’de görülmektedir. </w:t>
       </w:r>
       <m:oMath>
         <m:sSub>
@@ -7996,7 +7932,7 @@
           <w:i w:val="0"/>
           <w:sz w:val="20"/>
         </w:rPr>
-        <w:t xml:space="preserve"> yerine bağlanmıştır; </w:t>
+        <w:t xml:space="preserve"> yerine bağlanır; </w:t>
       </w:r>
       <m:oMath>
         <m:sSub>
@@ -8690,7 +8626,7 @@
           <w:b w:val="0"/>
           <w:i w:val="0"/>
         </w:rPr>
-        <w:t xml:space="preserve">Dengenin kaynak değerinden bağımsız olması köprünün asıl gücüdür: sonuç </w:t>
+        <w:t xml:space="preserve">Dengenin kaynak geriliminden bağımsız olması köprünün asıl avantajıdır: sonuç </w:t>
       </w:r>
       <m:oMath>
         <m:sSub>
@@ -8712,7 +8648,7 @@
           <w:b w:val="0"/>
           <w:i w:val="0"/>
         </w:rPr>
-        <w:t>’in dalgalanmasından etkilenmez ve yalnızca üç direncin oranına dayanır. Ölçülen değerlerle (</w:t>
+        <w:t>’in dalgalanmasından etkilenmez, yalnızca direnç oranlarına bağlıdır. Ölçtüğümüz değerleri (</w:t>
       </w:r>
       <m:oMath>
         <m:sSub>
@@ -8841,7 +8777,7 @@
           <w:b w:val="0"/>
           <w:i w:val="0"/>
         </w:rPr>
-        <w:t>) bilinmeyen direnç:</w:t>
+        <w:t>) kullanınca:</w:t>
       </w:r>
     </w:p>
     <w:tbl>
@@ -9013,7 +8949,7 @@
       <w:r>
         <w:drawing>
           <wp:inline xmlns:a="http://schemas.openxmlformats.org/drawingml/2006/main" xmlns:pic="http://schemas.openxmlformats.org/drawingml/2006/picture">
-            <wp:extent cx="5580000" cy="2982323"/>
+            <wp:extent cx="5580000" cy="2797904"/>
             <wp:docPr id="10" name="Picture 10"/>
             <wp:cNvGraphicFramePr>
               <a:graphicFrameLocks noChangeAspect="1"/>
@@ -9034,7 +8970,7 @@
                   <pic:spPr>
                     <a:xfrm>
                       <a:off x="0" y="0"/>
-                      <a:ext cx="5580000" cy="2982323"/>
+                      <a:ext cx="5580000" cy="2797904"/>
                     </a:xfrm>
                     <a:prstGeom prst="rect"/>
                   </pic:spPr>
@@ -9072,21 +9008,6 @@
             </m:r>
           </m:sub>
         </m:sSub>
-        <m:r>
-          <m:rPr>
-            <m:sty m:val="p"/>
-          </m:rPr>
-          <m:t>=</m:t>
-        </m:r>
-        <m:r>
-          <m:t>456</m:t>
-        </m:r>
-        <m:r>
-          <m:t> </m:t>
-        </m:r>
-        <m:r>
-          <m:t>Ω</m:t>
-        </m:r>
       </m:oMath>
       <w:r>
         <w:rPr>
@@ -9110,21 +9031,6 @@
             </m:r>
           </m:sub>
         </m:sSub>
-        <m:r>
-          <m:rPr>
-            <m:sty m:val="p"/>
-          </m:rPr>
-          <m:t>=</m:t>
-        </m:r>
-        <m:r>
-          <m:t>464</m:t>
-        </m:r>
-        <m:r>
-          <m:t> </m:t>
-        </m:r>
-        <m:r>
-          <m:t>Ω</m:t>
-        </m:r>
       </m:oMath>
       <w:r>
         <w:rPr>
@@ -9133,7 +9039,7 @@
           <w:i w:val="0"/>
           <w:sz w:val="20"/>
         </w:rPr>
-        <w:t xml:space="preserve"> okumaları (fotoğraf sırasıyla), </w:t>
+        <w:t xml:space="preserve"> ölçümleri (464 Ω ve 456 Ω) ve devreden çıkarılmış potansiyometrenin (</w:t>
       </w:r>
       <m:oMath>
         <m:sSub>
@@ -9156,15 +9062,9 @@
           <w:i w:val="0"/>
           <w:sz w:val="20"/>
         </w:rPr>
-        <w:t xml:space="preserve"> (devreden çıkarılmış potansiyometre) </w:t>
+        <w:t xml:space="preserve">) ölçümü, </w:t>
       </w:r>
       <m:oMath>
-        <m:r>
-          <m:rPr>
-            <m:sty m:val="p"/>
-          </m:rPr>
-          <m:t>=</m:t>
-        </m:r>
         <m:r>
           <m:t>3</m:t>
         </m:r>
@@ -9264,7 +9164,7 @@
           <w:i w:val="0"/>
           <w:sz w:val="20"/>
         </w:rPr>
-        <w:t xml:space="preserve">’in doğrudan ölçümü </w:t>
+        <w:t>’in tek başına ölçümü (</w:t>
       </w:r>
       <m:oMath>
         <m:r>
@@ -9302,7 +9202,7 @@
           <w:i w:val="0"/>
           <w:sz w:val="20"/>
         </w:rPr>
-        <w:t xml:space="preserve"> ve potansiyometrenin devre tahtasındaki hâli.</w:t>
+        <w:t>) ve devre tahtası.</w:t>
       </w:r>
     </w:p>
     <w:p>
@@ -9315,18 +9215,18 @@
           <w:b w:val="0"/>
           <w:i w:val="0"/>
         </w:rPr>
-        <w:t xml:space="preserve">Föydeki el yazısı notlarda </w:t>
+        <w:t xml:space="preserve">Köprüyü, </w:t>
       </w:r>
       <m:oMath>
         <m:sSub>
           <m:e>
             <m:r>
-              <m:t>R</m:t>
+              <m:t>V</m:t>
             </m:r>
           </m:e>
           <m:sub>
             <m:r>
-              <m:t>1</m:t>
+              <m:t>B</m:t>
             </m:r>
           </m:sub>
         </m:sSub>
@@ -9337,13 +9237,7 @@
           <m:t>=</m:t>
         </m:r>
         <m:r>
-          <m:t>464</m:t>
-        </m:r>
-        <m:r>
-          <m:t> </m:t>
-        </m:r>
-        <m:r>
-          <m:t>Ω</m:t>
+          <m:t>0</m:t>
         </m:r>
       </m:oMath>
       <w:r>
@@ -9352,44 +9246,7 @@
           <w:b w:val="0"/>
           <w:i w:val="0"/>
         </w:rPr>
-        <w:t xml:space="preserve"> ve </w:t>
-      </w:r>
-      <m:oMath>
-        <m:sSub>
-          <m:e>
-            <m:r>
-              <m:t>R</m:t>
-            </m:r>
-          </m:e>
-          <m:sub>
-            <m:r>
-              <m:t>2</m:t>
-            </m:r>
-          </m:sub>
-        </m:sSub>
-        <m:r>
-          <m:rPr>
-            <m:sty m:val="p"/>
-          </m:rPr>
-          <m:t>=</m:t>
-        </m:r>
-        <m:r>
-          <m:t>456</m:t>
-        </m:r>
-        <m:r>
-          <m:t> </m:t>
-        </m:r>
-        <m:r>
-          <m:t>Ω</m:t>
-        </m:r>
-      </m:oMath>
-      <w:r>
-        <w:rPr>
-          <w:rFonts w:ascii="Times New Roman" w:hAnsi="Times New Roman" w:cs="Times New Roman" w:eastAsia="Times New Roman"/>
-          <w:b w:val="0"/>
-          <w:i w:val="0"/>
-        </w:rPr>
-        <w:t xml:space="preserve"> yazılıdır; hesap bu değerlerle yapılmıştır. </w:t>
+        <w:t xml:space="preserve"> olana kadar potansiyometreyi çevirerek dengeledik; sonra potansiyometreyi devreden çıkarıp multimetreyle ölçtük ve </w:t>
       </w:r>
       <m:oMath>
         <m:sSub>
@@ -9404,6 +9261,39 @@
             </m:r>
           </m:sub>
         </m:sSub>
+        <m:r>
+          <m:rPr>
+            <m:sty m:val="p"/>
+          </m:rPr>
+          <m:t>=</m:t>
+        </m:r>
+        <m:r>
+          <m:t>3</m:t>
+        </m:r>
+        <m:r>
+          <m:rPr>
+            <m:sty m:val="p"/>
+          </m:rPr>
+          <m:t>,</m:t>
+        </m:r>
+        <m:r>
+          <m:t>22</m:t>
+        </m:r>
+        <m:r>
+          <m:t> </m:t>
+        </m:r>
+        <m:r>
+          <m:rPr>
+            <m:sty m:val="p"/>
+          </m:rPr>
+          <m:t>k</m:t>
+        </m:r>
+        <m:r>
+          <m:rPr>
+            <m:sty m:val="p"/>
+          </m:rPr>
+          <m:t>Ω</m:t>
+        </m:r>
       </m:oMath>
       <w:r>
         <w:rPr>
@@ -9411,75 +9301,7 @@
           <w:b w:val="0"/>
           <w:i w:val="0"/>
         </w:rPr>
-        <w:t xml:space="preserve"> potansiyometredir; </w:t>
-      </w:r>
-      <m:oMath>
-        <m:sSub>
-          <m:e>
-            <m:r>
-              <m:t>V</m:t>
-            </m:r>
-          </m:e>
-          <m:sub>
-            <m:r>
-              <m:t>B</m:t>
-            </m:r>
-          </m:sub>
-        </m:sSub>
-        <m:r>
-          <m:rPr>
-            <m:sty m:val="p"/>
-          </m:rPr>
-          <m:t>=</m:t>
-        </m:r>
-        <m:r>
-          <m:t>0</m:t>
-        </m:r>
-      </m:oMath>
-      <w:r>
-        <w:rPr>
-          <w:rFonts w:ascii="Times New Roman" w:hAnsi="Times New Roman" w:cs="Times New Roman" w:eastAsia="Times New Roman"/>
-          <w:b w:val="0"/>
-          <w:i w:val="0"/>
-        </w:rPr>
-        <w:t xml:space="preserve"> olunca devreden çıkarılıp multimetreyle ölçülmüş ve </w:t>
-      </w:r>
-      <m:oMath>
-        <m:r>
-          <m:t>3</m:t>
-        </m:r>
-        <m:r>
-          <m:rPr>
-            <m:sty m:val="p"/>
-          </m:rPr>
-          <m:t>,</m:t>
-        </m:r>
-        <m:r>
-          <m:t>22</m:t>
-        </m:r>
-        <m:r>
-          <m:t> </m:t>
-        </m:r>
-        <m:r>
-          <m:rPr>
-            <m:sty m:val="p"/>
-          </m:rPr>
-          <m:t>k</m:t>
-        </m:r>
-        <m:r>
-          <m:rPr>
-            <m:sty m:val="p"/>
-          </m:rPr>
-          <m:t>Ω</m:t>
-        </m:r>
-      </m:oMath>
-      <w:r>
-        <w:rPr>
-          <w:rFonts w:ascii="Times New Roman" w:hAnsi="Times New Roman" w:cs="Times New Roman" w:eastAsia="Times New Roman"/>
-          <w:b w:val="0"/>
-          <w:i w:val="0"/>
-        </w:rPr>
-        <w:t xml:space="preserve"> bulunmuştur. </w:t>
+        <w:t xml:space="preserve"> bulduk. </w:t>
       </w:r>
       <m:oMath>
         <m:sSub>
@@ -9501,7 +9323,7 @@
           <w:b w:val="0"/>
           <w:i w:val="0"/>
         </w:rPr>
-        <w:t xml:space="preserve"> ise tek başına multimetreyle ölçülmüş ve </w:t>
+        <w:t xml:space="preserve">’i de ayrıca tek başına multimetreyle ölçtük ve </w:t>
       </w:r>
       <m:oMath>
         <m:r>
@@ -9538,7 +9360,7 @@
           <w:b w:val="0"/>
           <w:i w:val="0"/>
         </w:rPr>
-        <w:t xml:space="preserve"> bulunmuştur. Üzerindeki renk kodu </w:t>
+        <w:t xml:space="preserve"> bulduk. Üzerindeki renk kodu </w:t>
       </w:r>
       <m:oMath>
         <m:r>
@@ -9597,7 +9419,7 @@
           <w:b w:val="0"/>
           <w:i w:val="0"/>
         </w:rPr>
-        <w:t xml:space="preserve"> ve </w:t>
+        <w:t xml:space="preserve"> ile </w:t>
       </w:r>
       <m:oMath>
         <m:sSub>
@@ -9619,66 +9441,7 @@
           <w:b w:val="0"/>
           <w:i w:val="0"/>
         </w:rPr>
-        <w:t xml:space="preserve">’ün tanımı arasında bir tutarsızlık vardır (föydeki Tablo 4’ün Wheatstone satırına el ile </w:t>
-      </w:r>
-      <m:oMath>
-        <m:sSub>
-          <m:e>
-            <m:r>
-              <m:t>R</m:t>
-            </m:r>
-          </m:e>
-          <m:sub>
-            <m:r>
-              <m:t>3</m:t>
-            </m:r>
-          </m:sub>
-        </m:sSub>
-      </m:oMath>
-      <w:r>
-        <w:rPr>
-          <w:rFonts w:ascii="Times New Roman" w:hAnsi="Times New Roman" w:cs="Times New Roman" w:eastAsia="Times New Roman"/>
-          <w:b w:val="0"/>
-          <w:i w:val="0"/>
-        </w:rPr>
-        <w:t xml:space="preserve">’ün kendisi, </w:t>
-      </w:r>
-      <m:oMath>
-        <m:r>
-          <m:t>3</m:t>
-        </m:r>
-        <m:r>
-          <m:rPr>
-            <m:sty m:val="p"/>
-          </m:rPr>
-          <m:t>,</m:t>
-        </m:r>
-        <m:r>
-          <m:t>22</m:t>
-        </m:r>
-        <m:r>
-          <m:t> </m:t>
-        </m:r>
-        <m:r>
-          <m:rPr>
-            <m:sty m:val="p"/>
-          </m:rPr>
-          <m:t>k</m:t>
-        </m:r>
-        <m:r>
-          <m:rPr>
-            <m:sty m:val="p"/>
-          </m:rPr>
-          <m:t>Ω</m:t>
-        </m:r>
-      </m:oMath>
-      <w:r>
-        <w:rPr>
-          <w:rFonts w:ascii="Times New Roman" w:hAnsi="Times New Roman" w:cs="Times New Roman" w:eastAsia="Times New Roman"/>
-          <w:b w:val="0"/>
-          <w:i w:val="0"/>
-        </w:rPr>
-        <w:t xml:space="preserve"> yazılmıştır); bu raporda Wheatstone ölçümü olarak </w:t>
+        <w:t>’ün tanımları arasında bir karışıklık olduğunu fark ettik; Tablo 4’ün Wheatstone satırı için formülden (</w:t>
       </w:r>
       <w:r>
         <w:rPr>
@@ -9694,7 +9457,7 @@
           <w:b w:val="0"/>
           <w:i w:val="0"/>
         </w:rPr>
-        <w:t xml:space="preserve"> ile hesaplanan </w:t>
+        <w:t xml:space="preserve">) hesaplanan </w:t>
       </w:r>
       <m:oMath>
         <m:sSub>
@@ -9716,7 +9479,7 @@
           <w:b w:val="0"/>
           <w:i w:val="0"/>
         </w:rPr>
-        <w:t xml:space="preserve"> kullanılmıştır.</w:t>
+        <w:t>’i kullandık.</w:t>
       </w:r>
     </w:p>
     <w:p>
@@ -10205,7 +9968,7 @@
           <w:b w:val="0"/>
           <w:i w:val="0"/>
         </w:rPr>
-        <w:t xml:space="preserve">Renk kodu ± %5 toleransla </w:t>
+        <w:t xml:space="preserve">Renk kodu ±%5 toleransla </w:t>
       </w:r>
       <m:oMath>
         <m:r>
@@ -10237,7 +10000,7 @@
           <w:b w:val="0"/>
           <w:i w:val="0"/>
         </w:rPr>
-        <w:t xml:space="preserve"> aralığını verir. Her iki ölçüm de bu aralıktadır.</w:t>
+        <w:t xml:space="preserve"> aralığını verir; iki ölçüm de bu aralıktadır.</w:t>
       </w:r>
     </w:p>
     <w:p>
@@ -10273,7 +10036,7 @@
           <w:b w:val="0"/>
           <w:i w:val="0"/>
         </w:rPr>
-        <w:t xml:space="preserve"> Köprü yöntemiyle 3.164 Ω, multimetreyle 3260 Ω bulunmuştur; fark -2,93 %’dir. Fark küçüktür ama köprünün belirsizliğinden büyüktür: </w:t>
+        <w:t xml:space="preserve"> Köprüyle 3.164 Ω, multimetreyle 3260 Ω bulduk; fark -2,93 %. Fark küçük ama köprünün belirsizliğinden büyük: </w:t>
       </w:r>
       <m:oMath>
         <m:sSub>
@@ -10295,7 +10058,7 @@
           <w:b w:val="0"/>
           <w:i w:val="0"/>
         </w:rPr>
-        <w:t xml:space="preserve"> ekranda 0,00 V okunduğundan denge hatası en çok ±5 mV’tur ve bu </w:t>
+        <w:t xml:space="preserve"> ekranda 0,00 V okunduğu için denge hatası en çok ±5 mV’tur ve bu </w:t>
       </w:r>
       <m:oMath>
         <m:sSub>
@@ -10317,7 +10080,7 @@
           <w:b w:val="0"/>
           <w:i w:val="0"/>
         </w:rPr>
-        <w:t xml:space="preserve">’te yaklaşık %0,3 sapmaya karşılık gelir; </w:t>
+        <w:t xml:space="preserve">’te yaklaşık %0,3’e karşılık gelir; </w:t>
       </w:r>
       <m:oMath>
         <m:sSub>
@@ -10383,7 +10146,7 @@
           <w:b w:val="0"/>
           <w:i w:val="0"/>
         </w:rPr>
-        <w:t xml:space="preserve"> okumalarının son basamakları toplam %0,5 mertebesinde belirsizlik ekler. Kalan farkın olası nedenleri: (a) devre tahtasındaki kontak ve jumper dirençleri (</w:t>
+        <w:t xml:space="preserve"> okumalarının son basamakları da toplam %0,5 kadar belirsizlik katar. Kalan farkı şu nedenlere bağlıyoruz: (a) devre tahtasındaki kontak ve jumper dirençleri (</w:t>
       </w:r>
       <m:oMath>
         <m:sSub>
@@ -10405,51 +10168,7 @@
           <w:b w:val="0"/>
           <w:i w:val="0"/>
         </w:rPr>
-        <w:t xml:space="preserve"> devreden çıkarılıp ölçüldüğünde bu dirençler ölçüme girmez, oysa köprü dengelenirken kolun içindedirler; bir kolda yaklaşık 100 Ω fazladan direnç %3’lük farkı doğurur), (b) potansiyometre sürgüsünün temas direnci, (c) </w:t>
-      </w:r>
-      <m:oMath>
-        <m:sSub>
-          <m:e>
-            <m:r>
-              <m:t>R</m:t>
-            </m:r>
-          </m:e>
-          <m:sub>
-            <m:r>
-              <m:t>1</m:t>
-            </m:r>
-          </m:sub>
-        </m:sSub>
-      </m:oMath>
-      <w:r>
-        <w:rPr>
-          <w:rFonts w:ascii="Times New Roman" w:hAnsi="Times New Roman" w:cs="Times New Roman" w:eastAsia="Times New Roman"/>
-          <w:b w:val="0"/>
-          <w:i w:val="0"/>
-        </w:rPr>
-        <w:t xml:space="preserve"> ve </w:t>
-      </w:r>
-      <m:oMath>
-        <m:sSub>
-          <m:e>
-            <m:r>
-              <m:t>R</m:t>
-            </m:r>
-          </m:e>
-          <m:sub>
-            <m:r>
-              <m:t>2</m:t>
-            </m:r>
-          </m:sub>
-        </m:sSub>
-      </m:oMath>
-      <w:r>
-        <w:rPr>
-          <w:rFonts w:ascii="Times New Roman" w:hAnsi="Times New Roman" w:cs="Times New Roman" w:eastAsia="Times New Roman"/>
-          <w:b w:val="0"/>
-          <w:i w:val="0"/>
-        </w:rPr>
-        <w:t xml:space="preserve"> değerlerinin, devre içinde ve devre dışında ölçüldüğünde farklı okunabilmesi. Köprünün kendi gücü ise sonucun kaynak geriliminden bağımsız olmasıdır.</w:t>
+        <w:t xml:space="preserve"> devreden çıkarılıp ölçülünce bu dirençler ölçüme girmez, köprü dengelenirken ise kolun içindedirler; bir kolda yaklaşık 100 Ω fazladan direnç %3’lük farkı doğurur), (b) potansiyometre sürgüsünün temas direnci, (c) dirençlerin devre içinde ve dışında farklı okunabilmesi.</w:t>
       </w:r>
     </w:p>
     <w:p>
@@ -10462,7 +10181,7 @@
           <w:b/>
           <w:i w:val="0"/>
         </w:rPr>
-        <w:t>Ölçümler renk koduyla uyumlu mudur?</w:t>
+        <w:t>Ölçümler renk koduyla uyumlu mu?</w:t>
       </w:r>
       <w:r>
         <w:rPr>
@@ -10470,7 +10189,7 @@
           <w:b w:val="0"/>
           <w:i w:val="0"/>
         </w:rPr>
-        <w:t xml:space="preserve"> Evet: multimetre -1,21 %, köprü -4,11 % sapmıştır ve ikisi de %5 tolerans aralığının içindedir. Renk kodunun bir hedef değer, ölçümün gerçek değer olduğu bu örnekte de görülmektedir.</w:t>
+        <w:t xml:space="preserve"> Evet: multimetre -1,21 %, köprü -4,11 % saptı ve ikisi de %5 tolerans aralığının içinde. Renk kodunun bir hedef değer olduğunu, gerçek değerin ise bu hedefin etrafında dağıldığını burada da gördük.</w:t>
       </w:r>
     </w:p>
     <w:p>
@@ -10513,7 +10232,7 @@
           <w:b w:val="0"/>
           <w:i w:val="0"/>
         </w:rPr>
-        <w:t xml:space="preserve">Föydeki Şekil 3’teki 3 bitlik R-2R merdiven DAC’ında her bit, </w:t>
+        <w:t xml:space="preserve">Föydeki Şekil 3’teki 3 bitlik R-2R merdiven DAC’ında her bit </w:t>
       </w:r>
       <m:oMath>
         <m:r>
@@ -10569,7 +10288,7 @@
           <w:b w:val="0"/>
           <w:i w:val="0"/>
         </w:rPr>
-        <w:t xml:space="preserve">’luk seri direnç ile </w:t>
+        <w:t xml:space="preserve">’luk seri direnç ve </w:t>
       </w:r>
       <m:oMath>
         <m:r>
@@ -10643,7 +10362,7 @@
           <w:b w:val="0"/>
           <w:i w:val="0"/>
         </w:rPr>
-        <w:t xml:space="preserve"> yük direncinden oluşur. Mantık “1” için giriş 16 V’a, “0” için toprağa bağlanır. </w:t>
+        <w:t xml:space="preserve">’luk yük direncinden oluşur. Mantık “1” için girişi 16 V’a, “0” için toprağa bağladık. Devre tahtası yerleşimi </w:t>
       </w:r>
       <w:r>
         <w:rPr>
@@ -10659,7 +10378,7 @@
           <w:b w:val="0"/>
           <w:i w:val="0"/>
         </w:rPr>
-        <w:t>’de devre tahtası yerleşimi gösterilmiştir (en üstteki bit MSB, ilk giriştir).</w:t>
+        <w:t>’dedir.</w:t>
       </w:r>
     </w:p>
     <w:p>
@@ -10790,7 +10509,7 @@
           <w:b w:val="0"/>
           <w:i w:val="0"/>
         </w:rPr>
-        <w:t xml:space="preserve">Devre doğrusal olduğundan çıkış, her bitin tek başına yarattığı çıkışların toplamıdır (süperpozisyon). Düğümler, giriş dirençlerinin merdivenle birleştiği </w:t>
+        <w:t xml:space="preserve">Devre doğrusal olduğundan çıkış, her bitin tek başına yarattığı çıkışların toplamıdır (süperpozisyon). Giriş dirençlerinin merdivenle birleştiği üç düğüm vardır: </w:t>
       </w:r>
       <m:oMath>
         <m:r>
@@ -10851,7 +10570,7 @@
           <w:b w:val="0"/>
           <w:i w:val="0"/>
         </w:rPr>
-        <w:t xml:space="preserve"> olmak üzere üç tanedir; düğüm denklemleri iletkenlik matrisiyle şöyle yazılır (</w:t>
+        <w:t>. Düğüm denklemleri (</w:t>
       </w:r>
       <m:oMath>
         <m:sSub>
@@ -11524,7 +11243,7 @@
           <w:b w:val="0"/>
           <w:i w:val="0"/>
         </w:rPr>
-        <w:t xml:space="preserve">Bu denklem çözüldüğünde (Python ile sayısal çözülmüş ve elle de doğrulanmıştır) her bitin </w:t>
+        <w:t xml:space="preserve">Denklemi çözünce her bitin </w:t>
       </w:r>
       <m:oMath>
         <m:sSub>
@@ -11546,7 +11265,7 @@
           <w:b w:val="0"/>
           <w:i w:val="0"/>
         </w:rPr>
-        <w:t xml:space="preserve">’ya katkısının, bit ağırlıklarıyla orantılı olduğu görülür: MSB için 4 V, orta bit için 2 V, LSB için 1 V. Yani devre </w:t>
+        <w:t xml:space="preserve">’ya katkısının bit ağırlığıyla orantılı olduğunu bulduk: en anlamlı bit için 4 V, ortadaki için 2 V, en az anlamlı bit için 1 V. Yani devre </w:t>
       </w:r>
       <m:oMath>
         <m:sSub>
@@ -11656,7 +11375,7 @@
           <w:b w:val="0"/>
           <w:i w:val="0"/>
         </w:rPr>
-        <w:t xml:space="preserve"> dönüşümünü yapar. Giriş </w:t>
+        <w:t xml:space="preserve"> dönüşümünü yapar. Buna göre </w:t>
       </w:r>
       <m:oMath>
         <m:r>
@@ -11695,7 +11414,7 @@
           <w:b w:val="0"/>
           <w:i w:val="0"/>
         </w:rPr>
-        <w:t xml:space="preserve"> için kuramsal çıkışlar sırasıyla </w:t>
+        <w:t xml:space="preserve"> girişleri için beklenen çıkışlar </w:t>
       </w:r>
       <m:oMath>
         <m:r>
@@ -11734,86 +11453,7 @@
           <w:b w:val="0"/>
           <w:i w:val="0"/>
         </w:rPr>
-        <w:t xml:space="preserve"> V’tur (</w:t>
-      </w:r>
-      <m:oMath>
-        <m:r>
-          <m:t>4</m:t>
-        </m:r>
-        <m:r>
-          <m:rPr>
-            <m:sty m:val="p"/>
-          </m:rPr>
-          <m:t>+</m:t>
-        </m:r>
-        <m:r>
-          <m:t>2</m:t>
-        </m:r>
-        <m:r>
-          <m:rPr>
-            <m:sty m:val="p"/>
-          </m:rPr>
-          <m:t>+</m:t>
-        </m:r>
-        <m:r>
-          <m:t>1</m:t>
-        </m:r>
-        <m:r>
-          <m:rPr>
-            <m:sty m:val="p"/>
-          </m:rPr>
-          <m:t>=</m:t>
-        </m:r>
-        <m:r>
-          <m:t>7</m:t>
-        </m:r>
-      </m:oMath>
-      <w:r>
-        <w:rPr>
-          <w:rFonts w:ascii="Times New Roman" w:hAnsi="Times New Roman" w:cs="Times New Roman" w:eastAsia="Times New Roman"/>
-          <w:b w:val="0"/>
-          <w:i w:val="0"/>
-        </w:rPr>
-        <w:t xml:space="preserve">; </w:t>
-      </w:r>
-      <m:oMath>
-        <m:r>
-          <m:t>100</m:t>
-        </m:r>
-      </m:oMath>
-      <w:r>
-        <w:rPr>
-          <w:rFonts w:ascii="Times New Roman" w:hAnsi="Times New Roman" w:cs="Times New Roman" w:eastAsia="Times New Roman"/>
-          <w:b w:val="0"/>
-          <w:i w:val="0"/>
-        </w:rPr>
-        <w:t xml:space="preserve"> ve </w:t>
-      </w:r>
-      <m:oMath>
-        <m:r>
-          <m:t>011</m:t>
-        </m:r>
-      </m:oMath>
-      <w:r>
-        <w:rPr>
-          <w:rFonts w:ascii="Times New Roman" w:hAnsi="Times New Roman" w:cs="Times New Roman" w:eastAsia="Times New Roman"/>
-          <w:b w:val="0"/>
-          <w:i w:val="0"/>
-        </w:rPr>
-        <w:t xml:space="preserve">’in toplamı da </w:t>
-      </w:r>
-      <m:oMath>
-        <m:r>
-          <m:t>7</m:t>
-        </m:r>
-      </m:oMath>
-      <w:r>
-        <w:rPr>
-          <w:rFonts w:ascii="Times New Roman" w:hAnsi="Times New Roman" w:cs="Times New Roman" w:eastAsia="Times New Roman"/>
-          <w:b w:val="0"/>
-          <w:i w:val="0"/>
-        </w:rPr>
-        <w:t xml:space="preserve"> V’tur).</w:t>
+        <w:t xml:space="preserve"> V’tur.</w:t>
       </w:r>
     </w:p>
     <w:p>
@@ -11840,7 +11480,7 @@
       <w:r>
         <w:drawing>
           <wp:inline xmlns:a="http://schemas.openxmlformats.org/drawingml/2006/main" xmlns:pic="http://schemas.openxmlformats.org/drawingml/2006/picture">
-            <wp:extent cx="5580000" cy="1491161"/>
+            <wp:extent cx="5580000" cy="1398952"/>
             <wp:docPr id="12" name="Picture 12"/>
             <wp:cNvGraphicFramePr>
               <a:graphicFrameLocks noChangeAspect="1"/>
@@ -11861,7 +11501,7 @@
                   <pic:spPr>
                     <a:xfrm>
                       <a:off x="0" y="0"/>
-                      <a:ext cx="5580000" cy="1491161"/>
+                      <a:ext cx="5580000" cy="1398952"/>
                     </a:xfrm>
                     <a:prstGeom prst="rect"/>
                   </pic:spPr>
@@ -12629,7 +12269,7 @@
           <w:b w:val="0"/>
           <w:i w:val="0"/>
         </w:rPr>
-        <w:t xml:space="preserve">Ölçülen değerler kuramsal değerlerin hepsinin üzerindedir (%2,3, %9,0 ve %4,9). Üç ölçümün birbirine tutarlı olduğu görülmektedir: </w:t>
+        <w:t xml:space="preserve">Ölçtüğümüz değerlerin hepsi beklenenin üstünde çıktı (%2,3, %9,0 ve %4,9). Ölçümlerimiz birbiriyle tutarlıdır: </w:t>
       </w:r>
       <m:oMath>
         <m:r>
@@ -12713,7 +12353,7 @@
           <w:b w:val="0"/>
           <w:i w:val="0"/>
         </w:rPr>
-        <w:t xml:space="preserve"> V’tur ve </w:t>
+        <w:t xml:space="preserve"> V, </w:t>
       </w:r>
       <m:oMath>
         <m:r>
@@ -12726,7 +12366,7 @@
           <w:b w:val="0"/>
           <w:i w:val="0"/>
         </w:rPr>
-        <w:t xml:space="preserve"> için okunan </w:t>
+        <w:t xml:space="preserve"> için okuduğumuz değer ise </w:t>
       </w:r>
       <m:oMath>
         <m:r>
@@ -12748,7 +12388,7 @@
           <w:b w:val="0"/>
           <w:i w:val="0"/>
         </w:rPr>
-        <w:t xml:space="preserve"> V’la %0,3 farklıdır; yani devre doğrusal davranmıştır, sorun ölçüden değil devrenin bit ağırlıklarındadır. Ağırlıkların oranı </w:t>
+        <w:t xml:space="preserve"> V’tur (%0,3 fark); yani devre doğrusal davrandı, sorun ölçümde değil bit ağırlıklarındadır. Ağırlıkların oranı </w:t>
       </w:r>
       <m:oMath>
         <m:r>
@@ -12806,7 +12446,7 @@
           <w:b w:val="0"/>
           <w:i w:val="0"/>
         </w:rPr>
-        <w:t xml:space="preserve">’tir, kuramsal oran ise </w:t>
+        <w:t xml:space="preserve"> çıktı, beklenen oran </w:t>
       </w:r>
       <m:oMath>
         <m:r>
@@ -12846,7 +12486,7 @@
           <w:b w:val="0"/>
           <w:i w:val="0"/>
         </w:rPr>
-        <w:t xml:space="preserve">’tür: bir bitin ağırlığı diğerine göre kaymıştır. Sapmanın nedenleri şunlar olabilir: (a) direnç toleransları: yedi direnç ± %5 toleransla rastgele seçildiğinde (20 000 deneme ile hesaplanmıştır) çıkışlar </w:t>
+        <w:t xml:space="preserve">’tür: bir bitin ağırlığı diğerine göre kaydı. Olası nedenler: (a) direnç toleransları. Bütün dirençler ±%5 toleransla değişirse çıkışların %95 olasılıkla </w:t>
       </w:r>
       <m:oMath>
         <m:r>
@@ -12960,7 +12600,7 @@
           <w:b w:val="0"/>
           <w:i w:val="0"/>
         </w:rPr>
-        <w:t xml:space="preserve"> V ve </w:t>
+        <w:t xml:space="preserve"> V, </w:t>
       </w:r>
       <m:oMath>
         <m:r>
@@ -13017,7 +12657,7 @@
           <w:b w:val="0"/>
           <w:i w:val="0"/>
         </w:rPr>
-        <w:t xml:space="preserve"> V aralığında kalır (%95 olasılıkla). Ölçülen </w:t>
+        <w:t xml:space="preserve"> V aralığında kalacağını hesapladık. Ölçtüğümüz </w:t>
       </w:r>
       <m:oMath>
         <m:r>
@@ -13083,7 +12723,7 @@
           <w:b w:val="0"/>
           <w:i w:val="0"/>
         </w:rPr>
-        <w:t xml:space="preserve"> V ise dışındadır, yani tolerans tek başına açıklamak için yetersiz kalmaktadır; (b) “16 V” giriş geriliminin gerçek değerinin 16 V olmaması: gerilim 16,3 V olsaydı çıkışlar %1,9 artardı, fakat oran bozulmazdı; (c) </w:t>
+        <w:t xml:space="preserve"> V ise dışındadır, yani tolerans tek başına açıklamaya yetmiyor. (b) “16 V”un gerçekte 16 V olmaması: 16,3 V olsa çıkışlar %1,9 artardı ama oran bozulmazdı. (c) </w:t>
       </w:r>
       <m:oMath>
         <m:r>
@@ -13111,7 +12751,7 @@
           <w:b w:val="0"/>
           <w:i w:val="0"/>
         </w:rPr>
-        <w:t xml:space="preserve"> ve benzeri değerler tek direnç yerine seri-paralel bağlamayla elde edildiyse her bağlantı kontak direnci ekler (föy bu bağlamaya izin vermektedir) ve bu, doğrudan bit ağırlıklarını bozar; (d) kaynağın yüklenince gerilimini koruyamaması (iç direnç). Bu raporda direnç değerleri ayrı ayrı ölçülmediği için hangi nedenin baskın olduğu söylenemez; hangi dirençlerin kullanıldığı ve ayrı ayrı değerleri ölçülmüş olsaydı (</w:t>
+        <w:t xml:space="preserve"> gibi değerleri seri-paralel bağlamayla elde ettiysek her bağlantı kontak direnci ekler ve bit ağırlıklarını bozar. (d) Kaynağın yük altında geriliminin düşmesi. Dirençleri tek tek ölçmediğimiz için hangi nedenin baskın olduğunu söyleyemiyoruz; tek tek ölçseydik ölçülen değerleri </w:t>
       </w:r>
       <m:oMath>
         <m:sSub>
@@ -13133,7 +12773,7 @@
           <w:b w:val="0"/>
           <w:i w:val="0"/>
         </w:rPr>
-        <w:t xml:space="preserve"> formülüne konarak) sapmanın kaynağı kesin olarak bulunabilirdi.</w:t>
+        <w:t xml:space="preserve"> formülüne koyarak sapmanın kaynağını bulabilirdik.</w:t>
       </w:r>
     </w:p>
     <w:p>
@@ -13169,7 +12809,7 @@
           <w:b w:val="0"/>
           <w:i w:val="0"/>
         </w:rPr>
-        <w:t xml:space="preserve"> Seri ve paralel bağlantı kuralları ölçümle doğrulanmıştır: seri ölçüm toplamdan %0,48, paralel ölçüm hesaptan %0,39 farklıdır. Gerilim bölücüde asıl bulgu, ölçü aletlerinin iç direncinin sonucu belirlediğidir: </w:t>
+        <w:t xml:space="preserve"> Seri ve paralel bağlantı kurallarını ölçümle doğruladık: seri ölçüm toplamdan %0,48, paralel ölçüm hesaptan %0,39 farklı çıktı. Gerilim bölücüde asıl bulgu, ölçü aletlerinin iç direncinin sonucu belirlemesidir: </w:t>
       </w:r>
       <m:oMath>
         <m:r>
@@ -13188,7 +12828,7 @@
           <w:b w:val="0"/>
           <w:i w:val="0"/>
         </w:rPr>
-        <w:t xml:space="preserve">’da iki alet de beklenene yakındır (7,4 V ve 7,40 V; beklenen 7,5 V); </w:t>
+        <w:t xml:space="preserve">’da iki alet de beklenene yakındı (7,4 V ve 7,40 V; beklenen 7,5 V); </w:t>
       </w:r>
       <m:oMath>
         <m:r>
@@ -13216,7 +12856,7 @@
           <w:b w:val="0"/>
           <w:i w:val="0"/>
         </w:rPr>
-        <w:t xml:space="preserve">’da multimetre 6,5 V, osiloskop 7,4 V; </w:t>
+        <w:t xml:space="preserve">’da multimetre 6,5 V, osiloskop 7,4 V gösterdi; </w:t>
       </w:r>
       <m:oMath>
         <m:r>
@@ -13244,7 +12884,7 @@
           <w:b w:val="0"/>
           <w:i w:val="0"/>
         </w:rPr>
-        <w:t xml:space="preserve">’da multimetre 0,9 V ve osiloskop ekranında 50 Hz’lik parazit (en büyük 9,40 V, tepeden tepeye 21,4 V) görülmüştür. Ölçümlerden multimetrenin görünen iç direnci yaklaşık </w:t>
+        <w:t xml:space="preserve">’da multimetre 0,9 V gösterdi, osiloskop ekranında ise 50 Hz’lik parazit (en büyük 9,40 V, tepeden tepeye 21,4 V) gördük. Ölçümlerden multimetrenin görünen iç direncini yaklaşık </w:t>
       </w:r>
       <m:oMath>
         <m:r>
@@ -13303,7 +12943,7 @@
           <w:b w:val="0"/>
           <w:i w:val="0"/>
         </w:rPr>
-        <w:t xml:space="preserve"> bulunmuştur. Wheatstone köprüsünde bilinmeyen direnç </w:t>
+        <w:t xml:space="preserve"> bulduk. Wheatstone köprüsüyle bilinmeyen direnci </w:t>
       </w:r>
       <m:oMath>
         <m:r>
@@ -13322,7 +12962,7 @@
           <w:b w:val="0"/>
           <w:i w:val="0"/>
         </w:rPr>
-        <w:t xml:space="preserve"> bulunmuş, multimetre ölçümüyle (</w:t>
+        <w:t xml:space="preserve"> bulduk; multimetreyle ölçtüğümüz </w:t>
       </w:r>
       <m:oMath>
         <m:r>
@@ -13341,7 +12981,7 @@
           <w:b w:val="0"/>
           <w:i w:val="0"/>
         </w:rPr>
-        <w:t>) -2,93 % farkla karşılaştırılmıştır; ikisi de renk kodunun (</w:t>
+        <w:t>’dan -2,93 % farklıdır ve ikisi de renk kodunun (</w:t>
       </w:r>
       <m:oMath>
         <m:r>
@@ -13378,7 +13018,7 @@
           <w:b w:val="0"/>
           <w:i w:val="0"/>
         </w:rPr>
-        <w:t xml:space="preserve"> ± %5) tolerans aralığındadır. DAC çıkışları beklenenin %2,3–%9 üzerinde ölçülmüştür.</w:t>
+        <w:t xml:space="preserve"> ±%5) tolerans aralığındadır. DAC çıkışlarını beklenenden %2,3–%9 yüksek ölçtük.</w:t>
       </w:r>
     </w:p>
     <w:p>
@@ -13391,7 +13031,7 @@
           <w:b/>
           <w:i w:val="0"/>
         </w:rPr>
-        <w:t>Açık kalan hususlar.</w:t>
+        <w:t>Eksik kalan noktalar.</w:t>
       </w:r>
       <w:r>
         <w:rPr>
@@ -13399,66 +13039,7 @@
           <w:b w:val="0"/>
           <w:i w:val="0"/>
         </w:rPr>
-        <w:t xml:space="preserve"> (i) Multimetrenin görünen iç direncinin (yaklaşık </w:t>
-      </w:r>
-      <m:oMath>
-        <m:r>
-          <m:t>0</m:t>
-        </m:r>
-        <m:r>
-          <m:rPr>
-            <m:sty m:val="p"/>
-          </m:rPr>
-          <m:t>,</m:t>
-        </m:r>
-        <m:r>
-          <m:t>3</m:t>
-        </m:r>
-      </m:oMath>
-      <w:r>
-        <w:rPr>
-          <w:rFonts w:ascii="Times New Roman" w:hAnsi="Times New Roman" w:cs="Times New Roman" w:eastAsia="Times New Roman"/>
-          <w:b w:val="0"/>
-          <w:i w:val="0"/>
-        </w:rPr>
-        <w:t>–</w:t>
-      </w:r>
-      <m:oMath>
-        <m:r>
-          <m:t>0</m:t>
-        </m:r>
-        <m:r>
-          <m:rPr>
-            <m:sty m:val="p"/>
-          </m:rPr>
-          <m:t>,</m:t>
-        </m:r>
-        <m:r>
-          <m:t>7</m:t>
-        </m:r>
-        <m:r>
-          <m:t> </m:t>
-        </m:r>
-        <m:r>
-          <m:rPr>
-            <m:sty m:val="p"/>
-          </m:rPr>
-          <m:t>M</m:t>
-        </m:r>
-        <m:r>
-          <m:rPr>
-            <m:sty m:val="p"/>
-          </m:rPr>
-          <m:t>Ω</m:t>
-        </m:r>
-      </m:oMath>
-      <w:r>
-        <w:rPr>
-          <w:rFonts w:ascii="Times New Roman" w:hAnsi="Times New Roman" w:cs="Times New Roman" w:eastAsia="Times New Roman"/>
-          <w:b w:val="0"/>
-          <w:i w:val="0"/>
-        </w:rPr>
-        <w:t>) katalog değerinden çok küçük çıkmasının fiziksel nedeni fotoğraflardan belirlenememiştir; bilinen dirençle kalibrasyon ölçümü bunu kesinleştirir; (ii) osiloskopun uç tipi (1× veya 10×) kayıtlı değildir; (iii) DAC’ta tolerans tek başına sapmayı açıklamamaktadır ve direnç değerleri tek tek ölçülmemiştir.</w:t>
+        <w:t xml:space="preserve"> (i) Multimetrenin görünen iç direncinin katalog değerinden çok küçük çıkmasının nedenini belirleyemedik; bilinen bir dirençle ayrıca ölçüm yapmak gerekir. (ii) Osiloskop ucunun 1× mi 10× mu olduğunu not almadık. (iii) DAC’ta tolerans tek başına sapmayı açıklamıyor ve dirençleri tek tek ölçmedik.</w:t>
       </w:r>
     </w:p>
     <w:p>
@@ -13471,7 +13052,7 @@
           <w:b/>
           <w:i w:val="0"/>
         </w:rPr>
-        <w:t>Kazanılan beceriler.</w:t>
+        <w:t>Kazanımlar.</w:t>
       </w:r>
       <w:r>
         <w:rPr>
@@ -13479,7 +13060,7 @@
           <w:b w:val="0"/>
           <w:i w:val="0"/>
         </w:rPr>
-        <w:t xml:space="preserve"> Dirençlerin seri-paralel hesabı ve ölçümü; ölçü aletinin yük etkisinin hesaplanması; osiloskop ve multimetrenin birlikte kullanımı ve 50 Hz parazitin tanınması; köprü yöntemi; DAC ağırlıklarının süperpozisyonla hesabı; devre tahtası yerleşiminin planlanması ve ölçümlerin kuramsal değerle yüzde farkla karşılaştırılması.</w:t>
+        <w:t xml:space="preserve"> Seri-paralel direnç hesabı ve ölçümü; ölçü aletinin yük etkisinin hesaplanması; osiloskop ve multimetrenin birlikte kullanımı ve 50 Hz parazitin tanınması; köprü yöntemi; DAC ağırlıklarının süperpozisyonla hesabı; devre tahtası yerleşimi ve ölçümleri beklenen değerle yüzde farkla karşılaştırma.</w:t>
       </w:r>
     </w:p>
     <w:p>
@@ -13669,20 +13250,7 @@
           <w:i/>
           <w:sz w:val="24"/>
         </w:rPr>
-        <w:t>EK-1: Fotoğraf Okuma Çizelgesi ve Eşleştirme Gerekçesi</w:t>
-      </w:r>
-    </w:p>
-    <w:p>
-      <w:pPr>
-        <w:jc w:val="both"/>
-      </w:pPr>
-      <w:r>
-        <w:rPr>
-          <w:rFonts w:ascii="Times New Roman" w:hAnsi="Times New Roman" w:cs="Times New Roman" w:eastAsia="Times New Roman"/>
-          <w:b w:val="0"/>
-          <w:i w:val="0"/>
-        </w:rPr>
-        <w:t>Aşağıda her fotoğrafın (yükleme sırasıyla numaralanmıştır) gösterdiği okuma ve rapordaki karşılığı verilmiştir. Gerilim bölücü okumaları (multimetre: 7,4 / 6,5 / 0,9 V; osiloskop: 7,40 / 7,4 / 9,40 V) deneyi yapan kişinin kesin beyanıdır; fotoğraf eşleştirmesi bu beyana ve osiloskop saatlerine (08:20, 08:23, 08:25) dayanmaktadır.</w:t>
+        <w:t>EK-1: Kullanılan Aletler</w:t>
       </w:r>
     </w:p>
     <w:p>
@@ -13698,7 +13266,7 @@
           <w:i w:val="0"/>
           <w:sz w:val="20"/>
         </w:rPr>
-        <w:t>Tablo 5.1  Fotoğraf okuma çizelgesi</w:t>
+        <w:t>Tablo 5.1  Deneyde kullanılan aletler</w:t>
       </w:r>
     </w:p>
     <w:tbl>
@@ -13709,9 +13277,8 @@
         <w:tblLook w:firstColumn="1" w:firstRow="1" w:lastColumn="0" w:lastRow="0" w:noHBand="0" w:noVBand="1" w:val="04A0"/>
       </w:tblPr>
       <w:tblGrid>
-        <w:gridCol w:w="1247"/>
-        <w:gridCol w:w="2494"/>
-        <w:gridCol w:w="4195"/>
+        <w:gridCol w:w="3969"/>
+        <w:gridCol w:w="3969"/>
       </w:tblGrid>
       <w:tr>
         <w:trPr>
@@ -13720,7 +13287,7 @@
         </w:trPr>
         <w:tc>
           <w:tcPr>
-            <w:tcW w:type="dxa" w:w="1247"/>
+            <w:tcW w:type="dxa" w:w="3969"/>
             <w:tcBorders>
               <w:top w:val="single" w:sz="4" w:space="0" w:color="000000"/>
               <w:left w:val="single" w:sz="4" w:space="0" w:color="000000"/>
@@ -13740,15 +13307,15 @@
                 <w:rFonts w:ascii="Times New Roman" w:hAnsi="Times New Roman" w:cs="Times New Roman" w:eastAsia="Times New Roman"/>
                 <w:b/>
                 <w:i w:val="0"/>
-                <w:sz w:val="18"/>
+                <w:sz w:val="20"/>
               </w:rPr>
-              <w:t>Fotoğraf</w:t>
+              <w:t>Alet</w:t>
             </w:r>
           </w:p>
         </w:tc>
         <w:tc>
           <w:tcPr>
-            <w:tcW w:type="dxa" w:w="2494"/>
+            <w:tcW w:type="dxa" w:w="3969"/>
             <w:tcBorders>
               <w:top w:val="single" w:sz="4" w:space="0" w:color="000000"/>
               <w:left w:val="single" w:sz="4" w:space="0" w:color="000000"/>
@@ -13768,37 +13335,9 @@
                 <w:rFonts w:ascii="Times New Roman" w:hAnsi="Times New Roman" w:cs="Times New Roman" w:eastAsia="Times New Roman"/>
                 <w:b/>
                 <w:i w:val="0"/>
-                <w:sz w:val="18"/>
+                <w:sz w:val="20"/>
               </w:rPr>
-              <w:t>Okuma</w:t>
-            </w:r>
-          </w:p>
-        </w:tc>
-        <w:tc>
-          <w:tcPr>
-            <w:tcW w:type="dxa" w:w="4195"/>
-            <w:tcBorders>
-              <w:top w:val="single" w:sz="4" w:space="0" w:color="000000"/>
-              <w:left w:val="single" w:sz="4" w:space="0" w:color="000000"/>
-              <w:bottom w:val="single" w:sz="4" w:space="0" w:color="000000"/>
-              <w:right w:val="single" w:sz="4" w:space="0" w:color="000000"/>
-            </w:tcBorders>
-            <w:shd w:val="clear" w:color="auto" w:fill="D9D9D9"/>
-          </w:tcPr>
-          <w:p>
-            <w:pPr>
-              <w:keepNext/>
-              <w:spacing w:line="240" w:lineRule="auto" w:after="20"/>
-              <w:jc w:val="center"/>
-            </w:pPr>
-            <w:r>
-              <w:rPr>
-                <w:rFonts w:ascii="Times New Roman" w:hAnsi="Times New Roman" w:cs="Times New Roman" w:eastAsia="Times New Roman"/>
-                <w:b/>
-                <w:i w:val="0"/>
-                <w:sz w:val="18"/>
-              </w:rPr>
-              <w:t>Karşılığı</w:t>
+              <w:t>Kullanım</w:t>
             </w:r>
           </w:p>
         </w:tc>
@@ -13809,7 +13348,7 @@
         </w:trPr>
         <w:tc>
           <w:tcPr>
-            <w:tcW w:type="dxa" w:w="1247"/>
+            <w:tcW w:type="dxa" w:w="3969"/>
             <w:tcBorders>
               <w:top w:val="single" w:sz="4" w:space="0" w:color="000000"/>
               <w:left w:val="single" w:sz="4" w:space="0" w:color="000000"/>
@@ -13828,15 +13367,15 @@
                 <w:rFonts w:ascii="Times New Roman" w:hAnsi="Times New Roman" w:cs="Times New Roman" w:eastAsia="Times New Roman"/>
                 <w:b w:val="0"/>
                 <w:i w:val="0"/>
-                <w:sz w:val="18"/>
+                <w:sz w:val="20"/>
               </w:rPr>
-              <w:t>1</w:t>
+              <w:t>UNI-T UT33D+ multimetre</w:t>
             </w:r>
           </w:p>
         </w:tc>
         <w:tc>
           <w:tcPr>
-            <w:tcW w:type="dxa" w:w="2494"/>
+            <w:tcW w:type="dxa" w:w="3969"/>
             <w:tcBorders>
               <w:top w:val="single" w:sz="4" w:space="0" w:color="000000"/>
               <w:left w:val="single" w:sz="4" w:space="0" w:color="000000"/>
@@ -13855,50 +13394,9 @@
                 <w:rFonts w:ascii="Times New Roman" w:hAnsi="Times New Roman" w:cs="Times New Roman" w:eastAsia="Times New Roman"/>
                 <w:b w:val="0"/>
                 <w:i w:val="0"/>
-                <w:sz w:val="18"/>
+                <w:sz w:val="20"/>
               </w:rPr>
-              <w:t>464 Ω</w:t>
-            </w:r>
-          </w:p>
-        </w:tc>
-        <w:tc>
-          <w:tcPr>
-            <w:tcW w:type="dxa" w:w="4195"/>
-            <w:tcBorders>
-              <w:top w:val="single" w:sz="4" w:space="0" w:color="000000"/>
-              <w:left w:val="single" w:sz="4" w:space="0" w:color="000000"/>
-              <w:bottom w:val="single" w:sz="4" w:space="0" w:color="000000"/>
-              <w:right w:val="single" w:sz="4" w:space="0" w:color="000000"/>
-            </w:tcBorders>
-          </w:tcPr>
-          <w:p>
-            <w:pPr>
-              <w:keepNext/>
-              <w:spacing w:line="240" w:lineRule="auto" w:after="20"/>
-              <w:jc w:val="center"/>
-            </w:pPr>
-            <m:oMath>
-              <m:sSub>
-                <m:e>
-                  <m:r>
-                    <m:t>R</m:t>
-                  </m:r>
-                </m:e>
-                <m:sub>
-                  <m:r>
-                    <m:t>1</m:t>
-                  </m:r>
-                </m:sub>
-              </m:sSub>
-            </m:oMath>
-            <w:r>
-              <w:rPr>
-                <w:rFonts w:ascii="Times New Roman" w:hAnsi="Times New Roman" w:cs="Times New Roman" w:eastAsia="Times New Roman"/>
-                <w:b w:val="0"/>
-                <w:i w:val="0"/>
-                <w:sz w:val="18"/>
-              </w:rPr>
-              <w:t xml:space="preserve"> ayrı ölçüm</w:t>
+              <w:t>Direnç ve gerilim ölçümleri</w:t>
             </w:r>
           </w:p>
         </w:tc>
@@ -13909,7 +13407,7 @@
         </w:trPr>
         <w:tc>
           <w:tcPr>
-            <w:tcW w:type="dxa" w:w="1247"/>
+            <w:tcW w:type="dxa" w:w="3969"/>
             <w:tcBorders>
               <w:top w:val="single" w:sz="4" w:space="0" w:color="000000"/>
               <w:left w:val="single" w:sz="4" w:space="0" w:color="000000"/>
@@ -13928,15 +13426,15 @@
                 <w:rFonts w:ascii="Times New Roman" w:hAnsi="Times New Roman" w:cs="Times New Roman" w:eastAsia="Times New Roman"/>
                 <w:b w:val="0"/>
                 <w:i w:val="0"/>
-                <w:sz w:val="18"/>
+                <w:sz w:val="20"/>
               </w:rPr>
-              <w:t>2</w:t>
+              <w:t>Tektronix TBS 1022 osiloskop</w:t>
             </w:r>
           </w:p>
         </w:tc>
         <w:tc>
           <w:tcPr>
-            <w:tcW w:type="dxa" w:w="2494"/>
+            <w:tcW w:type="dxa" w:w="3969"/>
             <w:tcBorders>
               <w:top w:val="single" w:sz="4" w:space="0" w:color="000000"/>
               <w:left w:val="single" w:sz="4" w:space="0" w:color="000000"/>
@@ -13955,50 +13453,9 @@
                 <w:rFonts w:ascii="Times New Roman" w:hAnsi="Times New Roman" w:cs="Times New Roman" w:eastAsia="Times New Roman"/>
                 <w:b w:val="0"/>
                 <w:i w:val="0"/>
-                <w:sz w:val="18"/>
+                <w:sz w:val="20"/>
               </w:rPr>
-              <w:t>99,1 kΩ</w:t>
-            </w:r>
-          </w:p>
-        </w:tc>
-        <w:tc>
-          <w:tcPr>
-            <w:tcW w:type="dxa" w:w="4195"/>
-            <w:tcBorders>
-              <w:top w:val="single" w:sz="4" w:space="0" w:color="000000"/>
-              <w:left w:val="single" w:sz="4" w:space="0" w:color="000000"/>
-              <w:bottom w:val="single" w:sz="4" w:space="0" w:color="000000"/>
-              <w:right w:val="single" w:sz="4" w:space="0" w:color="000000"/>
-            </w:tcBorders>
-          </w:tcPr>
-          <w:p>
-            <w:pPr>
-              <w:keepNext/>
-              <w:spacing w:line="240" w:lineRule="auto" w:after="20"/>
-              <w:jc w:val="center"/>
-            </w:pPr>
-            <m:oMath>
-              <m:sSub>
-                <m:e>
-                  <m:r>
-                    <m:t>R</m:t>
-                  </m:r>
-                </m:e>
-                <m:sub>
-                  <m:r>
-                    <m:t>2</m:t>
-                  </m:r>
-                </m:sub>
-              </m:sSub>
-            </m:oMath>
-            <w:r>
-              <w:rPr>
-                <w:rFonts w:ascii="Times New Roman" w:hAnsi="Times New Roman" w:cs="Times New Roman" w:eastAsia="Times New Roman"/>
-                <w:b w:val="0"/>
-                <w:i w:val="0"/>
-                <w:sz w:val="18"/>
-              </w:rPr>
-              <w:t xml:space="preserve"> ayrı ölçüm</w:t>
+              <w:t>Gerilim bölücü çıkışı</w:t>
             </w:r>
           </w:p>
         </w:tc>
@@ -14009,7 +13466,7 @@
         </w:trPr>
         <w:tc>
           <w:tcPr>
-            <w:tcW w:type="dxa" w:w="1247"/>
+            <w:tcW w:type="dxa" w:w="3969"/>
             <w:tcBorders>
               <w:top w:val="single" w:sz="4" w:space="0" w:color="000000"/>
               <w:left w:val="single" w:sz="4" w:space="0" w:color="000000"/>
@@ -14028,15 +13485,15 @@
                 <w:rFonts w:ascii="Times New Roman" w:hAnsi="Times New Roman" w:cs="Times New Roman" w:eastAsia="Times New Roman"/>
                 <w:b w:val="0"/>
                 <w:i w:val="0"/>
-                <w:sz w:val="18"/>
+                <w:sz w:val="20"/>
               </w:rPr>
-              <w:t>3</w:t>
+              <w:t>DA güç kaynağı</w:t>
             </w:r>
           </w:p>
         </w:tc>
         <w:tc>
           <w:tcPr>
-            <w:tcW w:type="dxa" w:w="2494"/>
+            <w:tcW w:type="dxa" w:w="3969"/>
             <w:tcBorders>
               <w:top w:val="single" w:sz="4" w:space="0" w:color="000000"/>
               <w:left w:val="single" w:sz="4" w:space="0" w:color="000000"/>
@@ -14055,36 +13512,9 @@
                 <w:rFonts w:ascii="Times New Roman" w:hAnsi="Times New Roman" w:cs="Times New Roman" w:eastAsia="Times New Roman"/>
                 <w:b w:val="0"/>
                 <w:i w:val="0"/>
-                <w:sz w:val="18"/>
+                <w:sz w:val="20"/>
               </w:rPr>
-              <w:t>0,46 kΩ</w:t>
-            </w:r>
-          </w:p>
-        </w:tc>
-        <w:tc>
-          <w:tcPr>
-            <w:tcW w:type="dxa" w:w="4195"/>
-            <w:tcBorders>
-              <w:top w:val="single" w:sz="4" w:space="0" w:color="000000"/>
-              <w:left w:val="single" w:sz="4" w:space="0" w:color="000000"/>
-              <w:bottom w:val="single" w:sz="4" w:space="0" w:color="000000"/>
-              <w:right w:val="single" w:sz="4" w:space="0" w:color="000000"/>
-            </w:tcBorders>
-          </w:tcPr>
-          <w:p>
-            <w:pPr>
-              <w:keepNext/>
-              <w:spacing w:line="240" w:lineRule="auto" w:after="20"/>
-              <w:jc w:val="center"/>
-            </w:pPr>
-            <w:r>
-              <w:rPr>
-                <w:rFonts w:ascii="Times New Roman" w:hAnsi="Times New Roman" w:cs="Times New Roman" w:eastAsia="Times New Roman"/>
-                <w:b w:val="0"/>
-                <w:i w:val="0"/>
-                <w:sz w:val="18"/>
-              </w:rPr>
-              <w:t>Paralel bağlantı</w:t>
+              <w:t>15 V ve 16 V beslemeler</w:t>
             </w:r>
           </w:p>
         </w:tc>
@@ -14095,1462 +13525,7 @@
         </w:trPr>
         <w:tc>
           <w:tcPr>
-            <w:tcW w:type="dxa" w:w="1247"/>
-            <w:tcBorders>
-              <w:top w:val="single" w:sz="4" w:space="0" w:color="000000"/>
-              <w:left w:val="single" w:sz="4" w:space="0" w:color="000000"/>
-              <w:bottom w:val="single" w:sz="4" w:space="0" w:color="000000"/>
-              <w:right w:val="single" w:sz="4" w:space="0" w:color="000000"/>
-            </w:tcBorders>
-          </w:tcPr>
-          <w:p>
-            <w:pPr>
-              <w:keepNext/>
-              <w:spacing w:line="240" w:lineRule="auto" w:after="20"/>
-              <w:jc w:val="left"/>
-            </w:pPr>
-            <w:r>
-              <w:rPr>
-                <w:rFonts w:ascii="Times New Roman" w:hAnsi="Times New Roman" w:cs="Times New Roman" w:eastAsia="Times New Roman"/>
-                <w:b w:val="0"/>
-                <w:i w:val="0"/>
-                <w:sz w:val="18"/>
-              </w:rPr>
-              <w:t>4</w:t>
-            </w:r>
-          </w:p>
-        </w:tc>
-        <w:tc>
-          <w:tcPr>
-            <w:tcW w:type="dxa" w:w="2494"/>
-            <w:tcBorders>
-              <w:top w:val="single" w:sz="4" w:space="0" w:color="000000"/>
-              <w:left w:val="single" w:sz="4" w:space="0" w:color="000000"/>
-              <w:bottom w:val="single" w:sz="4" w:space="0" w:color="000000"/>
-              <w:right w:val="single" w:sz="4" w:space="0" w:color="000000"/>
-            </w:tcBorders>
-          </w:tcPr>
-          <w:p>
-            <w:pPr>
-              <w:keepNext/>
-              <w:spacing w:line="240" w:lineRule="auto" w:after="20"/>
-              <w:jc w:val="center"/>
-            </w:pPr>
-            <w:r>
-              <w:rPr>
-                <w:rFonts w:ascii="Times New Roman" w:hAnsi="Times New Roman" w:cs="Times New Roman" w:eastAsia="Times New Roman"/>
-                <w:b w:val="0"/>
-                <w:i w:val="0"/>
-                <w:sz w:val="18"/>
-              </w:rPr>
-              <w:t>10,45 MΩ</w:t>
-            </w:r>
-          </w:p>
-        </w:tc>
-        <w:tc>
-          <w:tcPr>
-            <w:tcW w:type="dxa" w:w="4195"/>
-            <w:tcBorders>
-              <w:top w:val="single" w:sz="4" w:space="0" w:color="000000"/>
-              <w:left w:val="single" w:sz="4" w:space="0" w:color="000000"/>
-              <w:bottom w:val="single" w:sz="4" w:space="0" w:color="000000"/>
-              <w:right w:val="single" w:sz="4" w:space="0" w:color="000000"/>
-            </w:tcBorders>
-          </w:tcPr>
-          <w:p>
-            <w:pPr>
-              <w:keepNext/>
-              <w:spacing w:line="240" w:lineRule="auto" w:after="20"/>
-              <w:jc w:val="center"/>
-            </w:pPr>
-            <w:r>
-              <w:rPr>
-                <w:rFonts w:ascii="Times New Roman" w:hAnsi="Times New Roman" w:cs="Times New Roman" w:eastAsia="Times New Roman"/>
-                <w:b w:val="0"/>
-                <w:i w:val="0"/>
-                <w:sz w:val="18"/>
-              </w:rPr>
-              <w:t>Seri bağlantı</w:t>
-            </w:r>
-          </w:p>
-        </w:tc>
-      </w:tr>
-      <w:tr>
-        <w:trPr>
-          <w:cantSplit/>
-        </w:trPr>
-        <w:tc>
-          <w:tcPr>
-            <w:tcW w:type="dxa" w:w="1247"/>
-            <w:tcBorders>
-              <w:top w:val="single" w:sz="4" w:space="0" w:color="000000"/>
-              <w:left w:val="single" w:sz="4" w:space="0" w:color="000000"/>
-              <w:bottom w:val="single" w:sz="4" w:space="0" w:color="000000"/>
-              <w:right w:val="single" w:sz="4" w:space="0" w:color="000000"/>
-            </w:tcBorders>
-          </w:tcPr>
-          <w:p>
-            <w:pPr>
-              <w:keepNext/>
-              <w:spacing w:line="240" w:lineRule="auto" w:after="20"/>
-              <w:jc w:val="left"/>
-            </w:pPr>
-            <w:r>
-              <w:rPr>
-                <w:rFonts w:ascii="Times New Roman" w:hAnsi="Times New Roman" w:cs="Times New Roman" w:eastAsia="Times New Roman"/>
-                <w:b w:val="0"/>
-                <w:i w:val="0"/>
-                <w:sz w:val="18"/>
-              </w:rPr>
-              <w:t>5</w:t>
-            </w:r>
-          </w:p>
-        </w:tc>
-        <w:tc>
-          <w:tcPr>
-            <w:tcW w:type="dxa" w:w="2494"/>
-            <w:tcBorders>
-              <w:top w:val="single" w:sz="4" w:space="0" w:color="000000"/>
-              <w:left w:val="single" w:sz="4" w:space="0" w:color="000000"/>
-              <w:bottom w:val="single" w:sz="4" w:space="0" w:color="000000"/>
-              <w:right w:val="single" w:sz="4" w:space="0" w:color="000000"/>
-            </w:tcBorders>
-          </w:tcPr>
-          <w:p>
-            <w:pPr>
-              <w:keepNext/>
-              <w:spacing w:line="240" w:lineRule="auto" w:after="20"/>
-              <w:jc w:val="center"/>
-            </w:pPr>
-            <w:r>
-              <w:rPr>
-                <w:rFonts w:ascii="Times New Roman" w:hAnsi="Times New Roman" w:cs="Times New Roman" w:eastAsia="Times New Roman"/>
-                <w:b w:val="0"/>
-                <w:i w:val="0"/>
-                <w:sz w:val="18"/>
-              </w:rPr>
-              <w:t>10,30 MΩ</w:t>
-            </w:r>
-          </w:p>
-        </w:tc>
-        <w:tc>
-          <w:tcPr>
-            <w:tcW w:type="dxa" w:w="4195"/>
-            <w:tcBorders>
-              <w:top w:val="single" w:sz="4" w:space="0" w:color="000000"/>
-              <w:left w:val="single" w:sz="4" w:space="0" w:color="000000"/>
-              <w:bottom w:val="single" w:sz="4" w:space="0" w:color="000000"/>
-              <w:right w:val="single" w:sz="4" w:space="0" w:color="000000"/>
-            </w:tcBorders>
-          </w:tcPr>
-          <w:p>
-            <w:pPr>
-              <w:keepNext/>
-              <w:spacing w:line="240" w:lineRule="auto" w:after="20"/>
-              <w:jc w:val="center"/>
-            </w:pPr>
-            <m:oMath>
-              <m:sSub>
-                <m:e>
-                  <m:r>
-                    <m:t>R</m:t>
-                  </m:r>
-                </m:e>
-                <m:sub>
-                  <m:r>
-                    <m:t>3</m:t>
-                  </m:r>
-                </m:sub>
-              </m:sSub>
-            </m:oMath>
-            <w:r>
-              <w:rPr>
-                <w:rFonts w:ascii="Times New Roman" w:hAnsi="Times New Roman" w:cs="Times New Roman" w:eastAsia="Times New Roman"/>
-                <w:b w:val="0"/>
-                <w:i w:val="0"/>
-                <w:sz w:val="18"/>
-              </w:rPr>
-              <w:t xml:space="preserve"> ayrı ölçüm</w:t>
-            </w:r>
-          </w:p>
-        </w:tc>
-      </w:tr>
-      <w:tr>
-        <w:trPr>
-          <w:cantSplit/>
-        </w:trPr>
-        <w:tc>
-          <w:tcPr>
-            <w:tcW w:type="dxa" w:w="1247"/>
-            <w:tcBorders>
-              <w:top w:val="single" w:sz="4" w:space="0" w:color="000000"/>
-              <w:left w:val="single" w:sz="4" w:space="0" w:color="000000"/>
-              <w:bottom w:val="single" w:sz="4" w:space="0" w:color="000000"/>
-              <w:right w:val="single" w:sz="4" w:space="0" w:color="000000"/>
-            </w:tcBorders>
-          </w:tcPr>
-          <w:p>
-            <w:pPr>
-              <w:keepNext/>
-              <w:spacing w:line="240" w:lineRule="auto" w:after="20"/>
-              <w:jc w:val="left"/>
-            </w:pPr>
-            <w:r>
-              <w:rPr>
-                <w:rFonts w:ascii="Times New Roman" w:hAnsi="Times New Roman" w:cs="Times New Roman" w:eastAsia="Times New Roman"/>
-                <w:b w:val="0"/>
-                <w:i w:val="0"/>
-                <w:sz w:val="18"/>
-              </w:rPr>
-              <w:t>6</w:t>
-            </w:r>
-          </w:p>
-        </w:tc>
-        <w:tc>
-          <w:tcPr>
-            <w:tcW w:type="dxa" w:w="2494"/>
-            <w:tcBorders>
-              <w:top w:val="single" w:sz="4" w:space="0" w:color="000000"/>
-              <w:left w:val="single" w:sz="4" w:space="0" w:color="000000"/>
-              <w:bottom w:val="single" w:sz="4" w:space="0" w:color="000000"/>
-              <w:right w:val="single" w:sz="4" w:space="0" w:color="000000"/>
-            </w:tcBorders>
-          </w:tcPr>
-          <w:p>
-            <w:pPr>
-              <w:keepNext/>
-              <w:spacing w:line="240" w:lineRule="auto" w:after="20"/>
-              <w:jc w:val="center"/>
-            </w:pPr>
-            <w:r>
-              <w:rPr>
-                <w:rFonts w:ascii="Times New Roman" w:hAnsi="Times New Roman" w:cs="Times New Roman" w:eastAsia="Times New Roman"/>
-                <w:b w:val="0"/>
-                <w:i w:val="0"/>
-                <w:sz w:val="18"/>
-              </w:rPr>
-              <w:t>7,4 V</w:t>
-            </w:r>
-          </w:p>
-        </w:tc>
-        <w:tc>
-          <w:tcPr>
-            <w:tcW w:type="dxa" w:w="4195"/>
-            <w:tcBorders>
-              <w:top w:val="single" w:sz="4" w:space="0" w:color="000000"/>
-              <w:left w:val="single" w:sz="4" w:space="0" w:color="000000"/>
-              <w:bottom w:val="single" w:sz="4" w:space="0" w:color="000000"/>
-              <w:right w:val="single" w:sz="4" w:space="0" w:color="000000"/>
-            </w:tcBorders>
-          </w:tcPr>
-          <w:p>
-            <w:pPr>
-              <w:keepNext/>
-              <w:spacing w:line="240" w:lineRule="auto" w:after="20"/>
-              <w:jc w:val="center"/>
-            </w:pPr>
-            <w:r>
-              <w:rPr>
-                <w:rFonts w:ascii="Times New Roman" w:hAnsi="Times New Roman" w:cs="Times New Roman" w:eastAsia="Times New Roman"/>
-                <w:b w:val="0"/>
-                <w:i w:val="0"/>
-                <w:sz w:val="18"/>
-              </w:rPr>
-              <w:t>Multimetre, bölücü</w:t>
-            </w:r>
-          </w:p>
-        </w:tc>
-      </w:tr>
-      <w:tr>
-        <w:trPr>
-          <w:cantSplit/>
-        </w:trPr>
-        <w:tc>
-          <w:tcPr>
-            <w:tcW w:type="dxa" w:w="1247"/>
-            <w:tcBorders>
-              <w:top w:val="single" w:sz="4" w:space="0" w:color="000000"/>
-              <w:left w:val="single" w:sz="4" w:space="0" w:color="000000"/>
-              <w:bottom w:val="single" w:sz="4" w:space="0" w:color="000000"/>
-              <w:right w:val="single" w:sz="4" w:space="0" w:color="000000"/>
-            </w:tcBorders>
-          </w:tcPr>
-          <w:p>
-            <w:pPr>
-              <w:keepNext/>
-              <w:spacing w:line="240" w:lineRule="auto" w:after="20"/>
-              <w:jc w:val="left"/>
-            </w:pPr>
-            <w:r>
-              <w:rPr>
-                <w:rFonts w:ascii="Times New Roman" w:hAnsi="Times New Roman" w:cs="Times New Roman" w:eastAsia="Times New Roman"/>
-                <w:b w:val="0"/>
-                <w:i w:val="0"/>
-                <w:sz w:val="18"/>
-              </w:rPr>
-              <w:t>7</w:t>
-            </w:r>
-          </w:p>
-        </w:tc>
-        <w:tc>
-          <w:tcPr>
-            <w:tcW w:type="dxa" w:w="2494"/>
-            <w:tcBorders>
-              <w:top w:val="single" w:sz="4" w:space="0" w:color="000000"/>
-              <w:left w:val="single" w:sz="4" w:space="0" w:color="000000"/>
-              <w:bottom w:val="single" w:sz="4" w:space="0" w:color="000000"/>
-              <w:right w:val="single" w:sz="4" w:space="0" w:color="000000"/>
-            </w:tcBorders>
-          </w:tcPr>
-          <w:p>
-            <w:pPr>
-              <w:keepNext/>
-              <w:spacing w:line="240" w:lineRule="auto" w:after="20"/>
-              <w:jc w:val="center"/>
-            </w:pPr>
-            <w:r>
-              <w:rPr>
-                <w:rFonts w:ascii="Times New Roman" w:hAnsi="Times New Roman" w:cs="Times New Roman" w:eastAsia="Times New Roman"/>
-                <w:b w:val="0"/>
-                <w:i w:val="0"/>
-                <w:sz w:val="18"/>
-              </w:rPr>
-              <w:t>7,40 V (08:20)</w:t>
-            </w:r>
-          </w:p>
-        </w:tc>
-        <w:tc>
-          <w:tcPr>
-            <w:tcW w:type="dxa" w:w="4195"/>
-            <w:tcBorders>
-              <w:top w:val="single" w:sz="4" w:space="0" w:color="000000"/>
-              <w:left w:val="single" w:sz="4" w:space="0" w:color="000000"/>
-              <w:bottom w:val="single" w:sz="4" w:space="0" w:color="000000"/>
-              <w:right w:val="single" w:sz="4" w:space="0" w:color="000000"/>
-            </w:tcBorders>
-          </w:tcPr>
-          <w:p>
-            <w:pPr>
-              <w:keepNext/>
-              <w:spacing w:line="240" w:lineRule="auto" w:after="20"/>
-              <w:jc w:val="center"/>
-            </w:pPr>
-            <w:r>
-              <w:rPr>
-                <w:rFonts w:ascii="Times New Roman" w:hAnsi="Times New Roman" w:cs="Times New Roman" w:eastAsia="Times New Roman"/>
-                <w:b w:val="0"/>
-                <w:i w:val="0"/>
-                <w:sz w:val="18"/>
-              </w:rPr>
-              <w:t>Osiloskop, bölücü</w:t>
-            </w:r>
-          </w:p>
-        </w:tc>
-      </w:tr>
-      <w:tr>
-        <w:trPr>
-          <w:cantSplit/>
-        </w:trPr>
-        <w:tc>
-          <w:tcPr>
-            <w:tcW w:type="dxa" w:w="1247"/>
-            <w:tcBorders>
-              <w:top w:val="single" w:sz="4" w:space="0" w:color="000000"/>
-              <w:left w:val="single" w:sz="4" w:space="0" w:color="000000"/>
-              <w:bottom w:val="single" w:sz="4" w:space="0" w:color="000000"/>
-              <w:right w:val="single" w:sz="4" w:space="0" w:color="000000"/>
-            </w:tcBorders>
-          </w:tcPr>
-          <w:p>
-            <w:pPr>
-              <w:keepNext/>
-              <w:spacing w:line="240" w:lineRule="auto" w:after="20"/>
-              <w:jc w:val="left"/>
-            </w:pPr>
-            <w:r>
-              <w:rPr>
-                <w:rFonts w:ascii="Times New Roman" w:hAnsi="Times New Roman" w:cs="Times New Roman" w:eastAsia="Times New Roman"/>
-                <w:b w:val="0"/>
-                <w:i w:val="0"/>
-                <w:sz w:val="18"/>
-              </w:rPr>
-              <w:t>8</w:t>
-            </w:r>
-          </w:p>
-        </w:tc>
-        <w:tc>
-          <w:tcPr>
-            <w:tcW w:type="dxa" w:w="2494"/>
-            <w:tcBorders>
-              <w:top w:val="single" w:sz="4" w:space="0" w:color="000000"/>
-              <w:left w:val="single" w:sz="4" w:space="0" w:color="000000"/>
-              <w:bottom w:val="single" w:sz="4" w:space="0" w:color="000000"/>
-              <w:right w:val="single" w:sz="4" w:space="0" w:color="000000"/>
-            </w:tcBorders>
-          </w:tcPr>
-          <w:p>
-            <w:pPr>
-              <w:keepNext/>
-              <w:spacing w:line="240" w:lineRule="auto" w:after="20"/>
-              <w:jc w:val="center"/>
-            </w:pPr>
-            <w:r>
-              <w:rPr>
-                <w:rFonts w:ascii="Times New Roman" w:hAnsi="Times New Roman" w:cs="Times New Roman" w:eastAsia="Times New Roman"/>
-                <w:b w:val="0"/>
-                <w:i w:val="0"/>
-                <w:sz w:val="18"/>
-              </w:rPr>
-              <w:t>6,5 V</w:t>
-            </w:r>
-          </w:p>
-        </w:tc>
-        <w:tc>
-          <w:tcPr>
-            <w:tcW w:type="dxa" w:w="4195"/>
-            <w:tcBorders>
-              <w:top w:val="single" w:sz="4" w:space="0" w:color="000000"/>
-              <w:left w:val="single" w:sz="4" w:space="0" w:color="000000"/>
-              <w:bottom w:val="single" w:sz="4" w:space="0" w:color="000000"/>
-              <w:right w:val="single" w:sz="4" w:space="0" w:color="000000"/>
-            </w:tcBorders>
-          </w:tcPr>
-          <w:p>
-            <w:pPr>
-              <w:keepNext/>
-              <w:spacing w:line="240" w:lineRule="auto" w:after="20"/>
-              <w:jc w:val="center"/>
-            </w:pPr>
-            <w:r>
-              <w:rPr>
-                <w:rFonts w:ascii="Times New Roman" w:hAnsi="Times New Roman" w:cs="Times New Roman" w:eastAsia="Times New Roman"/>
-                <w:b w:val="0"/>
-                <w:i w:val="0"/>
-                <w:sz w:val="18"/>
-              </w:rPr>
-              <w:t>Multimetre, bölücü (100 kΩ)</w:t>
-            </w:r>
-          </w:p>
-        </w:tc>
-      </w:tr>
-      <w:tr>
-        <w:trPr>
-          <w:cantSplit/>
-        </w:trPr>
-        <w:tc>
-          <w:tcPr>
-            <w:tcW w:type="dxa" w:w="1247"/>
-            <w:tcBorders>
-              <w:top w:val="single" w:sz="4" w:space="0" w:color="000000"/>
-              <w:left w:val="single" w:sz="4" w:space="0" w:color="000000"/>
-              <w:bottom w:val="single" w:sz="4" w:space="0" w:color="000000"/>
-              <w:right w:val="single" w:sz="4" w:space="0" w:color="000000"/>
-            </w:tcBorders>
-          </w:tcPr>
-          <w:p>
-            <w:pPr>
-              <w:keepNext/>
-              <w:spacing w:line="240" w:lineRule="auto" w:after="20"/>
-              <w:jc w:val="left"/>
-            </w:pPr>
-            <w:r>
-              <w:rPr>
-                <w:rFonts w:ascii="Times New Roman" w:hAnsi="Times New Roman" w:cs="Times New Roman" w:eastAsia="Times New Roman"/>
-                <w:b w:val="0"/>
-                <w:i w:val="0"/>
-                <w:sz w:val="18"/>
-              </w:rPr>
-              <w:t>9</w:t>
-            </w:r>
-          </w:p>
-        </w:tc>
-        <w:tc>
-          <w:tcPr>
-            <w:tcW w:type="dxa" w:w="2494"/>
-            <w:tcBorders>
-              <w:top w:val="single" w:sz="4" w:space="0" w:color="000000"/>
-              <w:left w:val="single" w:sz="4" w:space="0" w:color="000000"/>
-              <w:bottom w:val="single" w:sz="4" w:space="0" w:color="000000"/>
-              <w:right w:val="single" w:sz="4" w:space="0" w:color="000000"/>
-            </w:tcBorders>
-          </w:tcPr>
-          <w:p>
-            <w:pPr>
-              <w:keepNext/>
-              <w:spacing w:line="240" w:lineRule="auto" w:after="20"/>
-              <w:jc w:val="center"/>
-            </w:pPr>
-            <w:r>
-              <w:rPr>
-                <w:rFonts w:ascii="Times New Roman" w:hAnsi="Times New Roman" w:cs="Times New Roman" w:eastAsia="Times New Roman"/>
-                <w:b w:val="0"/>
-                <w:i w:val="0"/>
-                <w:sz w:val="18"/>
-              </w:rPr>
-              <w:t>50 Hz; en büyük 9,40 V; t.t. 21,4 V</w:t>
-            </w:r>
-          </w:p>
-        </w:tc>
-        <w:tc>
-          <w:tcPr>
-            <w:tcW w:type="dxa" w:w="4195"/>
-            <w:tcBorders>
-              <w:top w:val="single" w:sz="4" w:space="0" w:color="000000"/>
-              <w:left w:val="single" w:sz="4" w:space="0" w:color="000000"/>
-              <w:bottom w:val="single" w:sz="4" w:space="0" w:color="000000"/>
-              <w:right w:val="single" w:sz="4" w:space="0" w:color="000000"/>
-            </w:tcBorders>
-          </w:tcPr>
-          <w:p>
-            <w:pPr>
-              <w:keepNext/>
-              <w:spacing w:line="240" w:lineRule="auto" w:after="20"/>
-              <w:jc w:val="center"/>
-            </w:pPr>
-            <w:r>
-              <w:rPr>
-                <w:rFonts w:ascii="Times New Roman" w:hAnsi="Times New Roman" w:cs="Times New Roman" w:eastAsia="Times New Roman"/>
-                <w:b w:val="0"/>
-                <w:i w:val="0"/>
-                <w:sz w:val="18"/>
-              </w:rPr>
-              <w:t>Osiloskop (08:25), 10 MΩ</w:t>
-            </w:r>
-          </w:p>
-        </w:tc>
-      </w:tr>
-      <w:tr>
-        <w:trPr>
-          <w:cantSplit/>
-        </w:trPr>
-        <w:tc>
-          <w:tcPr>
-            <w:tcW w:type="dxa" w:w="1247"/>
-            <w:tcBorders>
-              <w:top w:val="single" w:sz="4" w:space="0" w:color="000000"/>
-              <w:left w:val="single" w:sz="4" w:space="0" w:color="000000"/>
-              <w:bottom w:val="single" w:sz="4" w:space="0" w:color="000000"/>
-              <w:right w:val="single" w:sz="4" w:space="0" w:color="000000"/>
-            </w:tcBorders>
-          </w:tcPr>
-          <w:p>
-            <w:pPr>
-              <w:keepNext/>
-              <w:spacing w:line="240" w:lineRule="auto" w:after="20"/>
-              <w:jc w:val="left"/>
-            </w:pPr>
-            <w:r>
-              <w:rPr>
-                <w:rFonts w:ascii="Times New Roman" w:hAnsi="Times New Roman" w:cs="Times New Roman" w:eastAsia="Times New Roman"/>
-                <w:b w:val="0"/>
-                <w:i w:val="0"/>
-                <w:sz w:val="18"/>
-              </w:rPr>
-              <w:t>10</w:t>
-            </w:r>
-          </w:p>
-        </w:tc>
-        <w:tc>
-          <w:tcPr>
-            <w:tcW w:type="dxa" w:w="2494"/>
-            <w:tcBorders>
-              <w:top w:val="single" w:sz="4" w:space="0" w:color="000000"/>
-              <w:left w:val="single" w:sz="4" w:space="0" w:color="000000"/>
-              <w:bottom w:val="single" w:sz="4" w:space="0" w:color="000000"/>
-              <w:right w:val="single" w:sz="4" w:space="0" w:color="000000"/>
-            </w:tcBorders>
-          </w:tcPr>
-          <w:p>
-            <w:pPr>
-              <w:keepNext/>
-              <w:spacing w:line="240" w:lineRule="auto" w:after="20"/>
-              <w:jc w:val="center"/>
-            </w:pPr>
-            <w:r>
-              <w:rPr>
-                <w:rFonts w:ascii="Times New Roman" w:hAnsi="Times New Roman" w:cs="Times New Roman" w:eastAsia="Times New Roman"/>
-                <w:b w:val="0"/>
-                <w:i w:val="0"/>
-                <w:sz w:val="18"/>
-              </w:rPr>
-              <w:t>0,9 V</w:t>
-            </w:r>
-          </w:p>
-        </w:tc>
-        <w:tc>
-          <w:tcPr>
-            <w:tcW w:type="dxa" w:w="4195"/>
-            <w:tcBorders>
-              <w:top w:val="single" w:sz="4" w:space="0" w:color="000000"/>
-              <w:left w:val="single" w:sz="4" w:space="0" w:color="000000"/>
-              <w:bottom w:val="single" w:sz="4" w:space="0" w:color="000000"/>
-              <w:right w:val="single" w:sz="4" w:space="0" w:color="000000"/>
-            </w:tcBorders>
-          </w:tcPr>
-          <w:p>
-            <w:pPr>
-              <w:keepNext/>
-              <w:spacing w:line="240" w:lineRule="auto" w:after="20"/>
-              <w:jc w:val="center"/>
-            </w:pPr>
-            <w:r>
-              <w:rPr>
-                <w:rFonts w:ascii="Times New Roman" w:hAnsi="Times New Roman" w:cs="Times New Roman" w:eastAsia="Times New Roman"/>
-                <w:b w:val="0"/>
-                <w:i w:val="0"/>
-                <w:sz w:val="18"/>
-              </w:rPr>
-              <w:t>Multimetre, bölücü (10 MΩ)</w:t>
-            </w:r>
-          </w:p>
-        </w:tc>
-      </w:tr>
-      <w:tr>
-        <w:trPr>
-          <w:cantSplit/>
-        </w:trPr>
-        <w:tc>
-          <w:tcPr>
-            <w:tcW w:type="dxa" w:w="1247"/>
-            <w:tcBorders>
-              <w:top w:val="single" w:sz="4" w:space="0" w:color="000000"/>
-              <w:left w:val="single" w:sz="4" w:space="0" w:color="000000"/>
-              <w:bottom w:val="single" w:sz="4" w:space="0" w:color="000000"/>
-              <w:right w:val="single" w:sz="4" w:space="0" w:color="000000"/>
-            </w:tcBorders>
-          </w:tcPr>
-          <w:p>
-            <w:pPr>
-              <w:keepNext/>
-              <w:spacing w:line="240" w:lineRule="auto" w:after="20"/>
-              <w:jc w:val="left"/>
-            </w:pPr>
-            <w:r>
-              <w:rPr>
-                <w:rFonts w:ascii="Times New Roman" w:hAnsi="Times New Roman" w:cs="Times New Roman" w:eastAsia="Times New Roman"/>
-                <w:b w:val="0"/>
-                <w:i w:val="0"/>
-                <w:sz w:val="18"/>
-              </w:rPr>
-              <w:t>11</w:t>
-            </w:r>
-          </w:p>
-        </w:tc>
-        <w:tc>
-          <w:tcPr>
-            <w:tcW w:type="dxa" w:w="2494"/>
-            <w:tcBorders>
-              <w:top w:val="single" w:sz="4" w:space="0" w:color="000000"/>
-              <w:left w:val="single" w:sz="4" w:space="0" w:color="000000"/>
-              <w:bottom w:val="single" w:sz="4" w:space="0" w:color="000000"/>
-              <w:right w:val="single" w:sz="4" w:space="0" w:color="000000"/>
-            </w:tcBorders>
-          </w:tcPr>
-          <w:p>
-            <w:pPr>
-              <w:keepNext/>
-              <w:spacing w:line="240" w:lineRule="auto" w:after="20"/>
-              <w:jc w:val="center"/>
-            </w:pPr>
-            <w:r>
-              <w:rPr>
-                <w:rFonts w:ascii="Times New Roman" w:hAnsi="Times New Roman" w:cs="Times New Roman" w:eastAsia="Times New Roman"/>
-                <w:b w:val="0"/>
-                <w:i w:val="0"/>
-                <w:sz w:val="18"/>
-              </w:rPr>
-              <w:t>7,4 V (08:23)</w:t>
-            </w:r>
-          </w:p>
-        </w:tc>
-        <w:tc>
-          <w:tcPr>
-            <w:tcW w:type="dxa" w:w="4195"/>
-            <w:tcBorders>
-              <w:top w:val="single" w:sz="4" w:space="0" w:color="000000"/>
-              <w:left w:val="single" w:sz="4" w:space="0" w:color="000000"/>
-              <w:bottom w:val="single" w:sz="4" w:space="0" w:color="000000"/>
-              <w:right w:val="single" w:sz="4" w:space="0" w:color="000000"/>
-            </w:tcBorders>
-          </w:tcPr>
-          <w:p>
-            <w:pPr>
-              <w:keepNext/>
-              <w:spacing w:line="240" w:lineRule="auto" w:after="20"/>
-              <w:jc w:val="center"/>
-            </w:pPr>
-            <w:r>
-              <w:rPr>
-                <w:rFonts w:ascii="Times New Roman" w:hAnsi="Times New Roman" w:cs="Times New Roman" w:eastAsia="Times New Roman"/>
-                <w:b w:val="0"/>
-                <w:i w:val="0"/>
-                <w:sz w:val="18"/>
-              </w:rPr>
-              <w:t>Osiloskop, bölücü (100 kΩ)</w:t>
-            </w:r>
-          </w:p>
-        </w:tc>
-      </w:tr>
-      <w:tr>
-        <w:trPr>
-          <w:cantSplit/>
-        </w:trPr>
-        <w:tc>
-          <w:tcPr>
-            <w:tcW w:type="dxa" w:w="1247"/>
-            <w:tcBorders>
-              <w:top w:val="single" w:sz="4" w:space="0" w:color="000000"/>
-              <w:left w:val="single" w:sz="4" w:space="0" w:color="000000"/>
-              <w:bottom w:val="single" w:sz="4" w:space="0" w:color="000000"/>
-              <w:right w:val="single" w:sz="4" w:space="0" w:color="000000"/>
-            </w:tcBorders>
-          </w:tcPr>
-          <w:p>
-            <w:pPr>
-              <w:keepNext/>
-              <w:spacing w:line="240" w:lineRule="auto" w:after="20"/>
-              <w:jc w:val="left"/>
-            </w:pPr>
-            <w:r>
-              <w:rPr>
-                <w:rFonts w:ascii="Times New Roman" w:hAnsi="Times New Roman" w:cs="Times New Roman" w:eastAsia="Times New Roman"/>
-                <w:b w:val="0"/>
-                <w:i w:val="0"/>
-                <w:sz w:val="18"/>
-              </w:rPr>
-              <w:t>12</w:t>
-            </w:r>
-          </w:p>
-        </w:tc>
-        <w:tc>
-          <w:tcPr>
-            <w:tcW w:type="dxa" w:w="2494"/>
-            <w:tcBorders>
-              <w:top w:val="single" w:sz="4" w:space="0" w:color="000000"/>
-              <w:left w:val="single" w:sz="4" w:space="0" w:color="000000"/>
-              <w:bottom w:val="single" w:sz="4" w:space="0" w:color="000000"/>
-              <w:right w:val="single" w:sz="4" w:space="0" w:color="000000"/>
-            </w:tcBorders>
-          </w:tcPr>
-          <w:p>
-            <w:pPr>
-              <w:keepNext/>
-              <w:spacing w:line="240" w:lineRule="auto" w:after="20"/>
-              <w:jc w:val="center"/>
-            </w:pPr>
-            <w:r>
-              <w:rPr>
-                <w:rFonts w:ascii="Times New Roman" w:hAnsi="Times New Roman" w:cs="Times New Roman" w:eastAsia="Times New Roman"/>
-                <w:b w:val="0"/>
-                <w:i w:val="0"/>
-                <w:sz w:val="18"/>
-              </w:rPr>
-              <w:t>3,26 kΩ</w:t>
-            </w:r>
-          </w:p>
-        </w:tc>
-        <w:tc>
-          <w:tcPr>
-            <w:tcW w:type="dxa" w:w="4195"/>
-            <w:tcBorders>
-              <w:top w:val="single" w:sz="4" w:space="0" w:color="000000"/>
-              <w:left w:val="single" w:sz="4" w:space="0" w:color="000000"/>
-              <w:bottom w:val="single" w:sz="4" w:space="0" w:color="000000"/>
-              <w:right w:val="single" w:sz="4" w:space="0" w:color="000000"/>
-            </w:tcBorders>
-          </w:tcPr>
-          <w:p>
-            <w:pPr>
-              <w:keepNext/>
-              <w:spacing w:line="240" w:lineRule="auto" w:after="20"/>
-              <w:jc w:val="center"/>
-            </w:pPr>
-            <m:oMath>
-              <m:sSub>
-                <m:e>
-                  <m:r>
-                    <m:t>R</m:t>
-                  </m:r>
-                </m:e>
-                <m:sub>
-                  <m:r>
-                    <m:t>x</m:t>
-                  </m:r>
-                </m:sub>
-              </m:sSub>
-            </m:oMath>
-            <w:r>
-              <w:rPr>
-                <w:rFonts w:ascii="Times New Roman" w:hAnsi="Times New Roman" w:cs="Times New Roman" w:eastAsia="Times New Roman"/>
-                <w:b w:val="0"/>
-                <w:i w:val="0"/>
-                <w:sz w:val="18"/>
-              </w:rPr>
-              <w:t xml:space="preserve"> doğrudan (devre tahtası sahnesi)</w:t>
-            </w:r>
-          </w:p>
-        </w:tc>
-      </w:tr>
-      <w:tr>
-        <w:trPr>
-          <w:cantSplit/>
-        </w:trPr>
-        <w:tc>
-          <w:tcPr>
-            <w:tcW w:type="dxa" w:w="1247"/>
-            <w:tcBorders>
-              <w:top w:val="single" w:sz="4" w:space="0" w:color="000000"/>
-              <w:left w:val="single" w:sz="4" w:space="0" w:color="000000"/>
-              <w:bottom w:val="single" w:sz="4" w:space="0" w:color="000000"/>
-              <w:right w:val="single" w:sz="4" w:space="0" w:color="000000"/>
-            </w:tcBorders>
-          </w:tcPr>
-          <w:p>
-            <w:pPr>
-              <w:keepNext/>
-              <w:spacing w:line="240" w:lineRule="auto" w:after="20"/>
-              <w:jc w:val="left"/>
-            </w:pPr>
-            <w:r>
-              <w:rPr>
-                <w:rFonts w:ascii="Times New Roman" w:hAnsi="Times New Roman" w:cs="Times New Roman" w:eastAsia="Times New Roman"/>
-                <w:b w:val="0"/>
-                <w:i w:val="0"/>
-                <w:sz w:val="18"/>
-              </w:rPr>
-              <w:t>13</w:t>
-            </w:r>
-          </w:p>
-        </w:tc>
-        <w:tc>
-          <w:tcPr>
-            <w:tcW w:type="dxa" w:w="2494"/>
-            <w:tcBorders>
-              <w:top w:val="single" w:sz="4" w:space="0" w:color="000000"/>
-              <w:left w:val="single" w:sz="4" w:space="0" w:color="000000"/>
-              <w:bottom w:val="single" w:sz="4" w:space="0" w:color="000000"/>
-              <w:right w:val="single" w:sz="4" w:space="0" w:color="000000"/>
-            </w:tcBorders>
-          </w:tcPr>
-          <w:p>
-            <w:pPr>
-              <w:keepNext/>
-              <w:spacing w:line="240" w:lineRule="auto" w:after="20"/>
-              <w:jc w:val="center"/>
-            </w:pPr>
-            <w:r>
-              <w:rPr>
-                <w:rFonts w:ascii="Times New Roman" w:hAnsi="Times New Roman" w:cs="Times New Roman" w:eastAsia="Times New Roman"/>
-                <w:b w:val="0"/>
-                <w:i w:val="0"/>
-                <w:sz w:val="18"/>
-              </w:rPr>
-              <w:t>0,00 V</w:t>
-            </w:r>
-          </w:p>
-        </w:tc>
-        <w:tc>
-          <w:tcPr>
-            <w:tcW w:type="dxa" w:w="4195"/>
-            <w:tcBorders>
-              <w:top w:val="single" w:sz="4" w:space="0" w:color="000000"/>
-              <w:left w:val="single" w:sz="4" w:space="0" w:color="000000"/>
-              <w:bottom w:val="single" w:sz="4" w:space="0" w:color="000000"/>
-              <w:right w:val="single" w:sz="4" w:space="0" w:color="000000"/>
-            </w:tcBorders>
-          </w:tcPr>
-          <w:p>
-            <w:pPr>
-              <w:keepNext/>
-              <w:spacing w:line="240" w:lineRule="auto" w:after="20"/>
-              <w:jc w:val="center"/>
-            </w:pPr>
-            <w:r>
-              <w:rPr>
-                <w:rFonts w:ascii="Times New Roman" w:hAnsi="Times New Roman" w:cs="Times New Roman" w:eastAsia="Times New Roman"/>
-                <w:b w:val="0"/>
-                <w:i w:val="0"/>
-                <w:sz w:val="18"/>
-              </w:rPr>
-              <w:t xml:space="preserve">Köprü </w:t>
-            </w:r>
-            <m:oMath>
-              <m:sSub>
-                <m:e>
-                  <m:r>
-                    <m:t>V</m:t>
-                  </m:r>
-                </m:e>
-                <m:sub>
-                  <m:r>
-                    <m:t>B</m:t>
-                  </m:r>
-                </m:sub>
-              </m:sSub>
-            </m:oMath>
-            <w:r>
-              <w:rPr>
-                <w:rFonts w:ascii="Times New Roman" w:hAnsi="Times New Roman" w:cs="Times New Roman" w:eastAsia="Times New Roman"/>
-                <w:b w:val="0"/>
-                <w:i w:val="0"/>
-                <w:sz w:val="18"/>
-              </w:rPr>
-              <w:t xml:space="preserve"> (denge)</w:t>
-            </w:r>
-          </w:p>
-        </w:tc>
-      </w:tr>
-      <w:tr>
-        <w:trPr>
-          <w:cantSplit/>
-        </w:trPr>
-        <w:tc>
-          <w:tcPr>
-            <w:tcW w:type="dxa" w:w="1247"/>
-            <w:tcBorders>
-              <w:top w:val="single" w:sz="4" w:space="0" w:color="000000"/>
-              <w:left w:val="single" w:sz="4" w:space="0" w:color="000000"/>
-              <w:bottom w:val="single" w:sz="4" w:space="0" w:color="000000"/>
-              <w:right w:val="single" w:sz="4" w:space="0" w:color="000000"/>
-            </w:tcBorders>
-          </w:tcPr>
-          <w:p>
-            <w:pPr>
-              <w:keepNext/>
-              <w:spacing w:line="240" w:lineRule="auto" w:after="20"/>
-              <w:jc w:val="left"/>
-            </w:pPr>
-            <w:r>
-              <w:rPr>
-                <w:rFonts w:ascii="Times New Roman" w:hAnsi="Times New Roman" w:cs="Times New Roman" w:eastAsia="Times New Roman"/>
-                <w:b w:val="0"/>
-                <w:i w:val="0"/>
-                <w:sz w:val="18"/>
-              </w:rPr>
-              <w:t>14</w:t>
-            </w:r>
-          </w:p>
-        </w:tc>
-        <w:tc>
-          <w:tcPr>
-            <w:tcW w:type="dxa" w:w="2494"/>
-            <w:tcBorders>
-              <w:top w:val="single" w:sz="4" w:space="0" w:color="000000"/>
-              <w:left w:val="single" w:sz="4" w:space="0" w:color="000000"/>
-              <w:bottom w:val="single" w:sz="4" w:space="0" w:color="000000"/>
-              <w:right w:val="single" w:sz="4" w:space="0" w:color="000000"/>
-            </w:tcBorders>
-          </w:tcPr>
-          <w:p>
-            <w:pPr>
-              <w:keepNext/>
-              <w:spacing w:line="240" w:lineRule="auto" w:after="20"/>
-              <w:jc w:val="center"/>
-            </w:pPr>
-            <w:r>
-              <w:rPr>
-                <w:rFonts w:ascii="Times New Roman" w:hAnsi="Times New Roman" w:cs="Times New Roman" w:eastAsia="Times New Roman"/>
-                <w:b w:val="0"/>
-                <w:i w:val="0"/>
-                <w:sz w:val="18"/>
-              </w:rPr>
-              <w:t>3,22 kΩ</w:t>
-            </w:r>
-          </w:p>
-        </w:tc>
-        <w:tc>
-          <w:tcPr>
-            <w:tcW w:type="dxa" w:w="4195"/>
-            <w:tcBorders>
-              <w:top w:val="single" w:sz="4" w:space="0" w:color="000000"/>
-              <w:left w:val="single" w:sz="4" w:space="0" w:color="000000"/>
-              <w:bottom w:val="single" w:sz="4" w:space="0" w:color="000000"/>
-              <w:right w:val="single" w:sz="4" w:space="0" w:color="000000"/>
-            </w:tcBorders>
-          </w:tcPr>
-          <w:p>
-            <w:pPr>
-              <w:keepNext/>
-              <w:spacing w:line="240" w:lineRule="auto" w:after="20"/>
-              <w:jc w:val="center"/>
-            </w:pPr>
-            <m:oMath>
-              <m:sSub>
-                <m:e>
-                  <m:r>
-                    <m:t>R</m:t>
-                  </m:r>
-                </m:e>
-                <m:sub>
-                  <m:r>
-                    <m:t>3</m:t>
-                  </m:r>
-                </m:sub>
-              </m:sSub>
-            </m:oMath>
-            <w:r>
-              <w:rPr>
-                <w:rFonts w:ascii="Times New Roman" w:hAnsi="Times New Roman" w:cs="Times New Roman" w:eastAsia="Times New Roman"/>
-                <w:b w:val="0"/>
-                <w:i w:val="0"/>
-                <w:sz w:val="18"/>
-              </w:rPr>
-              <w:t xml:space="preserve"> (potansiyometre, devreden çıkarılmış)</w:t>
-            </w:r>
-          </w:p>
-        </w:tc>
-      </w:tr>
-      <w:tr>
-        <w:trPr>
-          <w:cantSplit/>
-        </w:trPr>
-        <w:tc>
-          <w:tcPr>
-            <w:tcW w:type="dxa" w:w="1247"/>
-            <w:tcBorders>
-              <w:top w:val="single" w:sz="4" w:space="0" w:color="000000"/>
-              <w:left w:val="single" w:sz="4" w:space="0" w:color="000000"/>
-              <w:bottom w:val="single" w:sz="4" w:space="0" w:color="000000"/>
-              <w:right w:val="single" w:sz="4" w:space="0" w:color="000000"/>
-            </w:tcBorders>
-          </w:tcPr>
-          <w:p>
-            <w:pPr>
-              <w:keepNext/>
-              <w:spacing w:line="240" w:lineRule="auto" w:after="20"/>
-              <w:jc w:val="left"/>
-            </w:pPr>
-            <w:r>
-              <w:rPr>
-                <w:rFonts w:ascii="Times New Roman" w:hAnsi="Times New Roman" w:cs="Times New Roman" w:eastAsia="Times New Roman"/>
-                <w:b w:val="0"/>
-                <w:i w:val="0"/>
-                <w:sz w:val="18"/>
-              </w:rPr>
-              <w:t>15</w:t>
-            </w:r>
-          </w:p>
-        </w:tc>
-        <w:tc>
-          <w:tcPr>
-            <w:tcW w:type="dxa" w:w="2494"/>
-            <w:tcBorders>
-              <w:top w:val="single" w:sz="4" w:space="0" w:color="000000"/>
-              <w:left w:val="single" w:sz="4" w:space="0" w:color="000000"/>
-              <w:bottom w:val="single" w:sz="4" w:space="0" w:color="000000"/>
-              <w:right w:val="single" w:sz="4" w:space="0" w:color="000000"/>
-            </w:tcBorders>
-          </w:tcPr>
-          <w:p>
-            <w:pPr>
-              <w:keepNext/>
-              <w:spacing w:line="240" w:lineRule="auto" w:after="20"/>
-              <w:jc w:val="center"/>
-            </w:pPr>
-            <w:r>
-              <w:rPr>
-                <w:rFonts w:ascii="Times New Roman" w:hAnsi="Times New Roman" w:cs="Times New Roman" w:eastAsia="Times New Roman"/>
-                <w:b w:val="0"/>
-                <w:i w:val="0"/>
-                <w:sz w:val="18"/>
-              </w:rPr>
-              <w:t>3,26 kΩ</w:t>
-            </w:r>
-          </w:p>
-        </w:tc>
-        <w:tc>
-          <w:tcPr>
-            <w:tcW w:type="dxa" w:w="4195"/>
-            <w:tcBorders>
-              <w:top w:val="single" w:sz="4" w:space="0" w:color="000000"/>
-              <w:left w:val="single" w:sz="4" w:space="0" w:color="000000"/>
-              <w:bottom w:val="single" w:sz="4" w:space="0" w:color="000000"/>
-              <w:right w:val="single" w:sz="4" w:space="0" w:color="000000"/>
-            </w:tcBorders>
-          </w:tcPr>
-          <w:p>
-            <w:pPr>
-              <w:keepNext/>
-              <w:spacing w:line="240" w:lineRule="auto" w:after="20"/>
-              <w:jc w:val="center"/>
-            </w:pPr>
-            <m:oMath>
-              <m:sSub>
-                <m:e>
-                  <m:r>
-                    <m:t>R</m:t>
-                  </m:r>
-                </m:e>
-                <m:sub>
-                  <m:r>
-                    <m:t>x</m:t>
-                  </m:r>
-                </m:sub>
-              </m:sSub>
-            </m:oMath>
-            <w:r>
-              <w:rPr>
-                <w:rFonts w:ascii="Times New Roman" w:hAnsi="Times New Roman" w:cs="Times New Roman" w:eastAsia="Times New Roman"/>
-                <w:b w:val="0"/>
-                <w:i w:val="0"/>
-                <w:sz w:val="18"/>
-              </w:rPr>
-              <w:t xml:space="preserve"> doğrudan</w:t>
-            </w:r>
-          </w:p>
-        </w:tc>
-      </w:tr>
-      <w:tr>
-        <w:trPr>
-          <w:cantSplit/>
-        </w:trPr>
-        <w:tc>
-          <w:tcPr>
-            <w:tcW w:type="dxa" w:w="1247"/>
-            <w:tcBorders>
-              <w:top w:val="single" w:sz="4" w:space="0" w:color="000000"/>
-              <w:left w:val="single" w:sz="4" w:space="0" w:color="000000"/>
-              <w:bottom w:val="single" w:sz="4" w:space="0" w:color="000000"/>
-              <w:right w:val="single" w:sz="4" w:space="0" w:color="000000"/>
-            </w:tcBorders>
-          </w:tcPr>
-          <w:p>
-            <w:pPr>
-              <w:keepNext/>
-              <w:spacing w:line="240" w:lineRule="auto" w:after="20"/>
-              <w:jc w:val="left"/>
-            </w:pPr>
-            <w:r>
-              <w:rPr>
-                <w:rFonts w:ascii="Times New Roman" w:hAnsi="Times New Roman" w:cs="Times New Roman" w:eastAsia="Times New Roman"/>
-                <w:b w:val="0"/>
-                <w:i w:val="0"/>
-                <w:sz w:val="18"/>
-              </w:rPr>
-              <w:t>16</w:t>
-            </w:r>
-          </w:p>
-        </w:tc>
-        <w:tc>
-          <w:tcPr>
-            <w:tcW w:type="dxa" w:w="2494"/>
-            <w:tcBorders>
-              <w:top w:val="single" w:sz="4" w:space="0" w:color="000000"/>
-              <w:left w:val="single" w:sz="4" w:space="0" w:color="000000"/>
-              <w:bottom w:val="single" w:sz="4" w:space="0" w:color="000000"/>
-              <w:right w:val="single" w:sz="4" w:space="0" w:color="000000"/>
-            </w:tcBorders>
-          </w:tcPr>
-          <w:p>
-            <w:pPr>
-              <w:keepNext/>
-              <w:spacing w:line="240" w:lineRule="auto" w:after="20"/>
-              <w:jc w:val="center"/>
-            </w:pPr>
-            <w:r>
-              <w:rPr>
-                <w:rFonts w:ascii="Times New Roman" w:hAnsi="Times New Roman" w:cs="Times New Roman" w:eastAsia="Times New Roman"/>
-                <w:b w:val="0"/>
-                <w:i w:val="0"/>
-                <w:sz w:val="18"/>
-              </w:rPr>
-              <w:t>456 Ω</w:t>
-            </w:r>
-          </w:p>
-        </w:tc>
-        <w:tc>
-          <w:tcPr>
-            <w:tcW w:type="dxa" w:w="4195"/>
-            <w:tcBorders>
-              <w:top w:val="single" w:sz="4" w:space="0" w:color="000000"/>
-              <w:left w:val="single" w:sz="4" w:space="0" w:color="000000"/>
-              <w:bottom w:val="single" w:sz="4" w:space="0" w:color="000000"/>
-              <w:right w:val="single" w:sz="4" w:space="0" w:color="000000"/>
-            </w:tcBorders>
-          </w:tcPr>
-          <w:p>
-            <w:pPr>
-              <w:keepNext/>
-              <w:spacing w:line="240" w:lineRule="auto" w:after="20"/>
-              <w:jc w:val="center"/>
-            </w:pPr>
-            <w:r>
-              <w:rPr>
-                <w:rFonts w:ascii="Times New Roman" w:hAnsi="Times New Roman" w:cs="Times New Roman" w:eastAsia="Times New Roman"/>
-                <w:b w:val="0"/>
-                <w:i w:val="0"/>
-                <w:sz w:val="18"/>
-              </w:rPr>
-              <w:t>Köprü direnç ölçümü</w:t>
-            </w:r>
-          </w:p>
-        </w:tc>
-      </w:tr>
-      <w:tr>
-        <w:trPr>
-          <w:cantSplit/>
-        </w:trPr>
-        <w:tc>
-          <w:tcPr>
-            <w:tcW w:type="dxa" w:w="1247"/>
-            <w:tcBorders>
-              <w:top w:val="single" w:sz="4" w:space="0" w:color="000000"/>
-              <w:left w:val="single" w:sz="4" w:space="0" w:color="000000"/>
-              <w:bottom w:val="single" w:sz="4" w:space="0" w:color="000000"/>
-              <w:right w:val="single" w:sz="4" w:space="0" w:color="000000"/>
-            </w:tcBorders>
-          </w:tcPr>
-          <w:p>
-            <w:pPr>
-              <w:keepNext/>
-              <w:spacing w:line="240" w:lineRule="auto" w:after="20"/>
-              <w:jc w:val="left"/>
-            </w:pPr>
-            <w:r>
-              <w:rPr>
-                <w:rFonts w:ascii="Times New Roman" w:hAnsi="Times New Roman" w:cs="Times New Roman" w:eastAsia="Times New Roman"/>
-                <w:b w:val="0"/>
-                <w:i w:val="0"/>
-                <w:sz w:val="18"/>
-              </w:rPr>
-              <w:t>17</w:t>
-            </w:r>
-          </w:p>
-        </w:tc>
-        <w:tc>
-          <w:tcPr>
-            <w:tcW w:type="dxa" w:w="2494"/>
-            <w:tcBorders>
-              <w:top w:val="single" w:sz="4" w:space="0" w:color="000000"/>
-              <w:left w:val="single" w:sz="4" w:space="0" w:color="000000"/>
-              <w:bottom w:val="single" w:sz="4" w:space="0" w:color="000000"/>
-              <w:right w:val="single" w:sz="4" w:space="0" w:color="000000"/>
-            </w:tcBorders>
-          </w:tcPr>
-          <w:p>
-            <w:pPr>
-              <w:keepNext/>
-              <w:spacing w:line="240" w:lineRule="auto" w:after="20"/>
-              <w:jc w:val="center"/>
-            </w:pPr>
-            <w:r>
-              <w:rPr>
-                <w:rFonts w:ascii="Times New Roman" w:hAnsi="Times New Roman" w:cs="Times New Roman" w:eastAsia="Times New Roman"/>
-                <w:b w:val="0"/>
-                <w:i w:val="0"/>
-                <w:sz w:val="18"/>
-              </w:rPr>
-              <w:t>7,34 V</w:t>
-            </w:r>
-          </w:p>
-        </w:tc>
-        <w:tc>
-          <w:tcPr>
-            <w:tcW w:type="dxa" w:w="4195"/>
-            <w:tcBorders>
-              <w:top w:val="single" w:sz="4" w:space="0" w:color="000000"/>
-              <w:left w:val="single" w:sz="4" w:space="0" w:color="000000"/>
-              <w:bottom w:val="single" w:sz="4" w:space="0" w:color="000000"/>
-              <w:right w:val="single" w:sz="4" w:space="0" w:color="000000"/>
-            </w:tcBorders>
-          </w:tcPr>
-          <w:p>
-            <w:pPr>
-              <w:keepNext/>
-              <w:spacing w:line="240" w:lineRule="auto" w:after="20"/>
-              <w:jc w:val="center"/>
-            </w:pPr>
-            <w:r>
-              <w:rPr>
-                <w:rFonts w:ascii="Times New Roman" w:hAnsi="Times New Roman" w:cs="Times New Roman" w:eastAsia="Times New Roman"/>
-                <w:b w:val="0"/>
-                <w:i w:val="0"/>
-                <w:sz w:val="18"/>
-              </w:rPr>
-              <w:t>DAC 111</w:t>
-            </w:r>
-          </w:p>
-        </w:tc>
-      </w:tr>
-      <w:tr>
-        <w:trPr>
-          <w:cantSplit/>
-        </w:trPr>
-        <w:tc>
-          <w:tcPr>
-            <w:tcW w:type="dxa" w:w="1247"/>
-            <w:tcBorders>
-              <w:top w:val="single" w:sz="4" w:space="0" w:color="000000"/>
-              <w:left w:val="single" w:sz="4" w:space="0" w:color="000000"/>
-              <w:bottom w:val="single" w:sz="4" w:space="0" w:color="000000"/>
-              <w:right w:val="single" w:sz="4" w:space="0" w:color="000000"/>
-            </w:tcBorders>
-          </w:tcPr>
-          <w:p>
-            <w:pPr>
-              <w:keepNext/>
-              <w:spacing w:line="240" w:lineRule="auto" w:after="20"/>
-              <w:jc w:val="left"/>
-            </w:pPr>
-            <w:r>
-              <w:rPr>
-                <w:rFonts w:ascii="Times New Roman" w:hAnsi="Times New Roman" w:cs="Times New Roman" w:eastAsia="Times New Roman"/>
-                <w:b w:val="0"/>
-                <w:i w:val="0"/>
-                <w:sz w:val="18"/>
-              </w:rPr>
-              <w:t>18</w:t>
-            </w:r>
-          </w:p>
-        </w:tc>
-        <w:tc>
-          <w:tcPr>
-            <w:tcW w:type="dxa" w:w="2494"/>
-            <w:tcBorders>
-              <w:top w:val="single" w:sz="4" w:space="0" w:color="000000"/>
-              <w:left w:val="single" w:sz="4" w:space="0" w:color="000000"/>
-              <w:bottom w:val="single" w:sz="4" w:space="0" w:color="000000"/>
-              <w:right w:val="single" w:sz="4" w:space="0" w:color="000000"/>
-            </w:tcBorders>
-          </w:tcPr>
-          <w:p>
-            <w:pPr>
-              <w:keepNext/>
-              <w:spacing w:line="240" w:lineRule="auto" w:after="20"/>
-              <w:jc w:val="center"/>
-            </w:pPr>
-            <w:r>
-              <w:rPr>
-                <w:rFonts w:ascii="Times New Roman" w:hAnsi="Times New Roman" w:cs="Times New Roman" w:eastAsia="Times New Roman"/>
-                <w:b w:val="0"/>
-                <w:i w:val="0"/>
-                <w:sz w:val="18"/>
-              </w:rPr>
-              <w:t>464 Ω</w:t>
-            </w:r>
-          </w:p>
-        </w:tc>
-        <w:tc>
-          <w:tcPr>
-            <w:tcW w:type="dxa" w:w="4195"/>
-            <w:tcBorders>
-              <w:top w:val="single" w:sz="4" w:space="0" w:color="000000"/>
-              <w:left w:val="single" w:sz="4" w:space="0" w:color="000000"/>
-              <w:bottom w:val="single" w:sz="4" w:space="0" w:color="000000"/>
-              <w:right w:val="single" w:sz="4" w:space="0" w:color="000000"/>
-            </w:tcBorders>
-          </w:tcPr>
-          <w:p>
-            <w:pPr>
-              <w:keepNext/>
-              <w:spacing w:line="240" w:lineRule="auto" w:after="20"/>
-              <w:jc w:val="center"/>
-            </w:pPr>
-            <w:r>
-              <w:rPr>
-                <w:rFonts w:ascii="Times New Roman" w:hAnsi="Times New Roman" w:cs="Times New Roman" w:eastAsia="Times New Roman"/>
-                <w:b w:val="0"/>
-                <w:i w:val="0"/>
-                <w:sz w:val="18"/>
-              </w:rPr>
-              <w:t>Köprü direnç ölçümü</w:t>
-            </w:r>
-          </w:p>
-        </w:tc>
-      </w:tr>
-      <w:tr>
-        <w:trPr>
-          <w:cantSplit/>
-        </w:trPr>
-        <w:tc>
-          <w:tcPr>
-            <w:tcW w:type="dxa" w:w="1247"/>
-            <w:tcBorders>
-              <w:top w:val="single" w:sz="4" w:space="0" w:color="000000"/>
-              <w:left w:val="single" w:sz="4" w:space="0" w:color="000000"/>
-              <w:bottom w:val="single" w:sz="4" w:space="0" w:color="000000"/>
-              <w:right w:val="single" w:sz="4" w:space="0" w:color="000000"/>
-            </w:tcBorders>
-          </w:tcPr>
-          <w:p>
-            <w:pPr>
-              <w:keepNext/>
-              <w:spacing w:line="240" w:lineRule="auto" w:after="20"/>
-              <w:jc w:val="left"/>
-            </w:pPr>
-            <w:r>
-              <w:rPr>
-                <w:rFonts w:ascii="Times New Roman" w:hAnsi="Times New Roman" w:cs="Times New Roman" w:eastAsia="Times New Roman"/>
-                <w:b w:val="0"/>
-                <w:i w:val="0"/>
-                <w:sz w:val="18"/>
-              </w:rPr>
-              <w:t>19</w:t>
-            </w:r>
-          </w:p>
-        </w:tc>
-        <w:tc>
-          <w:tcPr>
-            <w:tcW w:type="dxa" w:w="2494"/>
-            <w:tcBorders>
-              <w:top w:val="single" w:sz="4" w:space="0" w:color="000000"/>
-              <w:left w:val="single" w:sz="4" w:space="0" w:color="000000"/>
-              <w:bottom w:val="single" w:sz="4" w:space="0" w:color="000000"/>
-              <w:right w:val="single" w:sz="4" w:space="0" w:color="000000"/>
-            </w:tcBorders>
-          </w:tcPr>
-          <w:p>
-            <w:pPr>
-              <w:keepNext/>
-              <w:spacing w:line="240" w:lineRule="auto" w:after="20"/>
-              <w:jc w:val="center"/>
-            </w:pPr>
-            <w:r>
-              <w:rPr>
-                <w:rFonts w:ascii="Times New Roman" w:hAnsi="Times New Roman" w:cs="Times New Roman" w:eastAsia="Times New Roman"/>
-                <w:b w:val="0"/>
-                <w:i w:val="0"/>
-                <w:sz w:val="18"/>
-              </w:rPr>
-              <w:t>4,09 V</w:t>
-            </w:r>
-          </w:p>
-        </w:tc>
-        <w:tc>
-          <w:tcPr>
-            <w:tcW w:type="dxa" w:w="4195"/>
-            <w:tcBorders>
-              <w:top w:val="single" w:sz="4" w:space="0" w:color="000000"/>
-              <w:left w:val="single" w:sz="4" w:space="0" w:color="000000"/>
-              <w:bottom w:val="single" w:sz="4" w:space="0" w:color="000000"/>
-              <w:right w:val="single" w:sz="4" w:space="0" w:color="000000"/>
-            </w:tcBorders>
-          </w:tcPr>
-          <w:p>
-            <w:pPr>
-              <w:keepNext/>
-              <w:spacing w:line="240" w:lineRule="auto" w:after="20"/>
-              <w:jc w:val="center"/>
-            </w:pPr>
-            <w:r>
-              <w:rPr>
-                <w:rFonts w:ascii="Times New Roman" w:hAnsi="Times New Roman" w:cs="Times New Roman" w:eastAsia="Times New Roman"/>
-                <w:b w:val="0"/>
-                <w:i w:val="0"/>
-                <w:sz w:val="18"/>
-              </w:rPr>
-              <w:t>DAC 100</w:t>
-            </w:r>
-          </w:p>
-        </w:tc>
-      </w:tr>
-      <w:tr>
-        <w:trPr>
-          <w:cantSplit/>
-        </w:trPr>
-        <w:tc>
-          <w:tcPr>
-            <w:tcW w:type="dxa" w:w="1247"/>
+            <w:tcW w:type="dxa" w:w="3969"/>
             <w:tcBorders>
               <w:top w:val="single" w:sz="4" w:space="0" w:color="000000"/>
               <w:left w:val="single" w:sz="4" w:space="0" w:color="000000"/>
@@ -15569,15 +13544,15 @@
                 <w:rFonts w:ascii="Times New Roman" w:hAnsi="Times New Roman" w:cs="Times New Roman" w:eastAsia="Times New Roman"/>
                 <w:b w:val="0"/>
                 <w:i w:val="0"/>
-                <w:sz w:val="18"/>
+                <w:sz w:val="20"/>
               </w:rPr>
-              <w:t>20</w:t>
+              <w:t>Devre tahtası, dirençler, potansiyometre</w:t>
             </w:r>
           </w:p>
         </w:tc>
         <w:tc>
           <w:tcPr>
-            <w:tcW w:type="dxa" w:w="2494"/>
+            <w:tcW w:type="dxa" w:w="3969"/>
             <w:tcBorders>
               <w:top w:val="single" w:sz="4" w:space="0" w:color="000000"/>
               <w:left w:val="single" w:sz="4" w:space="0" w:color="000000"/>
@@ -15596,36 +13571,9 @@
                 <w:rFonts w:ascii="Times New Roman" w:hAnsi="Times New Roman" w:cs="Times New Roman" w:eastAsia="Times New Roman"/>
                 <w:b w:val="0"/>
                 <w:i w:val="0"/>
-                <w:sz w:val="18"/>
+                <w:sz w:val="20"/>
               </w:rPr>
-              <w:t>3,27 V</w:t>
-            </w:r>
-          </w:p>
-        </w:tc>
-        <w:tc>
-          <w:tcPr>
-            <w:tcW w:type="dxa" w:w="4195"/>
-            <w:tcBorders>
-              <w:top w:val="single" w:sz="4" w:space="0" w:color="000000"/>
-              <w:left w:val="single" w:sz="4" w:space="0" w:color="000000"/>
-              <w:bottom w:val="single" w:sz="4" w:space="0" w:color="000000"/>
-              <w:right w:val="single" w:sz="4" w:space="0" w:color="000000"/>
-            </w:tcBorders>
-          </w:tcPr>
-          <w:p>
-            <w:pPr>
-              <w:keepNext w:val="0"/>
-              <w:spacing w:line="240" w:lineRule="auto" w:after="20"/>
-              <w:jc w:val="center"/>
-            </w:pPr>
-            <w:r>
-              <w:rPr>
-                <w:rFonts w:ascii="Times New Roman" w:hAnsi="Times New Roman" w:cs="Times New Roman" w:eastAsia="Times New Roman"/>
-                <w:b w:val="0"/>
-                <w:i w:val="0"/>
-                <w:sz w:val="18"/>
-              </w:rPr>
-              <w:t>DAC 011</w:t>
+              <w:t>Bütün devreler</w:t>
             </w:r>
           </w:p>
         </w:tc>
@@ -15635,19 +13583,6 @@
       <w:pPr>
         <w:spacing w:after="120"/>
       </w:pPr>
-    </w:p>
-    <w:p>
-      <w:pPr>
-        <w:jc w:val="both"/>
-      </w:pPr>
-      <w:r>
-        <w:rPr>
-          <w:rFonts w:ascii="Times New Roman" w:hAnsi="Times New Roman" w:cs="Times New Roman" w:eastAsia="Times New Roman"/>
-          <w:b w:val="0"/>
-          <w:i w:val="0"/>
-        </w:rPr>
-        <w:t>Osiloskop 10 MΩ satırındaki 9,40 V, ekrandaki 50 Hz’lik dalganın en büyük değeridir (fotoğraf 9); ortalama DA değeri değildir.</w:t>
-      </w:r>
     </w:p>
     <w:sectPr>
       <w:footerReference w:type="default" r:id="rId9"/>

</xml_diff>

<commit_message>
Deney 1 raporu: devre tahtası şekilleri güç kaynağı, multimetre ve osiloskopla yeniden çizildi
Co-Authored-By: Claude Sonnet 5.5 <noreply@anthropic.com>
Claude-Session: https://claude.ai/code/session_01Q71gHQtKJ86ZE2CtYTYSwP
</commit_message>
<xml_diff>
--- a/ele201l_deney1_lab/out/ELE201L_Deney1_Laboratuvar_Raporu.docx
+++ b/ele201l_deney1_lab/out/ELE201L_Deney1_Laboratuvar_Raporu.docx
@@ -856,7 +856,7 @@
       <w:r>
         <w:drawing>
           <wp:inline xmlns:a="http://schemas.openxmlformats.org/drawingml/2006/main" xmlns:pic="http://schemas.openxmlformats.org/drawingml/2006/picture">
-            <wp:extent cx="5040000" cy="1932000"/>
+            <wp:extent cx="5040000" cy="3864000"/>
             <wp:docPr id="2" name="Picture 2"/>
             <wp:cNvGraphicFramePr>
               <a:graphicFrameLocks noChangeAspect="1"/>
@@ -877,7 +877,7 @@
                   <pic:spPr>
                     <a:xfrm>
                       <a:off x="0" y="0"/>
-                      <a:ext cx="5040000" cy="1932000"/>
+                      <a:ext cx="5040000" cy="3864000"/>
                     </a:xfrm>
                     <a:prstGeom prst="rect"/>
                   </pic:spPr>
@@ -900,7 +900,7 @@
           <w:i w:val="0"/>
           <w:sz w:val="20"/>
         </w:rPr>
-        <w:t>Şekil 2.1.1  Dirençlerin seri bağlantısı (devre tahtası yerleşimi). Multimetre iki serbest ucu arasına bağlanır.</w:t>
+        <w:t>Şekil 2.1.1  Dirençlerin seri bağlantısı (devre tahtası yerleşimi). Multimetre Ω kademesinde iki serbest uç arasına bağlanır.</w:t>
       </w:r>
     </w:p>
     <w:p>
@@ -912,7 +912,7 @@
       <w:r>
         <w:drawing>
           <wp:inline xmlns:a="http://schemas.openxmlformats.org/drawingml/2006/main" xmlns:pic="http://schemas.openxmlformats.org/drawingml/2006/picture">
-            <wp:extent cx="5040000" cy="1932000"/>
+            <wp:extent cx="5040000" cy="3864000"/>
             <wp:docPr id="3" name="Picture 3"/>
             <wp:cNvGraphicFramePr>
               <a:graphicFrameLocks noChangeAspect="1"/>
@@ -933,7 +933,7 @@
                   <pic:spPr>
                     <a:xfrm>
                       <a:off x="0" y="0"/>
-                      <a:ext cx="5040000" cy="1932000"/>
+                      <a:ext cx="5040000" cy="3864000"/>
                     </a:xfrm>
                     <a:prstGeom prst="rect"/>
                   </pic:spPr>
@@ -3020,7 +3020,7 @@
       <w:r>
         <w:drawing>
           <wp:inline xmlns:a="http://schemas.openxmlformats.org/drawingml/2006/main" xmlns:pic="http://schemas.openxmlformats.org/drawingml/2006/picture">
-            <wp:extent cx="5040000" cy="2100000"/>
+            <wp:extent cx="5040000" cy="3864000"/>
             <wp:docPr id="6" name="Picture 6"/>
             <wp:cNvGraphicFramePr>
               <a:graphicFrameLocks noChangeAspect="1"/>
@@ -3041,7 +3041,7 @@
                   <pic:spPr>
                     <a:xfrm>
                       <a:off x="0" y="0"/>
-                      <a:ext cx="5040000" cy="2100000"/>
+                      <a:ext cx="5040000" cy="3864000"/>
                     </a:xfrm>
                     <a:prstGeom prst="rect"/>
                   </pic:spPr>
@@ -3064,7 +3064,7 @@
           <w:i w:val="0"/>
           <w:sz w:val="20"/>
         </w:rPr>
-        <w:t xml:space="preserve">Şekil 2.2.1  Gerilim bölücü devrenin devre tahtası yerleşimi. </w:t>
+        <w:t xml:space="preserve">Şekil 2.2.1  Gerilim bölücü devrenin devre tahtası yerleşimi. Güç kaynağı 15 V’a ayarlıdır; </w:t>
       </w:r>
       <m:oMath>
         <m:sSub>
@@ -3087,7 +3087,7 @@
           <w:i w:val="0"/>
           <w:sz w:val="20"/>
         </w:rPr>
-        <w:t xml:space="preserve"> düğümünden multimetre ve osiloskop ayrı ayrı ölçüm yapar.</w:t>
+        <w:t xml:space="preserve"> düğümünü multimetre ve osiloskop ölçer (iki alet aynı düğüme bağlıdır). Çizimde 470 Ω’luk dirençler gösterilmiştir.</w:t>
       </w:r>
     </w:p>
     <w:p>
@@ -7842,7 +7842,7 @@
       <w:r>
         <w:drawing>
           <wp:inline xmlns:a="http://schemas.openxmlformats.org/drawingml/2006/main" xmlns:pic="http://schemas.openxmlformats.org/drawingml/2006/picture">
-            <wp:extent cx="5040000" cy="2100000"/>
+            <wp:extent cx="5040000" cy="3864000"/>
             <wp:docPr id="9" name="Picture 9"/>
             <wp:cNvGraphicFramePr>
               <a:graphicFrameLocks noChangeAspect="1"/>
@@ -7863,7 +7863,7 @@
                   <pic:spPr>
                     <a:xfrm>
                       <a:off x="0" y="0"/>
-                      <a:ext cx="5040000" cy="2100000"/>
+                      <a:ext cx="5040000" cy="3864000"/>
                     </a:xfrm>
                     <a:prstGeom prst="rect"/>
                   </pic:spPr>
@@ -7955,7 +7955,7 @@
           <w:i w:val="0"/>
           <w:sz w:val="20"/>
         </w:rPr>
-        <w:t xml:space="preserve"> sarı ve mavi uçlar arasından ölçülür.</w:t>
+        <w:t xml:space="preserve"> multimetreyle iki orta düğüm arasından ölçülür.</w:t>
       </w:r>
     </w:p>
     <w:p>
@@ -10390,7 +10390,7 @@
       <w:r>
         <w:drawing>
           <wp:inline xmlns:a="http://schemas.openxmlformats.org/drawingml/2006/main" xmlns:pic="http://schemas.openxmlformats.org/drawingml/2006/picture">
-            <wp:extent cx="5040000" cy="2100000"/>
+            <wp:extent cx="5040000" cy="3864000"/>
             <wp:docPr id="11" name="Picture 11"/>
             <wp:cNvGraphicFramePr>
               <a:graphicFrameLocks noChangeAspect="1"/>
@@ -10411,7 +10411,7 @@
                   <pic:spPr>
                     <a:xfrm>
                       <a:off x="0" y="0"/>
-                      <a:ext cx="5040000" cy="2100000"/>
+                      <a:ext cx="5040000" cy="3864000"/>
                     </a:xfrm>
                     <a:prstGeom prst="rect"/>
                   </pic:spPr>
@@ -10434,7 +10434,258 @@
           <w:i w:val="0"/>
           <w:sz w:val="20"/>
         </w:rPr>
-        <w:t xml:space="preserve">Şekil 2.4.1  3 bitlik R-2R DAC’ın devre tahtası yerleşimi. Üç giriş ucu (MSB, orta bit, LSB) 16 V veya toprağa bağlanır; </w:t>
+        <w:t xml:space="preserve">Şekil 2.4.1  3 bitlik R-2R DAC’ın devre tahtası yerleşimi. </w:t>
+      </w:r>
+      <m:oMath>
+        <m:sSub>
+          <m:e>
+            <m:r>
+              <m:t>R</m:t>
+            </m:r>
+          </m:e>
+          <m:sub>
+            <m:r>
+              <m:t>i</m:t>
+            </m:r>
+            <m:r>
+              <m:t>1</m:t>
+            </m:r>
+          </m:sub>
+        </m:sSub>
+        <m:r>
+          <m:rPr>
+            <m:sty m:val="p"/>
+          </m:rPr>
+          <m:t>,</m:t>
+        </m:r>
+        <m:sSub>
+          <m:e>
+            <m:r>
+              <m:t>R</m:t>
+            </m:r>
+          </m:e>
+          <m:sub>
+            <m:r>
+              <m:t>i</m:t>
+            </m:r>
+            <m:r>
+              <m:t>2</m:t>
+            </m:r>
+          </m:sub>
+        </m:sSub>
+        <m:r>
+          <m:rPr>
+            <m:sty m:val="p"/>
+          </m:rPr>
+          <m:t>,</m:t>
+        </m:r>
+        <m:sSub>
+          <m:e>
+            <m:r>
+              <m:t>R</m:t>
+            </m:r>
+          </m:e>
+          <m:sub>
+            <m:r>
+              <m:t>i</m:t>
+            </m:r>
+            <m:r>
+              <m:t>3</m:t>
+            </m:r>
+          </m:sub>
+        </m:sSub>
+        <m:r>
+          <m:rPr>
+            <m:sty m:val="p"/>
+          </m:rPr>
+          <m:t>=</m:t>
+        </m:r>
+        <m:r>
+          <m:t>2</m:t>
+        </m:r>
+        <m:r>
+          <m:t> </m:t>
+        </m:r>
+        <m:r>
+          <m:rPr>
+            <m:sty m:val="p"/>
+          </m:rPr>
+          <m:t>k</m:t>
+        </m:r>
+        <m:r>
+          <m:rPr>
+            <m:sty m:val="p"/>
+          </m:rPr>
+          <m:t>Ω</m:t>
+        </m:r>
+      </m:oMath>
+      <w:r>
+        <w:rPr>
+          <w:rFonts w:ascii="Times New Roman" w:hAnsi="Times New Roman" w:cs="Times New Roman" w:eastAsia="Times New Roman"/>
+          <w:b w:val="0"/>
+          <w:i w:val="0"/>
+          <w:sz w:val="20"/>
+        </w:rPr>
+        <w:t xml:space="preserve"> (giriş), </w:t>
+      </w:r>
+      <m:oMath>
+        <m:sSub>
+          <m:e>
+            <m:r>
+              <m:t>R</m:t>
+            </m:r>
+          </m:e>
+          <m:sub>
+            <m:r>
+              <m:t>a</m:t>
+            </m:r>
+          </m:sub>
+        </m:sSub>
+        <m:r>
+          <m:rPr>
+            <m:sty m:val="p"/>
+          </m:rPr>
+          <m:t>=</m:t>
+        </m:r>
+        <m:sSub>
+          <m:e>
+            <m:r>
+              <m:t>R</m:t>
+            </m:r>
+          </m:e>
+          <m:sub>
+            <m:r>
+              <m:t>b</m:t>
+            </m:r>
+          </m:sub>
+        </m:sSub>
+        <m:r>
+          <m:rPr>
+            <m:sty m:val="p"/>
+          </m:rPr>
+          <m:t>=</m:t>
+        </m:r>
+        <m:r>
+          <m:t>1</m:t>
+        </m:r>
+        <m:r>
+          <m:t> </m:t>
+        </m:r>
+        <m:r>
+          <m:rPr>
+            <m:sty m:val="p"/>
+          </m:rPr>
+          <m:t>k</m:t>
+        </m:r>
+        <m:r>
+          <m:rPr>
+            <m:sty m:val="p"/>
+          </m:rPr>
+          <m:t>Ω</m:t>
+        </m:r>
+      </m:oMath>
+      <w:r>
+        <w:rPr>
+          <w:rFonts w:ascii="Times New Roman" w:hAnsi="Times New Roman" w:cs="Times New Roman" w:eastAsia="Times New Roman"/>
+          <w:b w:val="0"/>
+          <w:i w:val="0"/>
+          <w:sz w:val="20"/>
+        </w:rPr>
+        <w:t xml:space="preserve">, </w:t>
+      </w:r>
+      <m:oMath>
+        <m:sSub>
+          <m:e>
+            <m:r>
+              <m:t>R</m:t>
+            </m:r>
+          </m:e>
+          <m:sub>
+            <m:r>
+              <m:t>t</m:t>
+            </m:r>
+          </m:sub>
+        </m:sSub>
+        <m:r>
+          <m:rPr>
+            <m:sty m:val="p"/>
+          </m:rPr>
+          <m:t>=</m:t>
+        </m:r>
+        <m:r>
+          <m:t>2</m:t>
+        </m:r>
+        <m:r>
+          <m:t> </m:t>
+        </m:r>
+        <m:r>
+          <m:rPr>
+            <m:sty m:val="p"/>
+          </m:rPr>
+          <m:t>k</m:t>
+        </m:r>
+        <m:r>
+          <m:rPr>
+            <m:sty m:val="p"/>
+          </m:rPr>
+          <m:t>Ω</m:t>
+        </m:r>
+      </m:oMath>
+      <w:r>
+        <w:rPr>
+          <w:rFonts w:ascii="Times New Roman" w:hAnsi="Times New Roman" w:cs="Times New Roman" w:eastAsia="Times New Roman"/>
+          <w:b w:val="0"/>
+          <w:i w:val="0"/>
+          <w:sz w:val="20"/>
+        </w:rPr>
+        <w:t xml:space="preserve">, </w:t>
+      </w:r>
+      <m:oMath>
+        <m:sSub>
+          <m:e>
+            <m:r>
+              <m:t>R</m:t>
+            </m:r>
+          </m:e>
+          <m:sub>
+            <m:r>
+              <m:t>L</m:t>
+            </m:r>
+          </m:sub>
+        </m:sSub>
+        <m:r>
+          <m:rPr>
+            <m:sty m:val="p"/>
+          </m:rPr>
+          <m:t>=</m:t>
+        </m:r>
+        <m:r>
+          <m:t>1</m:t>
+        </m:r>
+        <m:r>
+          <m:t> </m:t>
+        </m:r>
+        <m:r>
+          <m:rPr>
+            <m:sty m:val="p"/>
+          </m:rPr>
+          <m:t>k</m:t>
+        </m:r>
+        <m:r>
+          <m:rPr>
+            <m:sty m:val="p"/>
+          </m:rPr>
+          <m:t>Ω</m:t>
+        </m:r>
+      </m:oMath>
+      <w:r>
+        <w:rPr>
+          <w:rFonts w:ascii="Times New Roman" w:hAnsi="Times New Roman" w:cs="Times New Roman" w:eastAsia="Times New Roman"/>
+          <w:b w:val="0"/>
+          <w:i w:val="0"/>
+          <w:sz w:val="20"/>
+        </w:rPr>
+        <w:t xml:space="preserve">. Turuncu jumperlar girişleri 16 V rayına (mantık 1, kod 111) bağlar; bir bit 0 olacaksa jumper alt rayına (toprağa) taşınır. Multimetre </w:t>
       </w:r>
       <m:oMath>
         <m:sSub>
@@ -10457,30 +10708,7 @@
           <w:i w:val="0"/>
           <w:sz w:val="20"/>
         </w:rPr>
-        <w:t xml:space="preserve"> ve </w:t>
-      </w:r>
-      <m:oMath>
-        <m:sSub>
-          <m:e>
-            <m:r>
-              <m:t>R</m:t>
-            </m:r>
-          </m:e>
-          <m:sub>
-            <m:r>
-              <m:t>L</m:t>
-            </m:r>
-          </m:sub>
-        </m:sSub>
-      </m:oMath>
-      <w:r>
-        <w:rPr>
-          <w:rFonts w:ascii="Times New Roman" w:hAnsi="Times New Roman" w:cs="Times New Roman" w:eastAsia="Times New Roman"/>
-          <w:b w:val="0"/>
-          <w:i w:val="0"/>
-          <w:sz w:val="20"/>
-        </w:rPr>
-        <w:t xml:space="preserve"> ilk düğümdedir.</w:t>
+        <w:t xml:space="preserve"> düğümündedir.</w:t>
       </w:r>
     </w:p>
     <w:p>

</xml_diff>